<commit_message>
reararnged the order and stuff
</commit_message>
<xml_diff>
--- a/2B21-04_group_submission_revised_updated.docx
+++ b/2B21-04_group_submission_revised_updated.docx
@@ -224,15 +224,7 @@
           </w:tcPr>
           <w:p>
             <w:r>
-              <w:t xml:space="preserve">Kendrick </w:t>
-            </w:r>
-            <w:proofErr w:type="spellStart"/>
-            <w:r>
-              <w:t>Slamat</w:t>
-            </w:r>
-            <w:proofErr w:type="spellEnd"/>
-            <w:r>
-              <w:t xml:space="preserve"> </w:t>
+              <w:t xml:space="preserve">Kendrick Slamat </w:t>
             </w:r>
           </w:p>
         </w:tc>
@@ -448,6 +440,7 @@
                                 <w:dataBinding w:prefixMappings="xmlns:ns0='http://schemas.openxmlformats.org/officeDocument/2006/extended-properties' " w:xpath="/ns0:Properties[1]/ns0:Company[1]" w:storeItemID="{6668398D-A668-4E3E-A5EB-62B293D839F1}"/>
                                 <w:text/>
                               </w:sdtPr>
+                              <w:sdtEndPr/>
                               <w:sdtContent>
                                 <w:r>
                                   <w:rPr>
@@ -562,6 +555,7 @@
                           <w:dataBinding w:prefixMappings="xmlns:ns0='http://schemas.openxmlformats.org/officeDocument/2006/extended-properties' " w:xpath="/ns0:Properties[1]/ns0:Company[1]" w:storeItemID="{6668398D-A668-4E3E-A5EB-62B293D839F1}"/>
                           <w:text/>
                         </w:sdtPr>
+                        <w:sdtEndPr/>
                         <w:sdtContent>
                           <w:r>
                             <w:rPr>
@@ -2156,21 +2150,7 @@
               <w:rPr>
                 <w:sz w:val="18"/>
               </w:rPr>
-              <w:t xml:space="preserve">Invalid </w:t>
-            </w:r>
-            <w:proofErr w:type="spellStart"/>
-            <w:r>
-              <w:rPr>
-                <w:sz w:val="18"/>
-              </w:rPr>
-              <w:t>TierID</w:t>
-            </w:r>
-            <w:proofErr w:type="spellEnd"/>
-            <w:r>
-              <w:rPr>
-                <w:sz w:val="18"/>
-              </w:rPr>
-              <w:t xml:space="preserve"> 'T00001' (extra zero; no such tier exists)</w:t>
+              <w:t>Invalid TierID 'T00001' (extra zero; no such tier exists)</w:t>
             </w:r>
           </w:p>
         </w:tc>
@@ -2224,35 +2204,7 @@
               <w:rPr>
                 <w:sz w:val="18"/>
               </w:rPr>
-              <w:t>Gender stored as 'Male'/'Female</w:t>
-            </w:r>
-            <w:proofErr w:type="gramStart"/>
-            <w:r>
-              <w:rPr>
-                <w:sz w:val="18"/>
-              </w:rPr>
-              <w:t>'</w:t>
-            </w:r>
-            <w:proofErr w:type="gramEnd"/>
-            <w:r>
-              <w:rPr>
-                <w:sz w:val="18"/>
-              </w:rPr>
-              <w:t xml:space="preserve"> but schema requires </w:t>
-            </w:r>
-            <w:proofErr w:type="gramStart"/>
-            <w:r>
-              <w:rPr>
-                <w:sz w:val="18"/>
-              </w:rPr>
-              <w:t>CHAR(</w:t>
-            </w:r>
-            <w:proofErr w:type="gramEnd"/>
-            <w:r>
-              <w:rPr>
-                <w:sz w:val="18"/>
-              </w:rPr>
-              <w:t>1)</w:t>
+              <w:t>Gender stored as 'Male'/'Female' but schema requires CHAR(1)</w:t>
             </w:r>
           </w:p>
         </w:tc>
@@ -2265,21 +2217,7 @@
               <w:rPr>
                 <w:sz w:val="18"/>
               </w:rPr>
-              <w:t>Mapped to 'M</w:t>
-            </w:r>
-            <w:proofErr w:type="gramStart"/>
-            <w:r>
-              <w:rPr>
-                <w:sz w:val="18"/>
-              </w:rPr>
-              <w:t>'/'</w:t>
-            </w:r>
-            <w:proofErr w:type="gramEnd"/>
-            <w:r>
-              <w:rPr>
-                <w:sz w:val="18"/>
-              </w:rPr>
-              <w:t>F'</w:t>
+              <w:t>Mapped to 'M'/'F'</w:t>
             </w:r>
           </w:p>
         </w:tc>
@@ -2316,14 +2254,12 @@
             <w:tcW w:w="2700" w:type="dxa"/>
           </w:tcPr>
           <w:p>
-            <w:proofErr w:type="spellStart"/>
             <w:r>
               <w:rPr>
                 <w:sz w:val="18"/>
               </w:rPr>
               <w:t>DateOfBirth</w:t>
             </w:r>
-            <w:proofErr w:type="spellEnd"/>
             <w:r>
               <w:rPr>
                 <w:sz w:val="18"/>
@@ -2382,21 +2318,7 @@
               <w:rPr>
                 <w:sz w:val="18"/>
               </w:rPr>
-              <w:t>Two contact fields (</w:t>
-            </w:r>
-            <w:proofErr w:type="spellStart"/>
-            <w:r>
-              <w:rPr>
-                <w:sz w:val="18"/>
-              </w:rPr>
-              <w:t>ContactNo</w:t>
-            </w:r>
-            <w:proofErr w:type="spellEnd"/>
-            <w:r>
-              <w:rPr>
-                <w:sz w:val="18"/>
-              </w:rPr>
-              <w:t>, Email) but Member table has a single Contact column</w:t>
+              <w:t>Two contact fields (ContactNo, Email) but Member table has a single Contact column</w:t>
             </w:r>
           </w:p>
         </w:tc>
@@ -2528,35 +2450,7 @@
               <w:rPr>
                 <w:sz w:val="18"/>
               </w:rPr>
-              <w:t>Gender stored as 'Male'/'Female</w:t>
-            </w:r>
-            <w:proofErr w:type="gramStart"/>
-            <w:r>
-              <w:rPr>
-                <w:sz w:val="18"/>
-              </w:rPr>
-              <w:t>'</w:t>
-            </w:r>
-            <w:proofErr w:type="gramEnd"/>
-            <w:r>
-              <w:rPr>
-                <w:sz w:val="18"/>
-              </w:rPr>
-              <w:t xml:space="preserve"> but schema requires </w:t>
-            </w:r>
-            <w:proofErr w:type="gramStart"/>
-            <w:r>
-              <w:rPr>
-                <w:sz w:val="18"/>
-              </w:rPr>
-              <w:t>CHAR(</w:t>
-            </w:r>
-            <w:proofErr w:type="gramEnd"/>
-            <w:r>
-              <w:rPr>
-                <w:sz w:val="18"/>
-              </w:rPr>
-              <w:t>1)</w:t>
+              <w:t>Gender stored as 'Male'/'Female' but schema requires CHAR(1)</w:t>
             </w:r>
           </w:p>
         </w:tc>
@@ -2569,21 +2463,7 @@
               <w:rPr>
                 <w:sz w:val="18"/>
               </w:rPr>
-              <w:t>Mapped to 'M</w:t>
-            </w:r>
-            <w:proofErr w:type="gramStart"/>
-            <w:r>
-              <w:rPr>
-                <w:sz w:val="18"/>
-              </w:rPr>
-              <w:t>'/'</w:t>
-            </w:r>
-            <w:proofErr w:type="gramEnd"/>
-            <w:r>
-              <w:rPr>
-                <w:sz w:val="18"/>
-              </w:rPr>
-              <w:t>F'</w:t>
+              <w:t>Mapped to 'M'/'F'</w:t>
             </w:r>
           </w:p>
         </w:tc>
@@ -2659,16 +2539,8 @@
               <w:rPr>
                 <w:sz w:val="18"/>
               </w:rPr>
-              <w:t xml:space="preserve">data.xlsx / </w:t>
+              <w:t>data.xlsx / BookCopies</w:t>
             </w:r>
-            <w:proofErr w:type="spellStart"/>
-            <w:r>
-              <w:rPr>
-                <w:sz w:val="18"/>
-              </w:rPr>
-              <w:t>BookCopies</w:t>
-            </w:r>
-            <w:proofErr w:type="spellEnd"/>
           </w:p>
         </w:tc>
         <w:tc>
@@ -2693,21 +2565,7 @@
               <w:rPr>
                 <w:sz w:val="18"/>
               </w:rPr>
-              <w:t>Status misspelled as '</w:t>
-            </w:r>
-            <w:proofErr w:type="spellStart"/>
-            <w:r>
-              <w:rPr>
-                <w:sz w:val="18"/>
-              </w:rPr>
-              <w:t>Availble</w:t>
-            </w:r>
-            <w:proofErr w:type="spellEnd"/>
-            <w:r>
-              <w:rPr>
-                <w:sz w:val="18"/>
-              </w:rPr>
-              <w:t>'</w:t>
+              <w:t>Status misspelled as 'Availble'</w:t>
             </w:r>
           </w:p>
         </w:tc>
@@ -2735,16 +2593,8 @@
               <w:rPr>
                 <w:sz w:val="18"/>
               </w:rPr>
-              <w:t xml:space="preserve">data.xlsx / </w:t>
+              <w:t>data.xlsx / BookCopies</w:t>
             </w:r>
-            <w:proofErr w:type="spellStart"/>
-            <w:r>
-              <w:rPr>
-                <w:sz w:val="18"/>
-              </w:rPr>
-              <w:t>BookCopies</w:t>
-            </w:r>
-            <w:proofErr w:type="spellEnd"/>
           </w:p>
         </w:tc>
         <w:tc>
@@ -2823,63 +2673,13 @@
               <w:rPr>
                 <w:sz w:val="18"/>
               </w:rPr>
-              <w:t xml:space="preserve">Row references </w:t>
+              <w:t>Row references StaffID 'S0101' (staff run S0001-S0051) and CopySeqNo</w:t>
             </w:r>
-            <w:proofErr w:type="spellStart"/>
             <w:r>
               <w:rPr>
                 <w:sz w:val="18"/>
               </w:rPr>
-              <w:t>StaffID</w:t>
-            </w:r>
-            <w:proofErr w:type="spellEnd"/>
-            <w:r>
-              <w:rPr>
-                <w:sz w:val="18"/>
-              </w:rPr>
-              <w:t xml:space="preserve"> 'S0101' (staff run S0001-S0051) and </w:t>
-            </w:r>
-            <w:proofErr w:type="spellStart"/>
-            <w:r>
-              <w:rPr>
-                <w:sz w:val="18"/>
-              </w:rPr>
-              <w:t>CopySeqNo</w:t>
-            </w:r>
-            <w:proofErr w:type="spellEnd"/>
-            <w:r>
-              <w:rPr>
-                <w:sz w:val="18"/>
-              </w:rPr>
-              <w:t xml:space="preserve"> 8 (book has 3 copies); </w:t>
-            </w:r>
-            <w:proofErr w:type="spellStart"/>
-            <w:r>
-              <w:rPr>
-                <w:sz w:val="18"/>
-              </w:rPr>
-              <w:t>DueDate</w:t>
-            </w:r>
-            <w:proofErr w:type="spellEnd"/>
-            <w:r>
-              <w:rPr>
-                <w:sz w:val="18"/>
-              </w:rPr>
-              <w:t xml:space="preserve"> 2023-04-02 precedes </w:t>
-            </w:r>
-            <w:proofErr w:type="spellStart"/>
-            <w:r>
-              <w:rPr>
-                <w:sz w:val="18"/>
-              </w:rPr>
-              <w:t>LoanDatetime</w:t>
-            </w:r>
-            <w:proofErr w:type="spellEnd"/>
-            <w:r>
-              <w:rPr>
-                <w:sz w:val="18"/>
-              </w:rPr>
-              <w:t xml:space="preserve"> 2024-07-04</w:t>
+              <w:t xml:space="preserve"> 8 (book has 3 copies); DueDate 2023-04-02 precedes LoanDatetime 2024-07-04</w:t>
             </w:r>
           </w:p>
         </w:tc>
@@ -2908,15 +2708,7 @@
         <w:pStyle w:val="ListParagraph"/>
       </w:pPr>
       <w:r>
-        <w:t xml:space="preserve">Submit your SQL INSERT statements for data insertion to the OLTP tables in </w:t>
-      </w:r>
-      <w:proofErr w:type="spellStart"/>
-      <w:r>
-        <w:t>OLTP_insert.sql</w:t>
-      </w:r>
-      <w:proofErr w:type="spellEnd"/>
-      <w:r>
-        <w:t>. If you apply bulk loading, submit each of the cleaned data files used during insertion as well.</w:t>
+        <w:t>Submit your SQL INSERT statements for data insertion to the OLTP tables in OLTP_insert.sql. If you apply bulk loading, submit each of the cleaned data files used during insertion as well.</w:t>
       </w:r>
     </w:p>
     <w:p>
@@ -3004,7 +2796,6 @@
         </w:numPr>
       </w:pPr>
       <w:r>
-        <w:lastRenderedPageBreak/>
         <w:t>Design your DW using star or snowflake schema. Paste your ERD that illustrates your design in the box below, with a short explanation of key design focus and considerations.</w:t>
       </w:r>
     </w:p>
@@ -3065,63 +2856,7 @@
         </w:rPr>
       </w:pPr>
       <w:r>
-        <w:t xml:space="preserve">To support the required analysis, we used a star schema </w:t>
-      </w:r>
-      <w:proofErr w:type="spellStart"/>
-      <w:r>
-        <w:t>centred</w:t>
-      </w:r>
-      <w:proofErr w:type="spellEnd"/>
-      <w:r>
-        <w:t xml:space="preserve"> on </w:t>
-      </w:r>
-      <w:proofErr w:type="spellStart"/>
-      <w:r>
-        <w:t>FactLoan</w:t>
-      </w:r>
-      <w:proofErr w:type="spellEnd"/>
-      <w:r>
-        <w:t xml:space="preserve">. Its grain is one completed loan: one physical book copy borrowed by one member and returned. </w:t>
-      </w:r>
-      <w:proofErr w:type="spellStart"/>
-      <w:r>
-        <w:t>FactLoan</w:t>
-      </w:r>
-      <w:proofErr w:type="spellEnd"/>
-      <w:r>
-        <w:t xml:space="preserve"> links once to each of four dimensions: </w:t>
-      </w:r>
-      <w:proofErr w:type="spellStart"/>
-      <w:r>
-        <w:t>DimMember</w:t>
-      </w:r>
-      <w:proofErr w:type="spellEnd"/>
-      <w:r>
-        <w:t xml:space="preserve">, </w:t>
-      </w:r>
-      <w:proofErr w:type="spellStart"/>
-      <w:r>
-        <w:t>DimStaff</w:t>
-      </w:r>
-      <w:proofErr w:type="spellEnd"/>
-      <w:r>
-        <w:t xml:space="preserve">, </w:t>
-      </w:r>
-      <w:proofErr w:type="spellStart"/>
-      <w:r>
-        <w:t>DimBook</w:t>
-      </w:r>
-      <w:proofErr w:type="spellEnd"/>
-      <w:r>
-        <w:t xml:space="preserve"> and </w:t>
-      </w:r>
-      <w:proofErr w:type="spellStart"/>
-      <w:r>
-        <w:t>DimDate</w:t>
-      </w:r>
-      <w:proofErr w:type="spellEnd"/>
-      <w:r>
-        <w:t>.</w:t>
+        <w:t>To support the required analysis, we used a star schema centred on FactLoan. Its grain is one completed loan: one physical book copy borrowed by one member and returned. FactLoan links once to each of four dimensions: DimMember, DimStaff, DimBook and DimDate.</w:t>
       </w:r>
     </w:p>
     <w:p>
@@ -3138,79 +2873,7 @@
         </w:rPr>
       </w:pPr>
       <w:r>
-        <w:t xml:space="preserve">Every table, including </w:t>
-      </w:r>
-      <w:proofErr w:type="spellStart"/>
-      <w:r>
-        <w:t>FactLoan</w:t>
-      </w:r>
-      <w:proofErr w:type="spellEnd"/>
-      <w:r>
-        <w:t xml:space="preserve"> and </w:t>
-      </w:r>
-      <w:proofErr w:type="spellStart"/>
-      <w:r>
-        <w:t>DimDate</w:t>
-      </w:r>
-      <w:proofErr w:type="spellEnd"/>
-      <w:r>
-        <w:t xml:space="preserve">, uses an AUTO_INCREMENT surrogate key. </w:t>
-      </w:r>
-      <w:proofErr w:type="spellStart"/>
-      <w:r>
-        <w:t>DimMember</w:t>
-      </w:r>
-      <w:proofErr w:type="spellEnd"/>
-      <w:r>
-        <w:t xml:space="preserve"> stores the member's current </w:t>
-      </w:r>
-      <w:proofErr w:type="spellStart"/>
-      <w:r>
-        <w:t>TierName</w:t>
-      </w:r>
-      <w:proofErr w:type="spellEnd"/>
-      <w:r>
-        <w:t xml:space="preserve">, </w:t>
-      </w:r>
-      <w:proofErr w:type="spellStart"/>
-      <w:r>
-        <w:t>TierLevel</w:t>
-      </w:r>
-      <w:proofErr w:type="spellEnd"/>
-      <w:r>
-        <w:t xml:space="preserve"> and </w:t>
-      </w:r>
-      <w:proofErr w:type="spellStart"/>
-      <w:r>
-        <w:t>BorrowLimit</w:t>
-      </w:r>
-      <w:proofErr w:type="spellEnd"/>
-      <w:r>
-        <w:t xml:space="preserve">, while </w:t>
-      </w:r>
-      <w:proofErr w:type="spellStart"/>
-      <w:r>
-        <w:t>DimBook</w:t>
-      </w:r>
-      <w:proofErr w:type="spellEnd"/>
-      <w:r>
-        <w:t xml:space="preserve"> stores the minimum tier needed to borrow each book. These </w:t>
-      </w:r>
-      <w:proofErr w:type="spellStart"/>
-      <w:r>
-        <w:t>denormalised</w:t>
-      </w:r>
-      <w:proofErr w:type="spellEnd"/>
-      <w:r>
-        <w:t xml:space="preserve"> attributes keep the model in star form and reduce </w:t>
-      </w:r>
-      <w:proofErr w:type="gramStart"/>
-      <w:r>
-        <w:t>joins</w:t>
-      </w:r>
-      <w:proofErr w:type="gramEnd"/>
-      <w:r>
-        <w:t xml:space="preserve"> in analytical queries.</w:t>
+        <w:t>Every table, including FactLoan and DimDate, uses an AUTO_INCREMENT surrogate key. DimMember stores the member's current TierName, TierLevel and BorrowLimit, while DimBook stores the minimum tier needed to borrow each book. These denormalised attributes keep the model in star form and reduce joins in analytical queries.</w:t>
       </w:r>
     </w:p>
     <w:p>
@@ -3226,73 +2889,8 @@
           <w:lang w:val="en-SG"/>
         </w:rPr>
       </w:pPr>
-      <w:proofErr w:type="spellStart"/>
-      <w:r>
-        <w:t>DimDate</w:t>
-      </w:r>
-      <w:proofErr w:type="spellEnd"/>
-      <w:r>
-        <w:t xml:space="preserve"> has day-level granularity and includes </w:t>
-      </w:r>
-      <w:proofErr w:type="spellStart"/>
-      <w:r>
-        <w:t>FullDate</w:t>
-      </w:r>
-      <w:proofErr w:type="spellEnd"/>
-      <w:r>
-        <w:t xml:space="preserve">, day of week, weekend indicator, month, quarter and year. </w:t>
-      </w:r>
-      <w:proofErr w:type="spellStart"/>
-      <w:r>
-        <w:t>FactLoan</w:t>
-      </w:r>
-      <w:proofErr w:type="spellEnd"/>
-      <w:r>
-        <w:t xml:space="preserve"> references </w:t>
-      </w:r>
-      <w:proofErr w:type="spellStart"/>
-      <w:r>
-        <w:t>DimDate</w:t>
-      </w:r>
-      <w:proofErr w:type="spellEnd"/>
-      <w:r>
-        <w:t xml:space="preserve"> once through </w:t>
-      </w:r>
-      <w:proofErr w:type="spellStart"/>
-      <w:r>
-        <w:t>BorrowDateKey</w:t>
-      </w:r>
-      <w:proofErr w:type="spellEnd"/>
-      <w:r>
-        <w:t xml:space="preserve">, which records when </w:t>
-      </w:r>
-      <w:r>
-        <w:lastRenderedPageBreak/>
-        <w:t xml:space="preserve">the loan began. Return-related analysis is supported by </w:t>
-      </w:r>
-      <w:proofErr w:type="spellStart"/>
-      <w:r>
-        <w:t>LoanDurationDays</w:t>
-      </w:r>
-      <w:proofErr w:type="spellEnd"/>
-      <w:r>
-        <w:t xml:space="preserve">, </w:t>
-      </w:r>
-      <w:proofErr w:type="spellStart"/>
-      <w:r>
-        <w:t>DaysBeforeDue</w:t>
-      </w:r>
-      <w:proofErr w:type="spellEnd"/>
-      <w:r>
-        <w:t xml:space="preserve"> and </w:t>
-      </w:r>
-      <w:proofErr w:type="spellStart"/>
-      <w:r>
-        <w:t>IsLate</w:t>
-      </w:r>
-      <w:proofErr w:type="spellEnd"/>
-      <w:r>
-        <w:t xml:space="preserve"> instead of a second date-dimension relationship, so the model matches the ERD and remains easy to interpret.</w:t>
+      <w:r>
+        <w:t>DimDate has day-level granularity and includes FullDate, day of week, weekend indicator, month, quarter and year. FactLoan references DimDate once through BorrowDateKey, which records when the loan began. Return-related analysis is supported by LoanDurationDays, DaysBeforeDue and IsLate instead of a second date-dimension relationship, so the model matches the ERD and remains easy to interpret.</w:t>
       </w:r>
     </w:p>
     <w:p>
@@ -3301,21 +2899,8 @@
           <w:lang w:val="en-SG"/>
         </w:rPr>
       </w:pPr>
-      <w:proofErr w:type="spellStart"/>
-      <w:r>
-        <w:t>CopySeqNo</w:t>
-      </w:r>
-      <w:proofErr w:type="spellEnd"/>
-      <w:r>
-        <w:t xml:space="preserve"> is kept in </w:t>
-      </w:r>
-      <w:proofErr w:type="spellStart"/>
-      <w:r>
-        <w:t>FactLoan</w:t>
-      </w:r>
-      <w:proofErr w:type="spellEnd"/>
-      <w:r>
-        <w:t xml:space="preserve"> as a degenerate dimension. It identifies the physical copy involved in each loan and preserves traceability to the operational system without adding a separate, low-value dimension table.</w:t>
+      <w:r>
+        <w:t>CopySeqNo is kept in FactLoan as a degenerate dimension. It identifies the physical copy involved in each loan and preserves traceability to the operational system without adding a separate, low-value dimension table.</w:t>
       </w:r>
     </w:p>
     <w:p>
@@ -3332,57 +2917,13 @@
         </w:rPr>
       </w:pPr>
       <w:r>
-        <w:t xml:space="preserve">During the load, </w:t>
-      </w:r>
-      <w:proofErr w:type="spellStart"/>
-      <w:r>
-        <w:t>LoanDurationDays</w:t>
-      </w:r>
-      <w:proofErr w:type="spellEnd"/>
-      <w:r>
-        <w:t xml:space="preserve"> is calculated as the difference between the borrow and return dates. </w:t>
-      </w:r>
-      <w:proofErr w:type="spellStart"/>
-      <w:proofErr w:type="gramStart"/>
-      <w:r>
-        <w:t>DaysBeforeDue</w:t>
-      </w:r>
-      <w:proofErr w:type="spellEnd"/>
-      <w:proofErr w:type="gramEnd"/>
-      <w:r>
-        <w:t xml:space="preserve"> is due date minus return date, so a negative result indicates a late return. </w:t>
-      </w:r>
-      <w:proofErr w:type="spellStart"/>
-      <w:r>
-        <w:t>IsLate</w:t>
-      </w:r>
-      <w:proofErr w:type="spellEnd"/>
-      <w:r>
-        <w:t xml:space="preserve"> is stored as a clear Boolean flag. Persisting these </w:t>
-      </w:r>
-      <w:proofErr w:type="gramStart"/>
-      <w:r>
-        <w:t>measures keeps</w:t>
-      </w:r>
-      <w:proofErr w:type="gramEnd"/>
-      <w:r>
-        <w:t xml:space="preserve"> later analyses </w:t>
-      </w:r>
-      <w:proofErr w:type="gramStart"/>
-      <w:r>
-        <w:t>consistent</w:t>
-      </w:r>
-      <w:proofErr w:type="gramEnd"/>
-      <w:r>
-        <w:t xml:space="preserve"> and </w:t>
-      </w:r>
-      <w:proofErr w:type="gramStart"/>
-      <w:r>
-        <w:t>avoids</w:t>
-      </w:r>
-      <w:proofErr w:type="gramEnd"/>
-      <w:r>
-        <w:t xml:space="preserve"> repeating calculations in every query.</w:t>
+        <w:t>During the load, LoanDurationDays is calculated as the difference between the borrow and return dates. DaysBeforeDue is due date minus return date, so a negative result indicates a late return. IsLate is stored as a</w:t>
+      </w:r>
+      <w:r>
+        <w:t xml:space="preserve"> Boolean variable</w:t>
+      </w:r>
+      <w:r>
+        <w:t>. Persisting these measures keeps later analyses consistent and avoids repeating calculations in every query.</w:t>
       </w:r>
     </w:p>
     <w:p>
@@ -3391,21 +2932,8 @@
           <w:lang w:val="en-SG"/>
         </w:rPr>
       </w:pPr>
-      <w:proofErr w:type="spellStart"/>
-      <w:r>
-        <w:t>FactLoan</w:t>
-      </w:r>
-      <w:proofErr w:type="spellEnd"/>
-      <w:r>
-        <w:t xml:space="preserve"> contains only completed loans because the project's analytical focus is borrowing activity and duration for books that have been returned; the single open loan is excluded. Slowly changing dimensions are outside scope. If membership-tier history is required later, </w:t>
-      </w:r>
-      <w:proofErr w:type="spellStart"/>
-      <w:r>
-        <w:t>DimMember</w:t>
-      </w:r>
-      <w:proofErr w:type="spellEnd"/>
-      <w:r>
-        <w:t xml:space="preserve"> can be extended to a Type 2 slowly changing dimension with effective-date, expiry-date and current-row attributes.</w:t>
+      <w:r>
+        <w:t xml:space="preserve">FactLoan contains only completed loans because the project's analytical focus is borrowing activity and duration for books that have been returned; the single open loan is excluded. </w:t>
       </w:r>
     </w:p>
     <w:p>
@@ -3422,46 +2950,13 @@
         </w:numPr>
       </w:pPr>
       <w:r>
-        <w:lastRenderedPageBreak/>
-        <w:t xml:space="preserve">Submit your </w:t>
-      </w:r>
-      <w:proofErr w:type="gramStart"/>
-      <w:r>
-        <w:t>CREATE table</w:t>
-      </w:r>
-      <w:proofErr w:type="gramEnd"/>
-      <w:r>
-        <w:t xml:space="preserve"> statements for DW table creations in </w:t>
-      </w:r>
-      <w:proofErr w:type="spellStart"/>
-      <w:r>
-        <w:t>DW_create.sql</w:t>
-      </w:r>
-      <w:proofErr w:type="spellEnd"/>
-      <w:r>
-        <w:t xml:space="preserve">. Use appropriate SQL statements to extract and load data from OLTP tables to </w:t>
-      </w:r>
-      <w:proofErr w:type="gramStart"/>
-      <w:r>
-        <w:t xml:space="preserve">the </w:t>
-      </w:r>
-      <w:r>
-        <w:t>DW</w:t>
-      </w:r>
-      <w:proofErr w:type="gramEnd"/>
-      <w:r>
-        <w:t xml:space="preserve"> and</w:t>
-      </w:r>
-      <w:r>
-        <w:t xml:space="preserve"> submit all your queries in </w:t>
-      </w:r>
-      <w:proofErr w:type="spellStart"/>
-      <w:r>
-        <w:t>DW_insert.sql</w:t>
-      </w:r>
-      <w:proofErr w:type="spellEnd"/>
-      <w:r>
-        <w:t>.</w:t>
+        <w:t xml:space="preserve">Submit your CREATE table statements for DW table creations in DW_create.sql. Use appropriate SQL statements to extract and load data from OLTP tables to the </w:t>
+      </w:r>
+      <w:r>
+        <w:t>DW and</w:t>
+      </w:r>
+      <w:r>
+        <w:t xml:space="preserve"> submit all your queries in DW_insert.sql.</w:t>
       </w:r>
     </w:p>
     <w:bookmarkEnd w:id="1"/>
@@ -3625,45 +3120,8 @@
         </w:rPr>
         <w:t xml:space="preserve">Row-count reconciliation. </w:t>
       </w:r>
-      <w:proofErr w:type="spellStart"/>
-      <w:r>
-        <w:t>FactLoan</w:t>
-      </w:r>
-      <w:proofErr w:type="spellEnd"/>
-      <w:r>
-        <w:t xml:space="preserve"> contains 12,343 rows, exactly matching the number of completed Loan records in the OLTP database. The dimension counts also reconcile to their source entities: </w:t>
-      </w:r>
-      <w:proofErr w:type="spellStart"/>
-      <w:r>
-        <w:t>DimMember</w:t>
-      </w:r>
-      <w:proofErr w:type="spellEnd"/>
-      <w:r>
-        <w:t xml:space="preserve"> 301/Member 301, </w:t>
-      </w:r>
-      <w:proofErr w:type="spellStart"/>
-      <w:r>
-        <w:t>DimBook</w:t>
-      </w:r>
-      <w:proofErr w:type="spellEnd"/>
-      <w:r>
-        <w:t xml:space="preserve"> 500/Book 500 and </w:t>
-      </w:r>
-      <w:proofErr w:type="spellStart"/>
-      <w:r>
-        <w:t>DimStaff</w:t>
-      </w:r>
-      <w:proofErr w:type="spellEnd"/>
-      <w:r>
-        <w:t xml:space="preserve"> 51/Staff 51. </w:t>
-      </w:r>
-      <w:proofErr w:type="spellStart"/>
-      <w:r>
-        <w:t>DimDate</w:t>
-      </w:r>
-      <w:proofErr w:type="spellEnd"/>
-      <w:r>
-        <w:t xml:space="preserve"> contains 2,557 day-level rows. Matching counts confirm that the intended records were loaded without omission or duplication.</w:t>
+      <w:r>
+        <w:t>FactLoan contains 12,343 rows, exactly matching the number of completed Loan records in the OLTP database. The dimension counts also reconcile to their source entities: DimMember 301/Member 301, DimBook 500/Book 500 and DimStaff 51/Staff 51. DimDate contains 2,557 day-level rows. Matching counts confirm that the intended records were loaded without omission or duplication.</w:t>
       </w:r>
     </w:p>
     <w:p>
@@ -3679,31 +3137,7 @@
         <w:t xml:space="preserve">Measure reconciliation. </w:t>
       </w:r>
       <w:r>
-        <w:t xml:space="preserve">The total loan duration calculated directly from completed OLTP loans is 108,801 days, </w:t>
-      </w:r>
-      <w:proofErr w:type="gramStart"/>
-      <w:r>
-        <w:t>exactly the same</w:t>
-      </w:r>
-      <w:proofErr w:type="gramEnd"/>
-      <w:r>
-        <w:t xml:space="preserve"> as the total </w:t>
-      </w:r>
-      <w:proofErr w:type="spellStart"/>
-      <w:r>
-        <w:t>LoanDurationDays</w:t>
-      </w:r>
-      <w:proofErr w:type="spellEnd"/>
-      <w:r>
-        <w:t xml:space="preserve"> stored in </w:t>
-      </w:r>
-      <w:proofErr w:type="spellStart"/>
-      <w:r>
-        <w:t>FactLoan</w:t>
-      </w:r>
-      <w:proofErr w:type="spellEnd"/>
-      <w:r>
-        <w:t>. This confirms that the duration transformation was applied consistently to every loaded fact.</w:t>
+        <w:t>The total loan duration calculated directly from completed OLTP loans is 108,801 days, exactly the same as the total LoanDurationDays stored in FactLoan. This confirms that the duration transformation was applied consistently to every loaded fact.</w:t>
       </w:r>
     </w:p>
     <w:p>
@@ -3714,35 +3148,7 @@
         <w:t xml:space="preserve">Referential-integrity and date-range checks. </w:t>
       </w:r>
       <w:r>
-        <w:t xml:space="preserve">A left-join validation across </w:t>
-      </w:r>
-      <w:proofErr w:type="spellStart"/>
-      <w:r>
-        <w:t>FactLoan</w:t>
-      </w:r>
-      <w:proofErr w:type="spellEnd"/>
-      <w:r>
-        <w:t xml:space="preserve"> and all four dimensions </w:t>
-      </w:r>
-      <w:proofErr w:type="gramStart"/>
-      <w:r>
-        <w:t>returns</w:t>
-      </w:r>
-      <w:proofErr w:type="gramEnd"/>
-      <w:r>
-        <w:t xml:space="preserve"> 0 orphan rows, confirming every fact points to a valid member, staff member, </w:t>
-      </w:r>
-      <w:r>
-        <w:lastRenderedPageBreak/>
-        <w:t xml:space="preserve">book and borrow date. </w:t>
-      </w:r>
-      <w:proofErr w:type="spellStart"/>
-      <w:r>
-        <w:t>DimDate</w:t>
-      </w:r>
-      <w:proofErr w:type="spellEnd"/>
-      <w:r>
-        <w:t xml:space="preserve"> runs from 2020-01-01 to 2026-12-31, covering the dates required by the load. Together, these checks validate record completeness, transformed measures and dimension-key integrity. The verification SQL is included in the submitted DW scripts</w:t>
+        <w:t>A left-join validation across FactLoan and all four dimensions returns 0 orphan rows, confirming every fact points to a valid member, staff member, book and borrow date. DimDate runs from 2020-01-01 to 2026-12-31, covering the dates required by the load. Together, these checks validate record completeness, transformed measures and dimension-key integrity. The verification SQL is included in the submitted DW scripts</w:t>
       </w:r>
       <w:r>
         <w:t xml:space="preserve"> as</w:t>
@@ -3753,27 +3159,7 @@
         <w:rPr>
           <w:bCs/>
         </w:rPr>
-        <w:t>“</w:t>
-      </w:r>
-      <w:proofErr w:type="spellStart"/>
-      <w:r>
-        <w:rPr>
-          <w:bCs/>
-        </w:rPr>
-        <w:t>DW_verify.sql</w:t>
-      </w:r>
-      <w:proofErr w:type="spellEnd"/>
-      <w:r>
-        <w:rPr>
-          <w:bCs/>
-        </w:rPr>
-        <w:t>”</w:t>
-      </w:r>
-      <w:r>
-        <w:rPr>
-          <w:bCs/>
-        </w:rPr>
-        <w:t xml:space="preserve">. </w:t>
+        <w:t xml:space="preserve">“DW_verify.sql”. </w:t>
       </w:r>
       <w:r>
         <w:t>The successful-insertion checks were run from DW_verify.sql: C1 reconciles source and warehouse row counts, C2 reconciles total loan duration, C3 tests for orphan keys, and C4 confirms the DimDate range and row count. The expected outcomes are matching totals, 0 orphan rows, and 2,557 dates from 2020-01-01 to 2026-12-31.</w:t>
@@ -3804,15 +3190,7 @@
         </w:numPr>
       </w:pPr>
       <w:r>
-        <w:t xml:space="preserve">Describe and discuss your analysis done using </w:t>
-      </w:r>
-      <w:proofErr w:type="gramStart"/>
-      <w:r>
-        <w:t>the DW</w:t>
-      </w:r>
-      <w:proofErr w:type="gramEnd"/>
-      <w:r>
-        <w:t xml:space="preserve">. </w:t>
+        <w:t xml:space="preserve">Describe and discuss your analysis done using the DW. </w:t>
       </w:r>
       <w:r>
         <w:t>Briefly e</w:t>
@@ -3839,15 +3217,7 @@
         <w:t xml:space="preserve"> if group size is 4.</w:t>
       </w:r>
       <w:r>
-        <w:t xml:space="preserve"> Separately submit all your queries in </w:t>
-      </w:r>
-      <w:proofErr w:type="spellStart"/>
-      <w:r>
-        <w:t>DW_query.sql</w:t>
-      </w:r>
-      <w:proofErr w:type="spellEnd"/>
-      <w:r>
-        <w:t xml:space="preserve">. (So do not include </w:t>
+        <w:t xml:space="preserve"> Separately submit all your queries in DW_query.sql. (So do not include </w:t>
       </w:r>
       <w:r>
         <w:t>your</w:t>
@@ -3894,19 +3264,8 @@
         </w:rPr>
         <w:t xml:space="preserve">Objective: </w:t>
       </w:r>
-      <w:proofErr w:type="spellStart"/>
-      <w:r>
-        <w:t>Analyse</w:t>
-      </w:r>
-      <w:proofErr w:type="spellEnd"/>
-      <w:r>
-        <w:t xml:space="preserve"> completed-loan volume by month and </w:t>
-      </w:r>
-      <w:r>
-        <w:t>year and</w:t>
-      </w:r>
-      <w:r>
-        <w:t xml:space="preserve"> assess whether loan duration changes over time.</w:t>
+      <w:r>
+        <w:t>Analyse completed-loan volume by month and year and assess whether loan duration changes over time.</w:t>
       </w:r>
     </w:p>
     <w:p>
@@ -3965,7 +3324,7 @@
         </w:rPr>
       </w:pPr>
       <w:r>
-        <w:t>Analysis 2: Borrowing pattern by day of week</w:t>
+        <w:t>Analysis 2: Staff workload by department and employment type</w:t>
       </w:r>
     </w:p>
     <w:p>
@@ -3982,7 +3341,7 @@
         <w:t xml:space="preserve">Objective: </w:t>
       </w:r>
       <w:r>
-        <w:t>Identify the days with the highest completed-loan activity so daily operations can be scheduled more effectively.</w:t>
+        <w:t>Compare completed-loan workload across staff departments and employment types, together with average loan duration and late-return rate.</w:t>
       </w:r>
     </w:p>
     <w:p>
@@ -3999,7 +3358,7 @@
         <w:t xml:space="preserve">Results: </w:t>
       </w:r>
       <w:r>
-        <w:t>Sunday accounts for 4,425 completed loans (35.85%) and Saturday for 4,189 (33.94%). Together, weekends contribute 8,614 loans, or 69.79% of all completed loans. Weekdays each contribute 5.31%-6.65%, with Friday lowest at 655 loans (5.31%).</w:t>
+        <w:t>Circulation part-time staff processed the most completed loans at 2,243, followed by Circulation full-time staff at 1,981. Digital Services full-time staff processed the fewest at 470. Average duration across the groups ranged from 8.57 to 9.18 days, while late-return rates ranged from 7.50% for Membership full-time to 8.94% for Reference part-time staff.</w:t>
       </w:r>
     </w:p>
     <w:p>
@@ -4016,7 +3375,7 @@
         <w:t xml:space="preserve">Insight: </w:t>
       </w:r>
       <w:r>
-        <w:t>Counter staffing and shelving should be concentrated on weekends. Lower-demand Fridays are more suitable for system maintenance, stock-taking and other work that may temporarily reduce service capacity.</w:t>
+        <w:t>Circulation is the main staffing priority, especially for part-time coverage. Late-return rates remain broadly similar across groups, so higher workload is not accompanied by a clearly worse return outcome. The result supports staff deployment, training and workload balancing.</w:t>
       </w:r>
     </w:p>
     <w:p>
@@ -4041,7 +3400,7 @@
         </w:rPr>
       </w:pPr>
       <w:r>
-        <w:t>Analysis 3: Genre popularity and demand per title</w:t>
+        <w:t>Analysis 3: Borrowing pattern by day of week</w:t>
       </w:r>
     </w:p>
     <w:p>
@@ -4058,7 +3417,7 @@
         <w:t xml:space="preserve">Objective: </w:t>
       </w:r>
       <w:r>
-        <w:t>Compare total loans, loans per title and average reading duration across book genres.</w:t>
+        <w:t>Identify the days with the highest completed-loan activity so daily operations can be scheduled more effectively.</w:t>
       </w:r>
     </w:p>
     <w:p>
@@ -4075,15 +3434,7 @@
         <w:t xml:space="preserve">Results: </w:t>
       </w:r>
       <w:r>
-        <w:t xml:space="preserve">Research Journal has the highest total volume at 2,093 loans across 96 titles, or 21.8 loans per title. Young Adult has the highest demand per title at 31.2 loans across 39 titles. Children </w:t>
-      </w:r>
-      <w:proofErr w:type="gramStart"/>
-      <w:r>
-        <w:t>is</w:t>
-      </w:r>
-      <w:proofErr w:type="gramEnd"/>
-      <w:r>
-        <w:t xml:space="preserve"> also strong, with 1,873 loans and 28.0 loans per title. Average duration is similar across the reported genres, at 8.35-9.25 days.</w:t>
+        <w:t>Sunday accounts for 4,425 completed loans (35.85%) and Saturday for 4,189 (33.94%). Together, weekends contribute 8,614 loans, or 69.79% of all completed loans. Weekdays each contribute 5.31%-6.65%, with Friday lowest at 655 loans (5.31%).</w:t>
       </w:r>
     </w:p>
     <w:p>
@@ -4097,11 +3448,10 @@
         <w:rPr>
           <w:b/>
         </w:rPr>
-        <w:lastRenderedPageBreak/>
         <w:t xml:space="preserve">Insight: </w:t>
       </w:r>
       <w:r>
-        <w:t>Research Journal leads mainly because its catalogue is large, while Young Adult and Children titles are borrowed more intensively. Additional copies would therefore be most useful in the Young Adult and Children categories.</w:t>
+        <w:t>Counter staffing and shelving should be concentrated on weekends. Lower-demand Fridays are more suitable for system maintenance, stock-taking and other work that may temporarily reduce service capacity.</w:t>
       </w:r>
     </w:p>
     <w:p>
@@ -4126,7 +3476,7 @@
         </w:rPr>
       </w:pPr>
       <w:r>
-        <w:t>Analysis 4: Members with unusually high or low activity</w:t>
+        <w:t>Analysis 4: Youth-genre demand across the year</w:t>
       </w:r>
     </w:p>
     <w:p>
@@ -4143,7 +3493,7 @@
         <w:t xml:space="preserve">Objective: </w:t>
       </w:r>
       <w:r>
-        <w:t>Identify members whose number of completed loans or total borrowing duration differs substantially from the rest.</w:t>
+        <w:t>Determine whether Children and Young Adult borrowing rises during school-holiday periods.</w:t>
       </w:r>
     </w:p>
     <w:p>
@@ -4160,7 +3510,7 @@
         <w:t xml:space="preserve">Results: </w:t>
       </w:r>
       <w:r>
-        <w:t>Evan Seah, a Premium member, completed the most loans at 454. Isaac Wilson, also Premium, recorded the greatest total borrowing duration at 5,726 days across 409 loans. Jasper Johnson and Theodore Campbell are Basic members but still completed 331 and 324 loans respectively. The least active members completed only 9-11 loans.</w:t>
+        <w:t>Children loans rise from 65 in January to 486 in December, a 7.5-fold increase, with secondary peaks of 126 and 131 in June and July. Young Adult follows the same pattern, rising from 51 loans in January to 301 in December.</w:t>
       </w:r>
     </w:p>
     <w:p>
@@ -4177,7 +3527,7 @@
         <w:t xml:space="preserve">Insight: </w:t>
       </w:r>
       <w:r>
-        <w:t>Member activity varies by roughly a factor of 50. Highly active Basic members should be reviewed for tier-upgrade eligibility against the full policy criteria, rather than upgraded automatically. The least active group could be targeted through recommendations, reminders or re-engagement campaigns.</w:t>
+        <w:t>Youth borrowing is strongly seasonal and is concentrated in the November-December school-holiday period. The library should schedule programmes, acquisitions and extra copies of popular youth titles before the fourth quarter.</w:t>
       </w:r>
     </w:p>
     <w:p>
@@ -4202,12 +3552,15 @@
         </w:rPr>
       </w:pPr>
       <w:r>
-        <w:t>Analysis 5: Membership tier and return discipline</w:t>
+        <w:t>Analysis 5: Members with unusually high or low activity</w:t>
       </w:r>
     </w:p>
     <w:p>
       <w:pPr>
         <w:pStyle w:val="ListParagraph"/>
+        <w:rPr>
+          <w:lang w:val="en-SG"/>
+        </w:rPr>
       </w:pPr>
       <w:r>
         <w:rPr>
@@ -4216,7 +3569,7 @@
         <w:t xml:space="preserve">Objective: </w:t>
       </w:r>
       <w:r>
-        <w:t>Examine whether membership tier is associated with late-return rate and average loan duration.</w:t>
+        <w:t>Identify members whose number of completed loans or total borrowing duration differs substantially from the rest.</w:t>
       </w:r>
     </w:p>
     <w:p>
@@ -4233,7 +3586,7 @@
         <w:t xml:space="preserve">Results: </w:t>
       </w:r>
       <w:r>
-        <w:t>The late-return rate decreases as tier rises: Basic 8.94% (523 late returns from 5,853 loans), Advanced 8.12% (306 from 3,770) and Premium 7.94% (216 from 2,720). Average loan duration increases from 8.54 days for Basic members to 9.39 days for Premium members.</w:t>
+        <w:t>Evan Seah, a Premium member, completed the most loans at 454. Isaac Wilson, also Premium, recorded the greatest total borrowing duration at 5,726 days across 409 loans. Jasper Johnson and Theodore Campbell are Basic members but still completed 331 and 324 loans respectively. The least active members completed only 9-11 loans.</w:t>
       </w:r>
     </w:p>
     <w:p>
@@ -4250,23 +3603,13 @@
         <w:t xml:space="preserve">Insight: </w:t>
       </w:r>
       <w:r>
-        <w:t xml:space="preserve">In this dataset, higher-tier members keep books slightly longer but have lower late-return rates. This is an association, not proof that tier causes return </w:t>
-      </w:r>
-      <w:proofErr w:type="spellStart"/>
-      <w:r>
-        <w:t>behaviour</w:t>
-      </w:r>
-      <w:proofErr w:type="spellEnd"/>
-      <w:r>
-        <w:t>. Reminders and late-return interventions would have the greatest effect when directed at Basic members.</w:t>
+        <w:t>Member activity varies by roughly a factor of 50. Highly active Basic members should be reviewed for tier-upgrade eligibility against the full policy criteria, rather than upgraded automatically. The least active group could be targeted through recommendations, reminders or re-engagement campaigns.</w:t>
       </w:r>
     </w:p>
     <w:p>
       <w:pPr>
         <w:pStyle w:val="ListParagraph"/>
         <w:rPr>
-          <w:b/>
-          <w:bCs/>
           <w:lang w:val="en-SG"/>
         </w:rPr>
       </w:pPr>
@@ -4285,7 +3628,21 @@
         </w:rPr>
       </w:pPr>
       <w:r>
-        <w:t>Analysis 6: Youth-genre demand across the year</w:t>
+        <w:t>Analysis 6: Membership tier and return discipline</w:t>
+      </w:r>
+    </w:p>
+    <w:p>
+      <w:pPr>
+        <w:pStyle w:val="ListParagraph"/>
+      </w:pPr>
+      <w:r>
+        <w:rPr>
+          <w:b/>
+        </w:rPr>
+        <w:t xml:space="preserve">Objective: </w:t>
+      </w:r>
+      <w:r>
+        <w:t>Examine whether membership tier Objective: Examine how average completed loans per active member, late-return rate and average loan duration differ by membership tier.</w:t>
       </w:r>
     </w:p>
     <w:p>
@@ -4299,10 +3656,10 @@
         <w:rPr>
           <w:b/>
         </w:rPr>
-        <w:t xml:space="preserve">Objective: </w:t>
-      </w:r>
-      <w:r>
-        <w:t>Determine whether Children and Young Adult borrowing rises during school-holiday periods.</w:t>
+        <w:t xml:space="preserve">Results: </w:t>
+      </w:r>
+      <w:r>
+        <w:t>The late-return rate decreases as tier rises Results: Average completed loans per active member rises with tier: Basic members average 34.03 completed loans across 172 active members, Advanced members average 42.84 across 88, and Premium members average 68.00 across 40. The late-return rate decreases from 8.94% for Basic to 8.12% for Advanced and 7.94% for Premium, while average duration increases from 8.54 to 9.39 days.</w:t>
       </w:r>
     </w:p>
     <w:p>
@@ -4316,41 +3673,18 @@
         <w:rPr>
           <w:b/>
         </w:rPr>
-        <w:t xml:space="preserve">Results: </w:t>
-      </w:r>
-      <w:r>
-        <w:t>Children loans rise from 65 in January to 486 in December, a 7.5-fold increase, with secondary peaks of 126 and 131 in June and July. Young Adult follows the same pattern, rising from 51 loans in January to 301 in December.</w:t>
+        <w:t xml:space="preserve">Insight: </w:t>
+      </w:r>
+      <w:r>
+        <w:t>In this dataset, higher-tier members keep books slightly longer Insight: Higher-tier active members complete more loans on average while also recording lower late-return rates, although this association does not prove that tier causes the behaviour. Premium engagement appears strongest, while reminders and late-return interventions would have the greatest effect when directed at Basic members.</w:t>
       </w:r>
     </w:p>
     <w:p>
       <w:pPr>
         <w:pStyle w:val="ListParagraph"/>
         <w:rPr>
-          <w:lang w:val="en-SG"/>
-        </w:rPr>
-      </w:pPr>
-      <w:r>
-        <w:rPr>
           <w:b/>
-        </w:rPr>
-        <w:t xml:space="preserve">Insight: </w:t>
-      </w:r>
-      <w:r>
-        <w:t xml:space="preserve">Youth borrowing is strongly seasonal and is concentrated in the November-December school-holiday period. The library should schedule </w:t>
-      </w:r>
-      <w:proofErr w:type="spellStart"/>
-      <w:r>
-        <w:t>programmes</w:t>
-      </w:r>
-      <w:proofErr w:type="spellEnd"/>
-      <w:r>
-        <w:t>, acquisitions and extra copies of popular youth titles before the fourth quarter.</w:t>
-      </w:r>
-    </w:p>
-    <w:p>
-      <w:pPr>
-        <w:pStyle w:val="ListParagraph"/>
-        <w:rPr>
+          <w:bCs/>
           <w:lang w:val="en-SG"/>
         </w:rPr>
       </w:pPr>
@@ -4369,7 +3703,7 @@
         </w:rPr>
       </w:pPr>
       <w:r>
-        <w:t>Analysis 7: Staff workload by department and employment type</w:t>
+        <w:t>Analysis 7: Genre popularity and demand per title</w:t>
       </w:r>
     </w:p>
     <w:p>
@@ -4386,7 +3720,7 @@
         <w:t xml:space="preserve">Objective: </w:t>
       </w:r>
       <w:r>
-        <w:t>Compare completed-loan workload across staff departments and employment types, together with average loan duration and late-return rate.</w:t>
+        <w:t>Compare total loans, loans per title and average reading duration across book genres.</w:t>
       </w:r>
     </w:p>
     <w:p>
@@ -4403,7 +3737,7 @@
         <w:t xml:space="preserve">Results: </w:t>
       </w:r>
       <w:r>
-        <w:t>Circulation part-time staff processed the most completed loans at 2,243, followed by Circulation full-time staff at 1,981. Digital Services full-time staff processed the fewest at 470. Average duration across the groups ranged from 8.57 to 9.18 days, while late-return rates ranged from 7.50% for Membership full-time to 8.94% for Reference part-time staff.</w:t>
+        <w:t>Research Journal has the highest total volume at 2,093 loans across 96 titles, or 21.8 loans per title. Young Adult has the highest demand per title at 31.2 loans across 39 titles. Children is also strong, with 1,873 loans and 28.0 loans per title. Average duration is similar across the reported genres, at 8.35-9.25 days.</w:t>
       </w:r>
     </w:p>
     <w:p>
@@ -4420,11 +3754,7 @@
         <w:t xml:space="preserve">Insight: </w:t>
       </w:r>
       <w:r>
-        <w:t xml:space="preserve">Circulation is the main staffing priority, especially for part-time coverage. Late-return rates remain broadly similar across groups, so higher workload is not accompanied by </w:t>
-      </w:r>
-      <w:r>
-        <w:lastRenderedPageBreak/>
-        <w:t>a clearly worse return outcome. The result supports staff deployment, training and workload balancing.</w:t>
+        <w:t>Research Journal leads mainly because its catalogue is large, while Young Adult and Children titles are borrowed more intensively. Additional copies would therefore be most useful in the Young Adult and Children categories.</w:t>
       </w:r>
     </w:p>
     <w:p>
@@ -4484,15 +3814,7 @@
         <w:t xml:space="preserve">Results: </w:t>
       </w:r>
       <w:r>
-        <w:t xml:space="preserve">Of 12,343 completed loans, 11,298 (91.53%) were returned on time or </w:t>
-      </w:r>
-      <w:proofErr w:type="gramStart"/>
-      <w:r>
-        <w:t>early</w:t>
-      </w:r>
-      <w:proofErr w:type="gramEnd"/>
-      <w:r>
-        <w:t>. Late loans were split into 189 returned 1-3 days late (1.53%), 205 returned 4-7 days late (1.66%), and 651 returned 8 or more days late (5.27%). The average loan duration rises from 7.37 days for on-time or early loans to 28.50 days for loans returned 8 or more days late.</w:t>
+        <w:t>Of 12,343 completed loans, 11,298 (91.53%) were returned on time or early. Late loans were split into 189 returned 1-3 days late (1.53%), 205 returned 4-7 days late (1.66%), and 651 returned 8 or more days late (5.27%). The average loan duration rises from 7.37 days for on-time or early loans to 28.50 days for loans returned 8 or more days late.</w:t>
       </w:r>
     </w:p>
     <w:p>
@@ -4509,15 +3831,7 @@
         <w:t xml:space="preserve">Insight: </w:t>
       </w:r>
       <w:r>
-        <w:t xml:space="preserve">Most loans are returned on time, but the 8-or-more-days-late band is the largest late-return category. This group should be the priority for targeted reminders and follow-up, while shorter delays may be handled with </w:t>
-      </w:r>
-      <w:proofErr w:type="gramStart"/>
-      <w:r>
-        <w:t>lighter-touch</w:t>
-      </w:r>
-      <w:proofErr w:type="gramEnd"/>
-      <w:r>
-        <w:t xml:space="preserve"> interventions.</w:t>
+        <w:t>Most loans are returned on time, but the 8-or-more-days-late band is the largest late-return category. This group should be the priority for targeted reminders and follow-up, while shorter delays may be handled with lighter-touch interventions.</w:t>
       </w:r>
     </w:p>
     <w:sectPr>
@@ -4568,6 +3882,7 @@
         <w:docPartUnique/>
       </w:docPartObj>
     </w:sdtPr>
+    <w:sdtEndPr/>
     <w:sdtContent>
       <w:p>
         <w:pPr>
@@ -9831,7 +9146,7 @@
     <w:lsdException w:name="List Continue 4" w:semiHidden="1" w:unhideWhenUsed="1"/>
     <w:lsdException w:name="List Continue 5" w:semiHidden="1" w:unhideWhenUsed="1"/>
     <w:lsdException w:name="Message Header" w:semiHidden="1" w:unhideWhenUsed="1"/>
-    <w:lsdException w:name="Subtitle" w:qFormat="1"/>
+    <w:lsdException w:name="Subtitle" w:uiPriority="11" w:qFormat="1"/>
     <w:lsdException w:name="Body Text First Indent 2" w:semiHidden="1" w:unhideWhenUsed="1"/>
     <w:lsdException w:name="Note Heading" w:semiHidden="1" w:unhideWhenUsed="1"/>
     <w:lsdException w:name="Body Text 2" w:semiHidden="1" w:unhideWhenUsed="1"/>
@@ -11771,6 +11086,48 @@
       <w:lang w:val="en-US" w:eastAsia="en-SG" w:bidi="th-TH"/>
     </w:rPr>
   </w:style>
+  <w:style w:type="paragraph" w:styleId="Subtitle">
+    <w:name w:val="Subtitle"/>
+    <w:basedOn w:val="Normal"/>
+    <w:next w:val="Normal"/>
+    <w:link w:val="SubtitleChar"/>
+    <w:uiPriority w:val="11"/>
+    <w:qFormat/>
+    <w:rsid w:val="0076776D"/>
+    <w:pPr>
+      <w:numPr>
+        <w:ilvl w:val="1"/>
+      </w:numPr>
+      <w:spacing w:after="160" w:line="278" w:lineRule="auto"/>
+    </w:pPr>
+    <w:rPr>
+      <w:rFonts w:eastAsiaTheme="majorEastAsia" w:cstheme="majorBidi"/>
+      <w:color w:val="595959" w:themeColor="text1" w:themeTint="A6"/>
+      <w:spacing w:val="15"/>
+      <w:kern w:val="2"/>
+      <w:sz w:val="28"/>
+      <w:szCs w:val="28"/>
+      <w:lang w:val="en-SG" w:eastAsia="en-US" w:bidi="ar-SA"/>
+      <w14:ligatures w14:val="standardContextual"/>
+    </w:rPr>
+  </w:style>
+  <w:style w:type="character" w:customStyle="1" w:styleId="SubtitleChar">
+    <w:name w:val="Subtitle Char"/>
+    <w:basedOn w:val="DefaultParagraphFont"/>
+    <w:link w:val="Subtitle"/>
+    <w:uiPriority w:val="11"/>
+    <w:rsid w:val="0076776D"/>
+    <w:rPr>
+      <w:rFonts w:asciiTheme="minorHAnsi" w:eastAsiaTheme="majorEastAsia" w:hAnsiTheme="minorHAnsi" w:cstheme="majorBidi"/>
+      <w:color w:val="595959" w:themeColor="text1" w:themeTint="A6"/>
+      <w:spacing w:val="15"/>
+      <w:kern w:val="2"/>
+      <w:sz w:val="28"/>
+      <w:szCs w:val="28"/>
+      <w:lang w:eastAsia="en-US"/>
+      <w14:ligatures w14:val="standardContextual"/>
+    </w:rPr>
+  </w:style>
 </w:styles>
 </file>
 

</xml_diff>

<commit_message>
slight changes to word doc and ran the code ig
</commit_message>
<xml_diff>
--- a/2B21-04_group_submission_revised_updated.docx
+++ b/2B21-04_group_submission_revised_updated.docx
@@ -2794,10 +2794,10 @@
           <w:noProof/>
         </w:rPr>
         <w:drawing>
-          <wp:inline distT="0" distB="0" distL="0" distR="0" wp14:anchorId="0AD872B6" wp14:editId="454AEF3A">
-            <wp:extent cx="6190615" cy="5391150"/>
+          <wp:inline distT="0" distB="0" distL="0" distR="0" wp14:anchorId="07C68662" wp14:editId="594D49EB">
+            <wp:extent cx="6190615" cy="5264785"/>
             <wp:effectExtent l="0" t="0" r="635" b="0"/>
-            <wp:docPr id="1100106670" name="Picture 12"/>
+            <wp:docPr id="2132654522" name="Picture 10"/>
             <wp:cNvGraphicFramePr>
               <a:graphicFrameLocks xmlns:a="http://schemas.openxmlformats.org/drawingml/2006/main" noChangeAspect="1"/>
             </wp:cNvGraphicFramePr>
@@ -2805,23 +2805,36 @@
               <a:graphicData uri="http://schemas.openxmlformats.org/drawingml/2006/picture">
                 <pic:pic xmlns:pic="http://schemas.openxmlformats.org/drawingml/2006/picture">
                   <pic:nvPicPr>
-                    <pic:cNvPr id="1100106670" name="Picture 1100106670"/>
-                    <pic:cNvPicPr/>
+                    <pic:cNvPr id="0" name="Picture 6"/>
+                    <pic:cNvPicPr>
+                      <a:picLocks noChangeAspect="1" noChangeArrowheads="1"/>
+                    </pic:cNvPicPr>
                   </pic:nvPicPr>
                   <pic:blipFill>
-                    <a:blip r:embed="rId12"/>
+                    <a:blip r:embed="rId12">
+                      <a:extLst>
+                        <a:ext uri="{28A0092B-C50C-407E-A947-70E740481C1C}">
+                          <a14:useLocalDpi xmlns:a14="http://schemas.microsoft.com/office/drawing/2010/main" val="0"/>
+                        </a:ext>
+                      </a:extLst>
+                    </a:blip>
+                    <a:srcRect/>
                     <a:stretch>
                       <a:fillRect/>
                     </a:stretch>
                   </pic:blipFill>
-                  <pic:spPr>
+                  <pic:spPr bwMode="auto">
                     <a:xfrm>
                       <a:off x="0" y="0"/>
-                      <a:ext cx="6190615" cy="5391150"/>
+                      <a:ext cx="6190615" cy="5264785"/>
                     </a:xfrm>
                     <a:prstGeom prst="rect">
                       <a:avLst/>
                     </a:prstGeom>
+                    <a:noFill/>
+                    <a:ln>
+                      <a:noFill/>
+                    </a:ln>
                   </pic:spPr>
                 </pic:pic>
               </a:graphicData>
@@ -2871,6 +2884,7 @@
         <w:rPr>
           <w:b/>
         </w:rPr>
+        <w:lastRenderedPageBreak/>
         <w:t>Grain</w:t>
       </w:r>
     </w:p>
@@ -2894,14 +2908,17 @@
       </w:r>
     </w:p>
     <w:p>
-      <w:pPr/>
-      <w:r>
-        <w:t>The warehouse has to answer questions about loan duration and borrowing activity, and on top of that transaction volume, book popularity and seasonal trends. Each of those lands on a specific part of the design:</w:t>
+      <w:r>
+        <w:t xml:space="preserve">The warehouse has to answer questions about loan duration and borrowing activity, and on top of that transaction volume, book popularity and seasonal trends. </w:t>
+      </w:r>
+      <w:r>
+        <w:t>These are used in our analysis</w:t>
+      </w:r>
+      <w:r>
+        <w:t>Each of those lands on a specific part of the design:</w:t>
       </w:r>
     </w:p>
-    <w:p>
-      <w:pPr/>
-    </w:p>
+    <w:p/>
     <w:tbl>
       <w:tblPr>
         <w:tblStyle w:val="TableGrid"/>
@@ -2924,21 +2941,35 @@
                 <w:b/>
                 <w:sz w:val="20"/>
               </w:rPr>
-              <w:t>What the brief asks for</w:t>
-            </w:r>
-          </w:p>
-        </w:tc>
-        <w:tc>
-          <w:tcPr>
-            <w:tcW w:w="3250" w:type="dxa"/>
-          </w:tcPr>
-          <w:p>
+              <w:t xml:space="preserve">What </w:t>
+            </w:r>
             <w:r>
               <w:rPr>
                 <w:b/>
                 <w:sz w:val="20"/>
               </w:rPr>
-              <w:t>Where it lives in the design</w:t>
+              <w:t>analysis requires</w:t>
+            </w:r>
+          </w:p>
+        </w:tc>
+        <w:tc>
+          <w:tcPr>
+            <w:tcW w:w="3250" w:type="dxa"/>
+          </w:tcPr>
+          <w:p>
+            <w:r>
+              <w:rPr>
+                <w:b/>
+                <w:sz w:val="20"/>
+              </w:rPr>
+              <w:t xml:space="preserve">Where it </w:t>
+            </w:r>
+            <w:r>
+              <w:rPr>
+                <w:b/>
+                <w:sz w:val="20"/>
+              </w:rPr>
+              <w:t>is stored</w:t>
             </w:r>
           </w:p>
         </w:tc>
@@ -3579,6 +3610,7 @@
     </w:p>
     <w:p>
       <w:r>
+        <w:lastRenderedPageBreak/>
         <w:t>DimMember carries the member’s tier attributes (TierName, TierLevel, BorrowLimit) and DimBook carries the minimum tier needed to borrow the title (MinTierName, MinTierLevel). Both come from MembershipTier, denormalised as described above.</w:t>
       </w:r>
     </w:p>
@@ -4331,6 +4363,7 @@
               <w:rPr>
                 <w:sz w:val="20"/>
               </w:rPr>
+              <w:lastRenderedPageBreak/>
               <w:t>SCD Type 1 / Type 2</w:t>
             </w:r>
           </w:p>
@@ -4387,7 +4420,6 @@
               <w:rPr>
                 <w:sz w:val="20"/>
               </w:rPr>
-              <w:lastRenderedPageBreak/>
               <w:t>Accumulating snapshot</w:t>
             </w:r>
           </w:p>
@@ -4627,20 +4659,14 @@
       </w:r>
     </w:p>
     <w:bookmarkEnd w:id="0"/>
+    <w:p/>
     <w:p>
-      <w:pPr/>
+      <w:r>
+        <w:t>We ran four checks, all of them in DW_verify.sql, labelled C1 to C4 in that file. Each one compares something in the warehouse against the OLTP database it was loaded from, so anything that went wrong during the load would show up as a pair of numbers that fail to agree.</w:t>
+      </w:r>
     </w:p>
+    <w:p/>
     <w:p>
-      <w:pPr/>
-      <w:r>
-        <w:t>We ran four checks, all of them in DW_verify.sql, labelled C1 to C4 in that file. Each one compares something in the warehouse against the OLTP database it was loaded from, so anything that went wrong during the load would show up as a pair of numbers that fail to agree.</w:t>
-      </w:r>
-    </w:p>
-    <w:p>
-      <w:pPr/>
-    </w:p>
-    <w:p>
-      <w:pPr/>
       <w:r>
         <w:rPr>
           <w:b/>
@@ -4648,14 +4674,15 @@
         <w:t xml:space="preserve">Row counts (C1). </w:t>
       </w:r>
       <w:r>
-        <w:t>FactLoan contains 12,343 rows, which is exactly the number of Loan records in the OLTP database that have a return date. The dimensions match their source tables too: DimMember 301 against Member 301, DimBook 500 against Book 500, and DimStaff 51 against Staff 51. DimDate holds 2,557 rows, one per day. Counting both sides and getting the same answer tells us that nothing was dropped on the way in and nothing was written twice.</w:t>
+        <w:t xml:space="preserve">FactLoan contains 12,343 rows, which is exactly the number of Loan records in the OLTP database that have a return date. The dimensions match their source tables too: DimMember 301 against Member 301, DimBook 500 against Book 500, and DimStaff 51 against </w:t>
+      </w:r>
+      <w:r>
+        <w:lastRenderedPageBreak/>
+        <w:t>Staff 51. DimDate holds 2,557 rows, one per day. Counting both sides and getting the same answer tells us that nothing was dropped on the way in and nothing was written twice.</w:t>
       </w:r>
     </w:p>
+    <w:p/>
     <w:p>
-      <w:pPr/>
-    </w:p>
-    <w:p>
-      <w:pPr/>
       <w:r>
         <w:rPr>
           <w:b/>
@@ -4666,11 +4693,8 @@
         <w:t>LoanDurationDays is not copied from the OLTP database; it is worked out during the load as the return date minus the borrow date. To check that this calculation ran correctly on every row rather than most of them, we added up the durations straight from the OLTP loans, then separately added up the LoanDurationDays column in FactLoan. Both totals come to 108,801 days. Since the two agree exactly, the same calculation was applied to every fact row.</w:t>
       </w:r>
     </w:p>
+    <w:p/>
     <w:p>
-      <w:pPr/>
-    </w:p>
-    <w:p>
-      <w:pPr/>
       <w:r>
         <w:rPr>
           <w:b/>
@@ -4681,11 +4705,8 @@
         <w:t>Every row in FactLoan points at a member, a staff member, a book and a borrow date. A fact row that points at something which does not actually exist is called an orphan, and it normally means a key failed to match while the data was being loaded. To look for any, we joined FactLoan to each of the four dimensions using a LEFT JOIN, which keeps every fact row in the result even when the dimension has nothing matching it, and leaves the dimension columns empty wherever the match failed. Counting the rows with an empty dimension key returns 0, so every fact row is linked to a real dimension row.</w:t>
       </w:r>
     </w:p>
+    <w:p/>
     <w:p>
-      <w:pPr/>
-    </w:p>
-    <w:p>
-      <w:pPr/>
       <w:r>
         <w:rPr>
           <w:b/>
@@ -4696,11 +4717,8 @@
         <w:t>DimDate runs from 2020-01-01 to 2026-12-31, which is 2,557 days. That covers every borrow date in the data along with the later dates needed for due dates and returns, so no loan was left out because its date fell outside the calendar.</w:t>
       </w:r>
     </w:p>
+    <w:p/>
     <w:p>
-      <w:pPr/>
-    </w:p>
-    <w:p>
-      <w:pPr/>
       <w:r>
         <w:t>Between them the four checks cover the three things that can realistically go wrong in a load: records going missing or being duplicated, a calculated measure coming out wrong, and a key that fails to resolve.</w:t>
       </w:r>
@@ -4883,6 +4901,7 @@
         <w:rPr>
           <w:b/>
         </w:rPr>
+        <w:lastRenderedPageBreak/>
         <w:t xml:space="preserve">Objective: </w:t>
       </w:r>
       <w:r>
@@ -4962,7 +4981,6 @@
         <w:rPr>
           <w:b/>
         </w:rPr>
-        <w:lastRenderedPageBreak/>
         <w:t xml:space="preserve">Objective: </w:t>
       </w:r>
       <w:r>
@@ -5214,6 +5232,7 @@
         <w:rPr>
           <w:b/>
         </w:rPr>
+        <w:lastRenderedPageBreak/>
         <w:t xml:space="preserve">Results: </w:t>
       </w:r>
       <w:r>
@@ -5295,7 +5314,6 @@
         <w:rPr>
           <w:b/>
         </w:rPr>
-        <w:lastRenderedPageBreak/>
         <w:t xml:space="preserve">Results: </w:t>
       </w:r>
       <w:r>

</xml_diff>

<commit_message>
hi guys im alive
</commit_message>
<xml_diff>
--- a/2B21-04_group_submission_revised_updated.docx
+++ b/2B21-04_group_submission_revised_updated.docx
@@ -224,7 +224,15 @@
           </w:tcPr>
           <w:p>
             <w:r>
-              <w:t xml:space="preserve">Kendrick Slamat </w:t>
+              <w:t xml:space="preserve">Kendrick </w:t>
+            </w:r>
+            <w:proofErr w:type="spellStart"/>
+            <w:r>
+              <w:t>Slamat</w:t>
+            </w:r>
+            <w:proofErr w:type="spellEnd"/>
+            <w:r>
+              <w:t xml:space="preserve"> </w:t>
             </w:r>
           </w:p>
         </w:tc>
@@ -2149,7 +2157,21 @@
               <w:rPr>
                 <w:sz w:val="18"/>
               </w:rPr>
-              <w:t>Invalid TierID 'T00001' (extra zero; no such tier exists)</w:t>
+              <w:t xml:space="preserve">Invalid </w:t>
+            </w:r>
+            <w:proofErr w:type="spellStart"/>
+            <w:r>
+              <w:rPr>
+                <w:sz w:val="18"/>
+              </w:rPr>
+              <w:t>TierID</w:t>
+            </w:r>
+            <w:proofErr w:type="spellEnd"/>
+            <w:r>
+              <w:rPr>
+                <w:sz w:val="18"/>
+              </w:rPr>
+              <w:t xml:space="preserve"> 'T00001' (extra zero; no such tier exists)</w:t>
             </w:r>
           </w:p>
         </w:tc>
@@ -2203,7 +2225,35 @@
               <w:rPr>
                 <w:sz w:val="18"/>
               </w:rPr>
-              <w:t>Gender stored as 'Male'/'Female' but schema requires CHAR(1)</w:t>
+              <w:t>Gender stored as 'Male'/'Female</w:t>
+            </w:r>
+            <w:proofErr w:type="gramStart"/>
+            <w:r>
+              <w:rPr>
+                <w:sz w:val="18"/>
+              </w:rPr>
+              <w:t>'</w:t>
+            </w:r>
+            <w:proofErr w:type="gramEnd"/>
+            <w:r>
+              <w:rPr>
+                <w:sz w:val="18"/>
+              </w:rPr>
+              <w:t xml:space="preserve"> but schema requires </w:t>
+            </w:r>
+            <w:proofErr w:type="gramStart"/>
+            <w:r>
+              <w:rPr>
+                <w:sz w:val="18"/>
+              </w:rPr>
+              <w:t>CHAR(</w:t>
+            </w:r>
+            <w:proofErr w:type="gramEnd"/>
+            <w:r>
+              <w:rPr>
+                <w:sz w:val="18"/>
+              </w:rPr>
+              <w:t>1)</w:t>
             </w:r>
           </w:p>
         </w:tc>
@@ -2216,7 +2266,21 @@
               <w:rPr>
                 <w:sz w:val="18"/>
               </w:rPr>
-              <w:t>Mapped to 'M'/'F'</w:t>
+              <w:t>Mapped to 'M</w:t>
+            </w:r>
+            <w:proofErr w:type="gramStart"/>
+            <w:r>
+              <w:rPr>
+                <w:sz w:val="18"/>
+              </w:rPr>
+              <w:t>'/'</w:t>
+            </w:r>
+            <w:proofErr w:type="gramEnd"/>
+            <w:r>
+              <w:rPr>
+                <w:sz w:val="18"/>
+              </w:rPr>
+              <w:t>F'</w:t>
             </w:r>
           </w:p>
         </w:tc>
@@ -2253,11 +2317,19 @@
             <w:tcW w:w="2700" w:type="dxa"/>
           </w:tcPr>
           <w:p>
+            <w:proofErr w:type="spellStart"/>
             <w:r>
               <w:rPr>
                 <w:sz w:val="18"/>
               </w:rPr>
-              <w:t>DateOfBirth stored as datetime '1990-05-08 00:00:00' instead of a date</w:t>
+              <w:t>DateOfBirth</w:t>
+            </w:r>
+            <w:proofErr w:type="spellEnd"/>
+            <w:r>
+              <w:rPr>
+                <w:sz w:val="18"/>
+              </w:rPr>
+              <w:t xml:space="preserve"> stored as datetime '1990-05-08 00:00:00' instead of a date</w:t>
             </w:r>
           </w:p>
         </w:tc>
@@ -2311,7 +2383,21 @@
               <w:rPr>
                 <w:sz w:val="18"/>
               </w:rPr>
-              <w:t>Two contact fields (ContactNo, Email) but Member table has a single Contact column</w:t>
+              <w:t>Two contact fields (</w:t>
+            </w:r>
+            <w:proofErr w:type="spellStart"/>
+            <w:r>
+              <w:rPr>
+                <w:sz w:val="18"/>
+              </w:rPr>
+              <w:t>ContactNo</w:t>
+            </w:r>
+            <w:proofErr w:type="spellEnd"/>
+            <w:r>
+              <w:rPr>
+                <w:sz w:val="18"/>
+              </w:rPr>
+              <w:t>, Email) but Member table has a single Contact column</w:t>
             </w:r>
           </w:p>
         </w:tc>
@@ -2443,7 +2529,35 @@
               <w:rPr>
                 <w:sz w:val="18"/>
               </w:rPr>
-              <w:t>Gender stored as 'Male'/'Female' but schema requires CHAR(1)</w:t>
+              <w:t>Gender stored as 'Male'/'Female</w:t>
+            </w:r>
+            <w:proofErr w:type="gramStart"/>
+            <w:r>
+              <w:rPr>
+                <w:sz w:val="18"/>
+              </w:rPr>
+              <w:t>'</w:t>
+            </w:r>
+            <w:proofErr w:type="gramEnd"/>
+            <w:r>
+              <w:rPr>
+                <w:sz w:val="18"/>
+              </w:rPr>
+              <w:t xml:space="preserve"> but schema requires </w:t>
+            </w:r>
+            <w:proofErr w:type="gramStart"/>
+            <w:r>
+              <w:rPr>
+                <w:sz w:val="18"/>
+              </w:rPr>
+              <w:t>CHAR(</w:t>
+            </w:r>
+            <w:proofErr w:type="gramEnd"/>
+            <w:r>
+              <w:rPr>
+                <w:sz w:val="18"/>
+              </w:rPr>
+              <w:t>1)</w:t>
             </w:r>
           </w:p>
         </w:tc>
@@ -2456,7 +2570,21 @@
               <w:rPr>
                 <w:sz w:val="18"/>
               </w:rPr>
-              <w:t>Mapped to 'M'/'F'</w:t>
+              <w:t>Mapped to 'M</w:t>
+            </w:r>
+            <w:proofErr w:type="gramStart"/>
+            <w:r>
+              <w:rPr>
+                <w:sz w:val="18"/>
+              </w:rPr>
+              <w:t>'/'</w:t>
+            </w:r>
+            <w:proofErr w:type="gramEnd"/>
+            <w:r>
+              <w:rPr>
+                <w:sz w:val="18"/>
+              </w:rPr>
+              <w:t>F'</w:t>
             </w:r>
           </w:p>
         </w:tc>
@@ -2532,8 +2660,16 @@
               <w:rPr>
                 <w:sz w:val="18"/>
               </w:rPr>
-              <w:t>data.xlsx / BookCopies</w:t>
-            </w:r>
+              <w:t xml:space="preserve">data.xlsx / </w:t>
+            </w:r>
+            <w:proofErr w:type="spellStart"/>
+            <w:r>
+              <w:rPr>
+                <w:sz w:val="18"/>
+              </w:rPr>
+              <w:t>BookCopies</w:t>
+            </w:r>
+            <w:proofErr w:type="spellEnd"/>
           </w:p>
         </w:tc>
         <w:tc>
@@ -2558,7 +2694,21 @@
               <w:rPr>
                 <w:sz w:val="18"/>
               </w:rPr>
-              <w:t>Status misspelled as 'Availble'</w:t>
+              <w:t>Status misspelled as '</w:t>
+            </w:r>
+            <w:proofErr w:type="spellStart"/>
+            <w:r>
+              <w:rPr>
+                <w:sz w:val="18"/>
+              </w:rPr>
+              <w:t>Availble</w:t>
+            </w:r>
+            <w:proofErr w:type="spellEnd"/>
+            <w:r>
+              <w:rPr>
+                <w:sz w:val="18"/>
+              </w:rPr>
+              <w:t>'</w:t>
             </w:r>
           </w:p>
         </w:tc>
@@ -2586,8 +2736,16 @@
               <w:rPr>
                 <w:sz w:val="18"/>
               </w:rPr>
-              <w:t>data.xlsx / BookCopies</w:t>
-            </w:r>
+              <w:t xml:space="preserve">data.xlsx / </w:t>
+            </w:r>
+            <w:proofErr w:type="spellStart"/>
+            <w:r>
+              <w:rPr>
+                <w:sz w:val="18"/>
+              </w:rPr>
+              <w:t>BookCopies</w:t>
+            </w:r>
+            <w:proofErr w:type="spellEnd"/>
           </w:p>
         </w:tc>
         <w:tc>
@@ -2666,7 +2824,63 @@
               <w:rPr>
                 <w:sz w:val="18"/>
               </w:rPr>
-              <w:t>Row references StaffID 'S0101' (staff run S0001-S0051) and CopySeqNo 8 (book has 3 copies); DueDate 2023-04-02 precedes LoanDatetime 2024-07-04</w:t>
+              <w:t xml:space="preserve">Row references </w:t>
+            </w:r>
+            <w:proofErr w:type="spellStart"/>
+            <w:r>
+              <w:rPr>
+                <w:sz w:val="18"/>
+              </w:rPr>
+              <w:t>StaffID</w:t>
+            </w:r>
+            <w:proofErr w:type="spellEnd"/>
+            <w:r>
+              <w:rPr>
+                <w:sz w:val="18"/>
+              </w:rPr>
+              <w:t xml:space="preserve"> 'S0101' (staff run S0001-S0051) and </w:t>
+            </w:r>
+            <w:proofErr w:type="spellStart"/>
+            <w:r>
+              <w:rPr>
+                <w:sz w:val="18"/>
+              </w:rPr>
+              <w:t>CopySeqNo</w:t>
+            </w:r>
+            <w:proofErr w:type="spellEnd"/>
+            <w:r>
+              <w:rPr>
+                <w:sz w:val="18"/>
+              </w:rPr>
+              <w:t xml:space="preserve"> 8 (book has 3 copies); </w:t>
+            </w:r>
+            <w:proofErr w:type="spellStart"/>
+            <w:r>
+              <w:rPr>
+                <w:sz w:val="18"/>
+              </w:rPr>
+              <w:t>DueDate</w:t>
+            </w:r>
+            <w:proofErr w:type="spellEnd"/>
+            <w:r>
+              <w:rPr>
+                <w:sz w:val="18"/>
+              </w:rPr>
+              <w:t xml:space="preserve"> 2023-04-02 precedes </w:t>
+            </w:r>
+            <w:proofErr w:type="spellStart"/>
+            <w:r>
+              <w:rPr>
+                <w:sz w:val="18"/>
+              </w:rPr>
+              <w:t>LoanDatetime</w:t>
+            </w:r>
+            <w:proofErr w:type="spellEnd"/>
+            <w:r>
+              <w:rPr>
+                <w:sz w:val="18"/>
+              </w:rPr>
+              <w:t xml:space="preserve"> 2024-07-04</w:t>
             </w:r>
           </w:p>
         </w:tc>
@@ -2695,7 +2909,15 @@
         <w:pStyle w:val="ListParagraph"/>
       </w:pPr>
       <w:r>
-        <w:t>Submit your SQL INSERT statements for data insertion to the OLTP tables in OLTP_insert.sql. If you apply bulk loading, submit each of the cleaned data files used during insertion as well.</w:t>
+        <w:t xml:space="preserve">Submit your SQL INSERT statements for data insertion to the OLTP tables in </w:t>
+      </w:r>
+      <w:proofErr w:type="spellStart"/>
+      <w:r>
+        <w:t>OLTP_insert.sql</w:t>
+      </w:r>
+      <w:proofErr w:type="spellEnd"/>
+      <w:r>
+        <w:t>. If you apply bulk loading, submit each of the cleaned data files used during insertion as well.</w:t>
       </w:r>
     </w:p>
     <w:p>
@@ -2850,7 +3072,6 @@
       </w:r>
     </w:p>
     <w:p/>
-    <w:p/>
     <w:p>
       <w:r>
         <w:rPr>
@@ -2861,12 +3082,104 @@
     </w:p>
     <w:p>
       <w:r>
-        <w:t>The warehouse uses a star schema: one central fact table holding the numbers we analyse, surrounded by a single layer of dimension tables holding the descriptive context. There is one fact table, FactLoan, and four dimensions: DimMember, DimStaff, DimBook and DimDate.</w:t>
+        <w:t xml:space="preserve">The warehouse uses a star schema: one central fact table holding the numbers we </w:t>
+      </w:r>
+      <w:proofErr w:type="spellStart"/>
+      <w:r>
+        <w:t>analyse</w:t>
+      </w:r>
+      <w:proofErr w:type="spellEnd"/>
+      <w:r>
+        <w:t xml:space="preserve">, surrounded by a single layer of dimension tables holding the descriptive context. There is one fact table, </w:t>
+      </w:r>
+      <w:proofErr w:type="spellStart"/>
+      <w:r>
+        <w:t>FactLoan</w:t>
+      </w:r>
+      <w:proofErr w:type="spellEnd"/>
+      <w:r>
+        <w:t xml:space="preserve">, and four dimensions: </w:t>
+      </w:r>
+      <w:proofErr w:type="spellStart"/>
+      <w:r>
+        <w:t>DimMember</w:t>
+      </w:r>
+      <w:proofErr w:type="spellEnd"/>
+      <w:r>
+        <w:t xml:space="preserve">, </w:t>
+      </w:r>
+      <w:proofErr w:type="spellStart"/>
+      <w:r>
+        <w:t>DimStaff</w:t>
+      </w:r>
+      <w:proofErr w:type="spellEnd"/>
+      <w:r>
+        <w:t xml:space="preserve">, </w:t>
+      </w:r>
+      <w:proofErr w:type="spellStart"/>
+      <w:r>
+        <w:t>DimBook</w:t>
+      </w:r>
+      <w:proofErr w:type="spellEnd"/>
+      <w:r>
+        <w:t xml:space="preserve"> and </w:t>
+      </w:r>
+      <w:proofErr w:type="spellStart"/>
+      <w:r>
+        <w:t>DimDate</w:t>
+      </w:r>
+      <w:proofErr w:type="spellEnd"/>
+      <w:r>
+        <w:t>.</w:t>
       </w:r>
     </w:p>
     <w:p>
       <w:r>
-        <w:t>We considered a snowflake schema, which is the same idea but splits dimensions further into sub-tables to remove repeated values. The only table worth splitting here is MembershipTier, which supplies tier attributes to both DimMember and DimBook. Keeping it separate would add a second join to every tier-based question and save three rows, so we denormalised its attributes into both dimensions instead, meaning we copied them in and accepted the duplication. With 301 members, 500 books and 51 staff, dimension size is not</w:t>
+        <w:t xml:space="preserve">We considered a snowflake schema, which is the same </w:t>
+      </w:r>
+      <w:r>
+        <w:t>idea,</w:t>
+      </w:r>
+      <w:r>
+        <w:t xml:space="preserve"> but </w:t>
+      </w:r>
+      <w:r>
+        <w:t xml:space="preserve">it </w:t>
+      </w:r>
+      <w:r>
+        <w:t xml:space="preserve">splits dimensions further into sub-tables to remove repeated values. The only table worth splitting here is </w:t>
+      </w:r>
+      <w:proofErr w:type="spellStart"/>
+      <w:r>
+        <w:t>MembershipTier</w:t>
+      </w:r>
+      <w:proofErr w:type="spellEnd"/>
+      <w:r>
+        <w:t xml:space="preserve">, which supplies tier attributes to both </w:t>
+      </w:r>
+      <w:proofErr w:type="spellStart"/>
+      <w:r>
+        <w:t>DimMember</w:t>
+      </w:r>
+      <w:proofErr w:type="spellEnd"/>
+      <w:r>
+        <w:t xml:space="preserve"> and </w:t>
+      </w:r>
+      <w:proofErr w:type="spellStart"/>
+      <w:r>
+        <w:t>DimBook</w:t>
+      </w:r>
+      <w:proofErr w:type="spellEnd"/>
+      <w:r>
+        <w:t xml:space="preserve">. Keeping it separate would add a second join to every tier-based question and save three rows, so we </w:t>
+      </w:r>
+      <w:proofErr w:type="spellStart"/>
+      <w:r>
+        <w:t>denormalised</w:t>
+      </w:r>
+      <w:proofErr w:type="spellEnd"/>
+      <w:r>
+        <w:t xml:space="preserve"> its attributes into both dimensions instead, meaning we copied them in and accepted the duplication. With 301 members, 500 books and 51 staff, dimension size is not</w:t>
       </w:r>
       <w:r>
         <w:t xml:space="preserve"> so much of</w:t>
@@ -2884,18 +3197,31 @@
         <w:rPr>
           <w:b/>
         </w:rPr>
-        <w:lastRenderedPageBreak/>
         <w:t>Grain</w:t>
       </w:r>
     </w:p>
     <w:p>
       <w:r>
-        <w:t>The grain of FactLoan, meaning the exact real-world event that one fact row represents, is one completed loan transaction: one physical copy of one book, borrowed by one member, issued by one staff member, and returned. Every measure in the table is true at that level, and each fact row holds one foreign key, a column pointing at another table’s primary key, per dimension.</w:t>
+        <w:lastRenderedPageBreak/>
+        <w:t xml:space="preserve">The grain of </w:t>
+      </w:r>
+      <w:proofErr w:type="spellStart"/>
+      <w:r>
+        <w:t>FactLoan</w:t>
+      </w:r>
+      <w:proofErr w:type="spellEnd"/>
+      <w:r>
+        <w:t>, meaning the exact real-world event that one fact row represents, is one completed loan transaction: one physical copy of one book, borrowed by one member, issued by one staff member, and returned. Every measure in the table is true at that level, and each fact row holds one foreign key, a column pointing at another table’s primary key, per dimension.</w:t>
       </w:r>
     </w:p>
     <w:p>
-      <w:r>
-        <w:t>FactLoan is a transaction fact table, so each row records one business event and is never updated afterwards. That suits the job here, because the analysis we need is about loans that have run their full course, from borrowing through to return.</w:t>
+      <w:proofErr w:type="spellStart"/>
+      <w:r>
+        <w:t>FactLoan</w:t>
+      </w:r>
+      <w:proofErr w:type="spellEnd"/>
+      <w:r>
+        <w:t xml:space="preserve"> is a transaction fact table, so each row records one business event and is never updated afterwards. That suits the job here, because the analysis we need is about loans that have run their full course, from borrowing through to return.</w:t>
       </w:r>
     </w:p>
     <w:p/>
@@ -2904,18 +3230,43 @@
         <w:rPr>
           <w:b/>
         </w:rPr>
-        <w:t>What the design has to support</w:t>
+        <w:t xml:space="preserve">What the design </w:t>
+      </w:r>
+      <w:proofErr w:type="gramStart"/>
+      <w:r>
+        <w:rPr>
+          <w:b/>
+        </w:rPr>
+        <w:t>has to</w:t>
+      </w:r>
+      <w:proofErr w:type="gramEnd"/>
+      <w:r>
+        <w:rPr>
+          <w:b/>
+        </w:rPr>
+        <w:t xml:space="preserve"> support</w:t>
       </w:r>
     </w:p>
     <w:p>
       <w:r>
-        <w:t xml:space="preserve">The warehouse has to answer questions about loan duration and borrowing activity, and on top of that transaction volume, book popularity and seasonal trends. </w:t>
-      </w:r>
-      <w:r>
-        <w:t>These are used in our analysis</w:t>
-      </w:r>
-      <w:r>
-        <w:t>Each of those lands on a specific part of the design:</w:t>
+        <w:t xml:space="preserve">The warehouse </w:t>
+      </w:r>
+      <w:proofErr w:type="gramStart"/>
+      <w:r>
+        <w:t>has to</w:t>
+      </w:r>
+      <w:proofErr w:type="gramEnd"/>
+      <w:r>
+        <w:t xml:space="preserve"> answer questions about loan duration and borrowing activity, and on top of that transaction volume, book popularity and seasonal trends. </w:t>
+      </w:r>
+      <w:r>
+        <w:t xml:space="preserve">These are used in our </w:t>
+      </w:r>
+      <w:r>
+        <w:t>analysis. Each</w:t>
+      </w:r>
+      <w:r>
+        <w:t xml:space="preserve"> of those lands on a specific part of the design:</w:t>
       </w:r>
     </w:p>
     <w:p/>
@@ -3007,12 +3358,14 @@
             <w:tcW w:w="3250" w:type="dxa"/>
           </w:tcPr>
           <w:p>
+            <w:proofErr w:type="spellStart"/>
             <w:r>
               <w:rPr>
                 <w:sz w:val="20"/>
               </w:rPr>
               <w:t>LoanDurationDays</w:t>
             </w:r>
+            <w:proofErr w:type="spellEnd"/>
           </w:p>
         </w:tc>
         <w:tc>
@@ -3052,8 +3405,30 @@
               <w:rPr>
                 <w:sz w:val="20"/>
               </w:rPr>
-              <w:t>Grain of FactLoan, with DimMember</w:t>
-            </w:r>
+              <w:t xml:space="preserve">Grain of </w:t>
+            </w:r>
+            <w:proofErr w:type="spellStart"/>
+            <w:r>
+              <w:rPr>
+                <w:sz w:val="20"/>
+              </w:rPr>
+              <w:t>FactLoan</w:t>
+            </w:r>
+            <w:proofErr w:type="spellEnd"/>
+            <w:r>
+              <w:rPr>
+                <w:sz w:val="20"/>
+              </w:rPr>
+              <w:t xml:space="preserve">, with </w:t>
+            </w:r>
+            <w:proofErr w:type="spellStart"/>
+            <w:r>
+              <w:rPr>
+                <w:sz w:val="20"/>
+              </w:rPr>
+              <w:t>DimMember</w:t>
+            </w:r>
+            <w:proofErr w:type="spellEnd"/>
           </w:p>
         </w:tc>
         <w:tc>
@@ -3093,7 +3468,21 @@
               <w:rPr>
                 <w:sz w:val="20"/>
               </w:rPr>
-              <w:t>Row count of FactLoan, sliced by any dimension</w:t>
+              <w:t xml:space="preserve">Row count of </w:t>
+            </w:r>
+            <w:proofErr w:type="spellStart"/>
+            <w:r>
+              <w:rPr>
+                <w:sz w:val="20"/>
+              </w:rPr>
+              <w:t>FactLoan</w:t>
+            </w:r>
+            <w:proofErr w:type="spellEnd"/>
+            <w:r>
+              <w:rPr>
+                <w:sz w:val="20"/>
+              </w:rPr>
+              <w:t>, sliced by any dimension</w:t>
             </w:r>
           </w:p>
         </w:tc>
@@ -3130,11 +3519,19 @@
             <w:tcW w:w="3250" w:type="dxa"/>
           </w:tcPr>
           <w:p>
+            <w:proofErr w:type="spellStart"/>
             <w:r>
               <w:rPr>
                 <w:sz w:val="20"/>
               </w:rPr>
-              <w:t>DimBook (Genre, Title, Author)</w:t>
+              <w:t>DimBook</w:t>
+            </w:r>
+            <w:proofErr w:type="spellEnd"/>
+            <w:r>
+              <w:rPr>
+                <w:sz w:val="20"/>
+              </w:rPr>
+              <w:t xml:space="preserve"> (Genre, Title, Author)</w:t>
             </w:r>
           </w:p>
         </w:tc>
@@ -3171,11 +3568,47 @@
             <w:tcW w:w="3250" w:type="dxa"/>
           </w:tcPr>
           <w:p>
+            <w:proofErr w:type="spellStart"/>
             <w:r>
               <w:rPr>
                 <w:sz w:val="20"/>
               </w:rPr>
-              <w:t>DimDate (Month, Quarter, DayOfWeek, IsWeekend)</w:t>
+              <w:t>DimDate</w:t>
+            </w:r>
+            <w:proofErr w:type="spellEnd"/>
+            <w:r>
+              <w:rPr>
+                <w:sz w:val="20"/>
+              </w:rPr>
+              <w:t xml:space="preserve"> (Month, Quarter, </w:t>
+            </w:r>
+            <w:proofErr w:type="spellStart"/>
+            <w:r>
+              <w:rPr>
+                <w:sz w:val="20"/>
+              </w:rPr>
+              <w:t>DayOfWeek</w:t>
+            </w:r>
+            <w:proofErr w:type="spellEnd"/>
+            <w:r>
+              <w:rPr>
+                <w:sz w:val="20"/>
+              </w:rPr>
+              <w:t xml:space="preserve">, </w:t>
+            </w:r>
+            <w:proofErr w:type="spellStart"/>
+            <w:r>
+              <w:rPr>
+                <w:sz w:val="20"/>
+              </w:rPr>
+              <w:t>IsWeekend</w:t>
+            </w:r>
+            <w:proofErr w:type="spellEnd"/>
+            <w:r>
+              <w:rPr>
+                <w:sz w:val="20"/>
+              </w:rPr>
+              <w:t>)</w:t>
             </w:r>
           </w:p>
         </w:tc>
@@ -3212,12 +3645,28 @@
             <w:tcW w:w="3250" w:type="dxa"/>
           </w:tcPr>
           <w:p>
+            <w:proofErr w:type="spellStart"/>
             <w:r>
               <w:rPr>
                 <w:sz w:val="20"/>
               </w:rPr>
-              <w:t>DaysBeforeDue, IsLate</w:t>
-            </w:r>
+              <w:t>DaysBeforeDue</w:t>
+            </w:r>
+            <w:proofErr w:type="spellEnd"/>
+            <w:r>
+              <w:rPr>
+                <w:sz w:val="20"/>
+              </w:rPr>
+              <w:t xml:space="preserve">, </w:t>
+            </w:r>
+            <w:proofErr w:type="spellStart"/>
+            <w:r>
+              <w:rPr>
+                <w:sz w:val="20"/>
+              </w:rPr>
+              <w:t>IsLate</w:t>
+            </w:r>
+            <w:proofErr w:type="spellEnd"/>
           </w:p>
         </w:tc>
         <w:tc>
@@ -3238,7 +3687,21 @@
     <w:p/>
     <w:p>
       <w:r>
-        <w:t>Every analysis reads FactLoan plus at most two dimensions, with no chained dimension joins. That is what we wanted the star form for.</w:t>
+        <w:t xml:space="preserve">Every analysis reads </w:t>
+      </w:r>
+      <w:proofErr w:type="spellStart"/>
+      <w:r>
+        <w:t>FactLoan</w:t>
+      </w:r>
+      <w:proofErr w:type="spellEnd"/>
+      <w:r>
+        <w:t xml:space="preserve"> </w:t>
+      </w:r>
+      <w:r>
+        <w:t>and</w:t>
+      </w:r>
+      <w:r>
+        <w:t xml:space="preserve"> at most two dimensions, with no chained dimension joins.</w:t>
       </w:r>
     </w:p>
     <w:p/>
@@ -3337,12 +3800,28 @@
             <w:tcW w:w="3250" w:type="dxa"/>
           </w:tcPr>
           <w:p>
+            <w:proofErr w:type="spellStart"/>
             <w:r>
               <w:rPr>
                 <w:sz w:val="20"/>
               </w:rPr>
-              <w:t>DimMember, FactLoan</w:t>
-            </w:r>
+              <w:t>DimMember</w:t>
+            </w:r>
+            <w:proofErr w:type="spellEnd"/>
+            <w:r>
+              <w:rPr>
+                <w:sz w:val="20"/>
+              </w:rPr>
+              <w:t xml:space="preserve">, </w:t>
+            </w:r>
+            <w:proofErr w:type="spellStart"/>
+            <w:r>
+              <w:rPr>
+                <w:sz w:val="20"/>
+              </w:rPr>
+              <w:t>FactLoan</w:t>
+            </w:r>
+            <w:proofErr w:type="spellEnd"/>
           </w:p>
         </w:tc>
       </w:tr>
@@ -3378,12 +3857,28 @@
             <w:tcW w:w="3250" w:type="dxa"/>
           </w:tcPr>
           <w:p>
+            <w:proofErr w:type="spellStart"/>
             <w:r>
               <w:rPr>
                 <w:sz w:val="20"/>
               </w:rPr>
-              <w:t>MemberKey, BorrowDateKey</w:t>
-            </w:r>
+              <w:t>MemberKey</w:t>
+            </w:r>
+            <w:proofErr w:type="spellEnd"/>
+            <w:r>
+              <w:rPr>
+                <w:sz w:val="20"/>
+              </w:rPr>
+              <w:t xml:space="preserve">, </w:t>
+            </w:r>
+            <w:proofErr w:type="spellStart"/>
+            <w:r>
+              <w:rPr>
+                <w:sz w:val="20"/>
+              </w:rPr>
+              <w:t>BorrowDateKey</w:t>
+            </w:r>
+            <w:proofErr w:type="spellEnd"/>
           </w:p>
         </w:tc>
       </w:tr>
@@ -3419,12 +3914,28 @@
             <w:tcW w:w="3250" w:type="dxa"/>
           </w:tcPr>
           <w:p>
+            <w:proofErr w:type="spellStart"/>
             <w:r>
               <w:rPr>
                 <w:sz w:val="20"/>
               </w:rPr>
-              <w:t>MemberID, BookID</w:t>
-            </w:r>
+              <w:t>MemberID</w:t>
+            </w:r>
+            <w:proofErr w:type="spellEnd"/>
+            <w:r>
+              <w:rPr>
+                <w:sz w:val="20"/>
+              </w:rPr>
+              <w:t xml:space="preserve">, </w:t>
+            </w:r>
+            <w:proofErr w:type="spellStart"/>
+            <w:r>
+              <w:rPr>
+                <w:sz w:val="20"/>
+              </w:rPr>
+              <w:t>BookID</w:t>
+            </w:r>
+            <w:proofErr w:type="spellEnd"/>
           </w:p>
         </w:tc>
       </w:tr>
@@ -3460,12 +3971,28 @@
             <w:tcW w:w="3250" w:type="dxa"/>
           </w:tcPr>
           <w:p>
+            <w:proofErr w:type="spellStart"/>
             <w:r>
               <w:rPr>
                 <w:sz w:val="20"/>
               </w:rPr>
-              <w:t>LoanDurationDays, DaysBeforeDue</w:t>
-            </w:r>
+              <w:t>LoanDurationDays</w:t>
+            </w:r>
+            <w:proofErr w:type="spellEnd"/>
+            <w:r>
+              <w:rPr>
+                <w:sz w:val="20"/>
+              </w:rPr>
+              <w:t xml:space="preserve">, </w:t>
+            </w:r>
+            <w:proofErr w:type="spellStart"/>
+            <w:r>
+              <w:rPr>
+                <w:sz w:val="20"/>
+              </w:rPr>
+              <w:t>DaysBeforeDue</w:t>
+            </w:r>
+            <w:proofErr w:type="spellEnd"/>
           </w:p>
         </w:tc>
       </w:tr>
@@ -3492,7 +4019,21 @@
               <w:rPr>
                 <w:sz w:val="20"/>
               </w:rPr>
-              <w:t>A boolean flag where 1 means true</w:t>
+              <w:t xml:space="preserve">A </w:t>
+            </w:r>
+            <w:proofErr w:type="spellStart"/>
+            <w:r>
+              <w:rPr>
+                <w:sz w:val="20"/>
+              </w:rPr>
+              <w:t>boolean</w:t>
+            </w:r>
+            <w:proofErr w:type="spellEnd"/>
+            <w:r>
+              <w:rPr>
+                <w:sz w:val="20"/>
+              </w:rPr>
+              <w:t xml:space="preserve"> flag where 1 means true</w:t>
             </w:r>
           </w:p>
         </w:tc>
@@ -3501,12 +4042,28 @@
             <w:tcW w:w="3250" w:type="dxa"/>
           </w:tcPr>
           <w:p>
+            <w:proofErr w:type="spellStart"/>
             <w:r>
               <w:rPr>
                 <w:sz w:val="20"/>
               </w:rPr>
-              <w:t>IsLate, IsWeekend</w:t>
-            </w:r>
+              <w:t>IsLate</w:t>
+            </w:r>
+            <w:proofErr w:type="spellEnd"/>
+            <w:r>
+              <w:rPr>
+                <w:sz w:val="20"/>
+              </w:rPr>
+              <w:t xml:space="preserve">, </w:t>
+            </w:r>
+            <w:proofErr w:type="spellStart"/>
+            <w:r>
+              <w:rPr>
+                <w:sz w:val="20"/>
+              </w:rPr>
+              <w:t>IsWeekend</w:t>
+            </w:r>
+            <w:proofErr w:type="spellEnd"/>
           </w:p>
         </w:tc>
       </w:tr>
@@ -3542,12 +4099,28 @@
             <w:tcW w:w="3250" w:type="dxa"/>
           </w:tcPr>
           <w:p>
+            <w:proofErr w:type="spellStart"/>
             <w:r>
               <w:rPr>
                 <w:sz w:val="20"/>
               </w:rPr>
-              <w:t>MinTierName, MinTierLevel</w:t>
-            </w:r>
+              <w:t>MinTierName</w:t>
+            </w:r>
+            <w:proofErr w:type="spellEnd"/>
+            <w:r>
+              <w:rPr>
+                <w:sz w:val="20"/>
+              </w:rPr>
+              <w:t xml:space="preserve">, </w:t>
+            </w:r>
+            <w:proofErr w:type="spellStart"/>
+            <w:r>
+              <w:rPr>
+                <w:sz w:val="20"/>
+              </w:rPr>
+              <w:t>MinTierLevel</w:t>
+            </w:r>
+            <w:proofErr w:type="spellEnd"/>
           </w:p>
         </w:tc>
       </w:tr>
@@ -3583,17 +4156,32 @@
             <w:tcW w:w="3250" w:type="dxa"/>
           </w:tcPr>
           <w:p>
+            <w:proofErr w:type="spellStart"/>
             <w:r>
               <w:rPr>
                 <w:sz w:val="20"/>
               </w:rPr>
-              <w:t>EmploymentType, RegistrationDate</w:t>
-            </w:r>
+              <w:t>EmploymentType</w:t>
+            </w:r>
+            <w:proofErr w:type="spellEnd"/>
+            <w:r>
+              <w:rPr>
+                <w:sz w:val="20"/>
+              </w:rPr>
+              <w:t xml:space="preserve">, </w:t>
+            </w:r>
+            <w:proofErr w:type="spellStart"/>
+            <w:r>
+              <w:rPr>
+                <w:sz w:val="20"/>
+              </w:rPr>
+              <w:t>RegistrationDate</w:t>
+            </w:r>
+            <w:proofErr w:type="spellEnd"/>
           </w:p>
         </w:tc>
       </w:tr>
     </w:tbl>
-    <w:p/>
     <w:p/>
     <w:p>
       <w:r>
@@ -3605,23 +4193,182 @@
     </w:p>
     <w:p>
       <w:r>
-        <w:t>All five tables, including DimDate and FactLoan, use an AUTO_INCREMENT surrogate key as the primary key. A surrogate key is a system-generated identifier with no business meaning, used only inside the warehouse. Each dimension also keeps its natural key from the OLTP system (MemberID, StaffID, BookID) under a unique constraint, so any warehouse row can be traced back to its source record.</w:t>
+        <w:t xml:space="preserve">All five tables, including </w:t>
+      </w:r>
+      <w:proofErr w:type="spellStart"/>
+      <w:r>
+        <w:t>DimDate</w:t>
+      </w:r>
+      <w:proofErr w:type="spellEnd"/>
+      <w:r>
+        <w:t xml:space="preserve"> and </w:t>
+      </w:r>
+      <w:proofErr w:type="spellStart"/>
+      <w:r>
+        <w:t>FactLoan</w:t>
+      </w:r>
+      <w:proofErr w:type="spellEnd"/>
+      <w:r>
+        <w:t>, use an AUTO_INCREMENT surrogate key as the primary key. A surrogate key is a system-generated identifier with no business meaning, used only inside the warehouse. Each dimension also keeps its natural key from the OLTP system (</w:t>
+      </w:r>
+      <w:proofErr w:type="spellStart"/>
+      <w:r>
+        <w:t>MemberID</w:t>
+      </w:r>
+      <w:proofErr w:type="spellEnd"/>
+      <w:r>
+        <w:t xml:space="preserve">, </w:t>
+      </w:r>
+      <w:proofErr w:type="spellStart"/>
+      <w:r>
+        <w:t>StaffID</w:t>
+      </w:r>
+      <w:proofErr w:type="spellEnd"/>
+      <w:r>
+        <w:t xml:space="preserve">, </w:t>
+      </w:r>
+      <w:proofErr w:type="spellStart"/>
+      <w:r>
+        <w:t>BookID</w:t>
+      </w:r>
+      <w:proofErr w:type="spellEnd"/>
+      <w:r>
+        <w:t>) under a unique constraint, so any warehouse row can be traced back to its source record.</w:t>
       </w:r>
     </w:p>
     <w:p>
-      <w:r>
-        <w:lastRenderedPageBreak/>
-        <w:t>DimMember carries the member’s tier attributes (TierName, TierLevel, BorrowLimit) and DimBook carries the minimum tier needed to borrow the title (MinTierName, MinTierLevel). Both come from MembershipTier, denormalised as described above.</w:t>
+      <w:proofErr w:type="spellStart"/>
+      <w:r>
+        <w:t>DimMember</w:t>
+      </w:r>
+      <w:proofErr w:type="spellEnd"/>
+      <w:r>
+        <w:t xml:space="preserve"> carries the member’s tier attributes (</w:t>
+      </w:r>
+      <w:proofErr w:type="spellStart"/>
+      <w:r>
+        <w:t>TierName</w:t>
+      </w:r>
+      <w:proofErr w:type="spellEnd"/>
+      <w:r>
+        <w:t xml:space="preserve">, </w:t>
+      </w:r>
+      <w:proofErr w:type="spellStart"/>
+      <w:r>
+        <w:t>TierLevel</w:t>
+      </w:r>
+      <w:proofErr w:type="spellEnd"/>
+      <w:r>
+        <w:t xml:space="preserve">, </w:t>
+      </w:r>
+      <w:proofErr w:type="spellStart"/>
+      <w:r>
+        <w:t>BorrowLimit</w:t>
+      </w:r>
+      <w:proofErr w:type="spellEnd"/>
+      <w:r>
+        <w:t xml:space="preserve">) and </w:t>
+      </w:r>
+      <w:proofErr w:type="spellStart"/>
+      <w:r>
+        <w:t>DimBook</w:t>
+      </w:r>
+      <w:proofErr w:type="spellEnd"/>
+      <w:r>
+        <w:t xml:space="preserve"> carries the minimum tier needed to borrow the title (</w:t>
+      </w:r>
+      <w:proofErr w:type="spellStart"/>
+      <w:r>
+        <w:t>MinTierName</w:t>
+      </w:r>
+      <w:proofErr w:type="spellEnd"/>
+      <w:r>
+        <w:t xml:space="preserve">, </w:t>
+      </w:r>
+      <w:proofErr w:type="spellStart"/>
+      <w:r>
+        <w:t>MinTierLevel</w:t>
+      </w:r>
+      <w:proofErr w:type="spellEnd"/>
+      <w:r>
+        <w:t xml:space="preserve">). Both come from </w:t>
+      </w:r>
+      <w:proofErr w:type="spellStart"/>
+      <w:r>
+        <w:t>MembershipTier</w:t>
+      </w:r>
+      <w:proofErr w:type="spellEnd"/>
+      <w:r>
+        <w:t xml:space="preserve">, </w:t>
+      </w:r>
+      <w:proofErr w:type="spellStart"/>
+      <w:r>
+        <w:t>denormalised</w:t>
+      </w:r>
+      <w:proofErr w:type="spellEnd"/>
+      <w:r>
+        <w:t xml:space="preserve"> as described above.</w:t>
       </w:r>
     </w:p>
     <w:p>
-      <w:r>
-        <w:t>DimDate is day-level, as instructed, and holds FullDate, Day, DayOfWeek, IsWeekend, Month, MonthName, Quarter and Year. Because these are stored as columns, our queries group on them directly and never apply date functions to fact rows.</w:t>
+      <w:proofErr w:type="spellStart"/>
+      <w:r>
+        <w:lastRenderedPageBreak/>
+        <w:t>DimDate</w:t>
+      </w:r>
+      <w:proofErr w:type="spellEnd"/>
+      <w:r>
+        <w:t xml:space="preserve"> is day-level and holds </w:t>
+      </w:r>
+      <w:proofErr w:type="spellStart"/>
+      <w:r>
+        <w:t>FullDate</w:t>
+      </w:r>
+      <w:proofErr w:type="spellEnd"/>
+      <w:r>
+        <w:t xml:space="preserve">, Day, </w:t>
+      </w:r>
+      <w:proofErr w:type="spellStart"/>
+      <w:r>
+        <w:t>DayOfWeek</w:t>
+      </w:r>
+      <w:proofErr w:type="spellEnd"/>
+      <w:r>
+        <w:t xml:space="preserve">, </w:t>
+      </w:r>
+      <w:proofErr w:type="spellStart"/>
+      <w:r>
+        <w:t>IsWeekend</w:t>
+      </w:r>
+      <w:proofErr w:type="spellEnd"/>
+      <w:r>
+        <w:t xml:space="preserve">, Month, </w:t>
+      </w:r>
+      <w:proofErr w:type="spellStart"/>
+      <w:r>
+        <w:t>MonthName</w:t>
+      </w:r>
+      <w:proofErr w:type="spellEnd"/>
+      <w:r>
+        <w:t>, Quarter and Year. Because these are stored as columns, our queries group on them directly and never apply date functions to fact rows.</w:t>
       </w:r>
     </w:p>
     <w:p>
-      <w:r>
-        <w:t>CopySeqNo stays in FactLoan as a degenerate dimension, which is an identifier taken from the source system that has no descriptive attributes of its own to justify a dimension table. Combined with BookKey it identifies the physical copy, so any fact row can be traced back to its OLTP Loan record. We keep it for traceability rather than analysis; none of our analyses group by it.</w:t>
+      <w:proofErr w:type="spellStart"/>
+      <w:r>
+        <w:t>CopySeqNo</w:t>
+      </w:r>
+      <w:proofErr w:type="spellEnd"/>
+      <w:r>
+        <w:t xml:space="preserve"> stays in </w:t>
+      </w:r>
+      <w:proofErr w:type="spellStart"/>
+      <w:r>
+        <w:t>FactLoan</w:t>
+      </w:r>
+      <w:proofErr w:type="spellEnd"/>
+      <w:r>
+        <w:t xml:space="preserve"> as a degenerate dimension, which is an identifier taken from the source system that has no descriptive attributes of its own to justify a dimension table. Combined with BookKey it identifies the physical copy, so any fact row can be traced back to its OLTP Loan record. We keep it for traceability rather than analysis; none of our analyses group by it.</w:t>
       </w:r>
     </w:p>
     <w:p/>
@@ -3634,8 +4381,13 @@
       </w:r>
     </w:p>
     <w:p>
-      <w:r>
-        <w:t>FactLoan stores three measures, meaning numeric values meant to be aggregated. All three are computed once during the ETL load (Extract from OLTP, Transform, Load into the warehouse) rather than recalculated in every query.</w:t>
+      <w:proofErr w:type="spellStart"/>
+      <w:r>
+        <w:t>FactLoan</w:t>
+      </w:r>
+      <w:proofErr w:type="spellEnd"/>
+      <w:r>
+        <w:t xml:space="preserve"> stores three measures, meaning numeric values meant to be aggregated. All three are computed once during the ETL load (Extract from OLTP, Transform, Load into the warehouse) rather than recalculated in every query.</w:t>
       </w:r>
     </w:p>
     <w:p/>
@@ -3700,12 +4452,14 @@
             <w:tcW w:w="3250" w:type="dxa"/>
           </w:tcPr>
           <w:p>
+            <w:proofErr w:type="spellStart"/>
             <w:r>
               <w:rPr>
                 <w:sz w:val="20"/>
               </w:rPr>
               <w:t>LoanDurationDays</w:t>
             </w:r>
+            <w:proofErr w:type="spellEnd"/>
           </w:p>
         </w:tc>
         <w:tc>
@@ -3741,12 +4495,14 @@
             <w:tcW w:w="3250" w:type="dxa"/>
           </w:tcPr>
           <w:p>
+            <w:proofErr w:type="spellStart"/>
             <w:r>
               <w:rPr>
                 <w:sz w:val="20"/>
               </w:rPr>
               <w:t>DaysBeforeDue</w:t>
             </w:r>
+            <w:proofErr w:type="spellEnd"/>
           </w:p>
         </w:tc>
         <w:tc>
@@ -3771,7 +4527,21 @@
               <w:rPr>
                 <w:sz w:val="20"/>
               </w:rPr>
-              <w:t>Additive, but averaged rather than summed in practice</w:t>
+              <w:t xml:space="preserve">Additive, but averaged rather than </w:t>
+            </w:r>
+            <w:proofErr w:type="gramStart"/>
+            <w:r>
+              <w:rPr>
+                <w:sz w:val="20"/>
+              </w:rPr>
+              <w:t>summed</w:t>
+            </w:r>
+            <w:proofErr w:type="gramEnd"/>
+            <w:r>
+              <w:rPr>
+                <w:sz w:val="20"/>
+              </w:rPr>
+              <w:t xml:space="preserve"> in practice</w:t>
             </w:r>
           </w:p>
         </w:tc>
@@ -3782,12 +4552,14 @@
             <w:tcW w:w="3250" w:type="dxa"/>
           </w:tcPr>
           <w:p>
+            <w:proofErr w:type="spellStart"/>
             <w:r>
               <w:rPr>
                 <w:sz w:val="20"/>
               </w:rPr>
               <w:t>IsLate</w:t>
             </w:r>
+            <w:proofErr w:type="spellEnd"/>
           </w:p>
         </w:tc>
         <w:tc>
@@ -3799,7 +4571,21 @@
               <w:rPr>
                 <w:sz w:val="20"/>
               </w:rPr>
-              <w:t>BOOLEAN, stored by MySQL as TINYINT(1): 1 = late, 0 = on time. Set where the return date is after the due date</w:t>
+              <w:t xml:space="preserve">BOOLEAN, stored by MySQL as </w:t>
+            </w:r>
+            <w:proofErr w:type="gramStart"/>
+            <w:r>
+              <w:rPr>
+                <w:sz w:val="20"/>
+              </w:rPr>
+              <w:t>TINYINT(</w:t>
+            </w:r>
+            <w:proofErr w:type="gramEnd"/>
+            <w:r>
+              <w:rPr>
+                <w:sz w:val="20"/>
+              </w:rPr>
+              <w:t>1): 1 = late, 0 = on time. Set where the return date is after the due date</w:t>
             </w:r>
           </w:p>
         </w:tc>
@@ -3812,7 +4598,21 @@
               <w:rPr>
                 <w:sz w:val="20"/>
               </w:rPr>
-              <w:t>Not additive as a flag; AVG(IsLate) gives the late-return rate</w:t>
+              <w:t>Not additive as a flag; AVG(</w:t>
+            </w:r>
+            <w:proofErr w:type="spellStart"/>
+            <w:r>
+              <w:rPr>
+                <w:sz w:val="20"/>
+              </w:rPr>
+              <w:t>IsLate</w:t>
+            </w:r>
+            <w:proofErr w:type="spellEnd"/>
+            <w:r>
+              <w:rPr>
+                <w:sz w:val="20"/>
+              </w:rPr>
+              <w:t>) gives the late-return rate</w:t>
             </w:r>
           </w:p>
         </w:tc>
@@ -3820,8 +4620,45 @@
     </w:tbl>
     <w:p/>
     <w:p>
-      <w:r>
-        <w:t>IsLate duplicates the sign of DaysBeforeDue. We store it anyway so that a late-return rate is one AVG() instead of a CASE expression repeated in every query, which is how the staff and membership-tier analyses use it. Together with BorrowDateKey, these measures carry all three dates of a loan: borrow, return and due. That is why we did not need a second foreign key to DimDate, and we come back to that in the assumptions below.</w:t>
+      <w:proofErr w:type="spellStart"/>
+      <w:r>
+        <w:t>IsLate</w:t>
+      </w:r>
+      <w:proofErr w:type="spellEnd"/>
+      <w:r>
+        <w:t xml:space="preserve"> duplicates the sign of </w:t>
+      </w:r>
+      <w:proofErr w:type="spellStart"/>
+      <w:r>
+        <w:t>DaysBeforeDue</w:t>
+      </w:r>
+      <w:proofErr w:type="spellEnd"/>
+      <w:r>
+        <w:t xml:space="preserve">. We store it anyway so that a late-return rate is one </w:t>
+      </w:r>
+      <w:proofErr w:type="gramStart"/>
+      <w:r>
+        <w:t>AVG(</w:t>
+      </w:r>
+      <w:proofErr w:type="gramEnd"/>
+      <w:r>
+        <w:t xml:space="preserve">) instead of a CASE expression repeated in every query, which is how the staff and membership-tier analyses use it. Together with </w:t>
+      </w:r>
+      <w:proofErr w:type="spellStart"/>
+      <w:r>
+        <w:t>BorrowDateKey</w:t>
+      </w:r>
+      <w:proofErr w:type="spellEnd"/>
+      <w:r>
+        <w:t xml:space="preserve">, these measures carry all three dates of a loan: borrow, return and due. That is why we did not need a second foreign key to </w:t>
+      </w:r>
+      <w:proofErr w:type="spellStart"/>
+      <w:r>
+        <w:t>DimDate</w:t>
+      </w:r>
+      <w:proofErr w:type="spellEnd"/>
+      <w:r>
+        <w:t>, and we come back to that in the assumptions below.</w:t>
       </w:r>
     </w:p>
     <w:p/>
@@ -3841,12 +4678,26 @@
     <w:p/>
     <w:p>
       <w:r>
-        <w:t>1. Completed loans only.</w:t>
+        <w:t xml:space="preserve">1. </w:t>
+      </w:r>
+      <w:r>
+        <w:t>Using only c</w:t>
+      </w:r>
+      <w:r>
+        <w:t>ompleted loans.</w:t>
       </w:r>
     </w:p>
     <w:p>
       <w:r>
-        <w:t>The brief asks us to focus on loan duration and borrowing activity for books that have been borrowed and returned, so FactLoan holds 12,343 of the 12,344 OLTP loan records. The one outstanding loan has no return date, which leaves all three measures undefined, so it cannot sit at this grain. Reporting on loans still out is therefore out of scope. The structure for that would be an accumulating snapshot fact table, whose rows are updated as an event progresses, and we were not asked for it.</w:t>
+        <w:t xml:space="preserve">The brief asks us to focus on loan duration and borrowing activity for books that have been borrowed and returned, so </w:t>
+      </w:r>
+      <w:proofErr w:type="spellStart"/>
+      <w:r>
+        <w:t>FactLoan</w:t>
+      </w:r>
+      <w:proofErr w:type="spellEnd"/>
+      <w:r>
+        <w:t xml:space="preserve"> holds 12,343 of the 12,344 OLTP loan records. The one outstanding loan has no return date, which leaves all three measures undefined, so it cannot sit at this grain. Reporting on loans still out is therefore out of scope. The structure for that would be an accumulating snapshot fact table, whose rows are updated as an event progresses, and we were not asked for it.</w:t>
       </w:r>
     </w:p>
     <w:p/>
@@ -3856,8 +4707,35 @@
       </w:r>
     </w:p>
     <w:p>
-      <w:r>
-        <w:t>DimMember and DimBook hold current values only. This is SCD Type 1, where an update overwrites the old value and no history is kept. The consequence is that a member’s 2020 loans are counted against the tier they hold today, which is worth bearing in mind when reading Analysis 6, since it groups by current TierName rather than the tier held at the time of each loan. Tracking that history would need SCD Type 2, where each change adds a new dimension row with validity dates.</w:t>
+      <w:proofErr w:type="spellStart"/>
+      <w:r>
+        <w:t>DimMember</w:t>
+      </w:r>
+      <w:proofErr w:type="spellEnd"/>
+      <w:r>
+        <w:t xml:space="preserve"> and </w:t>
+      </w:r>
+      <w:proofErr w:type="spellStart"/>
+      <w:r>
+        <w:t>DimBook</w:t>
+      </w:r>
+      <w:proofErr w:type="spellEnd"/>
+      <w:r>
+        <w:t xml:space="preserve"> hold current values only. This is</w:t>
+      </w:r>
+      <w:r>
+        <w:t xml:space="preserve"> a SCD</w:t>
+      </w:r>
+      <w:r>
+        <w:t xml:space="preserve"> Type 1, where an update overwrites the old value and no history is kept. The consequence is that a member’s 2020 loans are counted against the tier they hold today, which is worth bearing in mind when reading Analysis 6, since it groups by current </w:t>
+      </w:r>
+      <w:proofErr w:type="spellStart"/>
+      <w:r>
+        <w:t>TierName</w:t>
+      </w:r>
+      <w:proofErr w:type="spellEnd"/>
+      <w:r>
+        <w:t xml:space="preserve"> rather than the tier held at the time of each loan. Tracking that history would need SCD Type 2, where each change adds a new dimension row with validity dates.</w:t>
       </w:r>
     </w:p>
     <w:p/>
@@ -3865,12 +4743,84 @@
     <w:p/>
     <w:p>
       <w:r>
-        <w:t>3. A single date role.</w:t>
+        <w:lastRenderedPageBreak/>
+        <w:t>3</w:t>
+      </w:r>
+      <w:r>
+        <w:t>. Having a singular data role</w:t>
+      </w:r>
+      <w:r>
+        <w:t xml:space="preserve"> </w:t>
       </w:r>
     </w:p>
     <w:p>
-      <w:r>
-        <w:t>FactLoan carries one foreign key to DimDate, on the borrow date. We considered a second key for the return date and rejected it as redundant: LoanDurationDays is the difference between the borrow and return dates, so the return date is recoverable as borrow date + LoanDurationDays, and the due date as borrow date + LoanDurationDays + DaysBeforeDue. One date key and two measures therefore carry all three dates without a second relationship. Every analysis we run is anchored to when a loan started, so the borrow date is the role that earns a foreign key. The trade-off we accept is that grouping returns by calendar attributes such as month or quarter would mean deriving the return date first and re-joining to DimDate, rather than joining on a stored key.</w:t>
+      <w:proofErr w:type="spellStart"/>
+      <w:r>
+        <w:t>FactLoan</w:t>
+      </w:r>
+      <w:proofErr w:type="spellEnd"/>
+      <w:r>
+        <w:t xml:space="preserve"> carries one foreign key to </w:t>
+      </w:r>
+      <w:proofErr w:type="spellStart"/>
+      <w:r>
+        <w:t>DimDate</w:t>
+      </w:r>
+      <w:proofErr w:type="spellEnd"/>
+      <w:r>
+        <w:t xml:space="preserve">, on the borrow date. We considered a second key for the return date </w:t>
+      </w:r>
+      <w:r>
+        <w:t>but</w:t>
+      </w:r>
+      <w:r>
+        <w:t xml:space="preserve"> rejected it as </w:t>
+      </w:r>
+      <w:r>
+        <w:t xml:space="preserve">it was </w:t>
+      </w:r>
+      <w:r>
+        <w:t xml:space="preserve">redundant: </w:t>
+      </w:r>
+      <w:proofErr w:type="spellStart"/>
+      <w:r>
+        <w:t>LoanDurationDays</w:t>
+      </w:r>
+      <w:proofErr w:type="spellEnd"/>
+      <w:r>
+        <w:t xml:space="preserve"> is the difference between the borrow and return dates, so the return date is recoverable as borrow date + </w:t>
+      </w:r>
+      <w:proofErr w:type="spellStart"/>
+      <w:r>
+        <w:t>LoanDurationDays</w:t>
+      </w:r>
+      <w:proofErr w:type="spellEnd"/>
+      <w:r>
+        <w:t xml:space="preserve">, and the due date as borrow date + </w:t>
+      </w:r>
+      <w:proofErr w:type="spellStart"/>
+      <w:r>
+        <w:t>LoanDurationDays</w:t>
+      </w:r>
+      <w:proofErr w:type="spellEnd"/>
+      <w:r>
+        <w:t xml:space="preserve"> + </w:t>
+      </w:r>
+      <w:proofErr w:type="spellStart"/>
+      <w:r>
+        <w:t>DaysBeforeDue</w:t>
+      </w:r>
+      <w:proofErr w:type="spellEnd"/>
+      <w:r>
+        <w:t xml:space="preserve">. One date key and two measures therefore carry all three dates without a second relationship. Every analysis we run is anchored to when a loan started, so the borrow date is the role that earns a foreign key. The trade-off we accept is that grouping returns by calendar attributes such as month or quarter would mean deriving the return date first and re-joining to </w:t>
+      </w:r>
+      <w:proofErr w:type="spellStart"/>
+      <w:r>
+        <w:t>DimDate</w:t>
+      </w:r>
+      <w:proofErr w:type="spellEnd"/>
+      <w:r>
+        <w:t>, rather than joining on a stored key.</w:t>
       </w:r>
     </w:p>
     <w:p/>
@@ -3880,8 +4830,19 @@
       </w:r>
     </w:p>
     <w:p>
-      <w:r>
-        <w:t>DimDate is pre-populated with every day from 2020-01-01 to 2026-12-31, which is 2,557 rows and covers all borrow and return dates with room to spare. We generated every day rather than only the dates that appear in loans so that a day with no activity still exists in the dimension; a time series then shows a genuine zero instead of skipping the day.</w:t>
+      <w:proofErr w:type="spellStart"/>
+      <w:r>
+        <w:t>DimDate</w:t>
+      </w:r>
+      <w:proofErr w:type="spellEnd"/>
+      <w:r>
+        <w:t xml:space="preserve"> is pre-</w:t>
+      </w:r>
+      <w:r>
+        <w:t>populated</w:t>
+      </w:r>
+      <w:r>
+        <w:t xml:space="preserve"> every day from 2020-01-01 to 2026-12-31, which is 2,557 rows and covers all borrow and return dates with room to spare. We generated every day rather than only the dates that appear in loans so that a day with no activity still exists in the dimension; a time series then shows a genuine zero instead of skipping the day.</w:t>
       </w:r>
     </w:p>
     <w:p/>
@@ -3891,6 +4852,12 @@
           <w:b/>
         </w:rPr>
         <w:t>Glossary</w:t>
+      </w:r>
+      <w:r>
+        <w:rPr>
+          <w:b/>
+        </w:rPr>
+        <w:t xml:space="preserve"> of all the terms we’ll use in this document</w:t>
       </w:r>
     </w:p>
     <w:tbl>
@@ -4236,8 +5203,16 @@
               <w:rPr>
                 <w:sz w:val="20"/>
               </w:rPr>
-              <w:t>The identifier inherited from the source system, such as MemberID</w:t>
-            </w:r>
+              <w:t xml:space="preserve">The identifier inherited from the source system, such as </w:t>
+            </w:r>
+            <w:proofErr w:type="spellStart"/>
+            <w:r>
+              <w:rPr>
+                <w:sz w:val="20"/>
+              </w:rPr>
+              <w:t>MemberID</w:t>
+            </w:r>
+            <w:proofErr w:type="spellEnd"/>
           </w:p>
         </w:tc>
       </w:tr>
@@ -4303,12 +5278,14 @@
             <w:tcW w:w="4874" w:type="dxa"/>
           </w:tcPr>
           <w:p>
+            <w:proofErr w:type="spellStart"/>
             <w:r>
               <w:rPr>
                 <w:sz w:val="20"/>
               </w:rPr>
               <w:t>Denormalisation</w:t>
             </w:r>
+            <w:proofErr w:type="spellEnd"/>
           </w:p>
         </w:tc>
         <w:tc>
@@ -4320,7 +5297,21 @@
               <w:rPr>
                 <w:sz w:val="20"/>
               </w:rPr>
-              <w:t>Deliberately copying attributes into a table to avoid a join, accepting the duplication</w:t>
+              <w:t xml:space="preserve">Deliberately copying attributes into a table to </w:t>
+            </w:r>
+            <w:proofErr w:type="gramStart"/>
+            <w:r>
+              <w:rPr>
+                <w:sz w:val="20"/>
+              </w:rPr>
+              <w:t>avoid a join</w:t>
+            </w:r>
+            <w:proofErr w:type="gramEnd"/>
+            <w:r>
+              <w:rPr>
+                <w:sz w:val="20"/>
+              </w:rPr>
+              <w:t>, accepting the duplication</w:t>
             </w:r>
           </w:p>
         </w:tc>
@@ -4363,7 +5354,6 @@
               <w:rPr>
                 <w:sz w:val="20"/>
               </w:rPr>
-              <w:lastRenderedPageBreak/>
               <w:t>SCD Type 1 / Type 2</w:t>
             </w:r>
           </w:p>
@@ -4420,6 +5410,7 @@
               <w:rPr>
                 <w:sz w:val="20"/>
               </w:rPr>
+              <w:lastRenderedPageBreak/>
               <w:t>Accumulating snapshot</w:t>
             </w:r>
           </w:p>
@@ -4472,11 +5463,19 @@
             <w:tcW w:w="4874" w:type="dxa"/>
           </w:tcPr>
           <w:p>
+            <w:proofErr w:type="gramStart"/>
             <w:r>
               <w:rPr>
                 <w:sz w:val="20"/>
               </w:rPr>
-              <w:t>TINYINT(1)</w:t>
+              <w:t>TINYINT(</w:t>
+            </w:r>
+            <w:proofErr w:type="gramEnd"/>
+            <w:r>
+              <w:rPr>
+                <w:sz w:val="20"/>
+              </w:rPr>
+              <w:t>1)</w:t>
             </w:r>
           </w:p>
         </w:tc>
@@ -4511,13 +5510,45 @@
       </w:pPr>
       <w:r>
         <w:lastRenderedPageBreak/>
-        <w:t xml:space="preserve">Submit your CREATE table statements for DW table creations in DW_create.sql. Use appropriate SQL statements to extract and load data from OLTP tables to the </w:t>
-      </w:r>
-      <w:r>
-        <w:t>DW and</w:t>
-      </w:r>
-      <w:r>
-        <w:t xml:space="preserve"> submit all your queries in DW_insert.sql.</w:t>
+        <w:t xml:space="preserve">Submit your </w:t>
+      </w:r>
+      <w:proofErr w:type="gramStart"/>
+      <w:r>
+        <w:t>CREATE table</w:t>
+      </w:r>
+      <w:proofErr w:type="gramEnd"/>
+      <w:r>
+        <w:t xml:space="preserve"> statements for DW table creations in </w:t>
+      </w:r>
+      <w:proofErr w:type="spellStart"/>
+      <w:r>
+        <w:t>DW_create.sql</w:t>
+      </w:r>
+      <w:proofErr w:type="spellEnd"/>
+      <w:r>
+        <w:t xml:space="preserve">. Use appropriate SQL statements to extract and load data from OLTP tables to </w:t>
+      </w:r>
+      <w:proofErr w:type="gramStart"/>
+      <w:r>
+        <w:t xml:space="preserve">the </w:t>
+      </w:r>
+      <w:r>
+        <w:t>DW</w:t>
+      </w:r>
+      <w:proofErr w:type="gramEnd"/>
+      <w:r>
+        <w:t xml:space="preserve"> and</w:t>
+      </w:r>
+      <w:r>
+        <w:t xml:space="preserve"> submit all your queries in </w:t>
+      </w:r>
+      <w:proofErr w:type="spellStart"/>
+      <w:r>
+        <w:t>DW_insert.sql</w:t>
+      </w:r>
+      <w:proofErr w:type="spellEnd"/>
+      <w:r>
+        <w:t>.</w:t>
       </w:r>
     </w:p>
     <w:bookmarkEnd w:id="1"/>
@@ -4655,14 +5686,32 @@
         </w:rPr>
       </w:pPr>
       <w:r>
+        <w:rPr>
+          <w:b/>
+          <w:bCs/>
+        </w:rPr>
         <w:t>How we checked the load was successful</w:t>
+      </w:r>
+      <w:r>
+        <w:rPr>
+          <w:b/>
+          <w:bCs/>
+        </w:rPr>
+        <w:t>:</w:t>
       </w:r>
     </w:p>
     <w:bookmarkEnd w:id="0"/>
-    <w:p/>
     <w:p>
       <w:r>
-        <w:t>We ran four checks, all of them in DW_verify.sql, labelled C1 to C4 in that file. Each one compares something in the warehouse against the OLTP database it was loaded from, so anything that went wrong during the load would show up as a pair of numbers that fail to agree.</w:t>
+        <w:t xml:space="preserve">We ran four checks, all of them in </w:t>
+      </w:r>
+      <w:proofErr w:type="spellStart"/>
+      <w:r>
+        <w:t>DW_verify.sql</w:t>
+      </w:r>
+      <w:proofErr w:type="spellEnd"/>
+      <w:r>
+        <w:t>, labelled C1 to C4 in that file. Each one compares something in the warehouse against the OLTP database it was loaded from, so anything that went wrong during the load would show up as a pair of numbers that fail to agree.</w:t>
       </w:r>
     </w:p>
     <w:p/>
@@ -4673,12 +5722,45 @@
         </w:rPr>
         <w:t xml:space="preserve">Row counts (C1). </w:t>
       </w:r>
-      <w:r>
-        <w:t xml:space="preserve">FactLoan contains 12,343 rows, which is exactly the number of Loan records in the OLTP database that have a return date. The dimensions match their source tables too: DimMember 301 against Member 301, DimBook 500 against Book 500, and DimStaff 51 against </w:t>
-      </w:r>
-      <w:r>
-        <w:lastRenderedPageBreak/>
-        <w:t>Staff 51. DimDate holds 2,557 rows, one per day. Counting both sides and getting the same answer tells us that nothing was dropped on the way in and nothing was written twice.</w:t>
+      <w:proofErr w:type="spellStart"/>
+      <w:r>
+        <w:t>FactLoan</w:t>
+      </w:r>
+      <w:proofErr w:type="spellEnd"/>
+      <w:r>
+        <w:t xml:space="preserve"> contains 12,343 rows, which is exactly the number of Loan records in the OLTP database that have a return date. The dimensions match their source tables too: </w:t>
+      </w:r>
+      <w:proofErr w:type="spellStart"/>
+      <w:r>
+        <w:t>DimMember</w:t>
+      </w:r>
+      <w:proofErr w:type="spellEnd"/>
+      <w:r>
+        <w:t xml:space="preserve"> 301 against Member 301, </w:t>
+      </w:r>
+      <w:proofErr w:type="spellStart"/>
+      <w:r>
+        <w:t>DimBook</w:t>
+      </w:r>
+      <w:proofErr w:type="spellEnd"/>
+      <w:r>
+        <w:t xml:space="preserve"> 500 against Book 500, and </w:t>
+      </w:r>
+      <w:proofErr w:type="spellStart"/>
+      <w:r>
+        <w:t>DimStaff</w:t>
+      </w:r>
+      <w:proofErr w:type="spellEnd"/>
+      <w:r>
+        <w:t xml:space="preserve"> 51 against Staff 51. </w:t>
+      </w:r>
+      <w:proofErr w:type="spellStart"/>
+      <w:r>
+        <w:t>DimDate</w:t>
+      </w:r>
+      <w:proofErr w:type="spellEnd"/>
+      <w:r>
+        <w:t xml:space="preserve"> holds 2,557 rows, one per day. Counting both sides and getting the same answer tells us that nothing was dropped on the way in and nothing was written twice.</w:t>
       </w:r>
     </w:p>
     <w:p/>
@@ -4689,8 +5771,35 @@
         </w:rPr>
         <w:t xml:space="preserve">Loan duration (C2). </w:t>
       </w:r>
-      <w:r>
-        <w:t>LoanDurationDays is not copied from the OLTP database; it is worked out during the load as the return date minus the borrow date. To check that this calculation ran correctly on every row rather than most of them, we added up the durations straight from the OLTP loans, then separately added up the LoanDurationDays column in FactLoan. Both totals come to 108,801 days. Since the two agree exactly, the same calculation was applied to every fact row.</w:t>
+      <w:proofErr w:type="spellStart"/>
+      <w:r>
+        <w:t>LoanDurationDays</w:t>
+      </w:r>
+      <w:proofErr w:type="spellEnd"/>
+      <w:r>
+        <w:t xml:space="preserve"> is not copied from the OLTP database; it is worked out during the load as the return date minus the borrow date. To check that this calculation ran correctly on every row </w:t>
+      </w:r>
+      <w:r>
+        <w:t>instead of just most</w:t>
+      </w:r>
+      <w:r>
+        <w:t xml:space="preserve"> of them, we added up the durations straight from the OLTP loans, then separately added up the </w:t>
+      </w:r>
+      <w:proofErr w:type="spellStart"/>
+      <w:r>
+        <w:t>LoanDurationDays</w:t>
+      </w:r>
+      <w:proofErr w:type="spellEnd"/>
+      <w:r>
+        <w:t xml:space="preserve"> column in </w:t>
+      </w:r>
+      <w:proofErr w:type="spellStart"/>
+      <w:r>
+        <w:t>FactLoan</w:t>
+      </w:r>
+      <w:proofErr w:type="spellEnd"/>
+      <w:r>
+        <w:t>. Both totals come to 108,801 days. Since the two agree exactly, the same calculation was applied to every fact row.</w:t>
       </w:r>
     </w:p>
     <w:p/>
@@ -4702,7 +5811,23 @@
         <w:t xml:space="preserve">Orphan keys (C3). </w:t>
       </w:r>
       <w:r>
-        <w:t>Every row in FactLoan points at a member, a staff member, a book and a borrow date. A fact row that points at something which does not actually exist is called an orphan, and it normally means a key failed to match while the data was being loaded. To look for any, we joined FactLoan to each of the four dimensions using a LEFT JOIN, which keeps every fact row in the result even when the dimension has nothing matching it, and leaves the dimension columns empty wherever the match failed. Counting the rows with an empty dimension key returns 0, so every fact row is linked to a real dimension row.</w:t>
+        <w:t xml:space="preserve">Every row in </w:t>
+      </w:r>
+      <w:proofErr w:type="spellStart"/>
+      <w:r>
+        <w:t>FactLoan</w:t>
+      </w:r>
+      <w:proofErr w:type="spellEnd"/>
+      <w:r>
+        <w:t xml:space="preserve"> points at a member, a staff member, a book and a borrow date. A fact row that points at something which does not actually exist is called an orphan, and it normally means a key failed to match while the data was being loaded. To look for any, we joined </w:t>
+      </w:r>
+      <w:proofErr w:type="spellStart"/>
+      <w:r>
+        <w:t>FactLoan</w:t>
+      </w:r>
+      <w:proofErr w:type="spellEnd"/>
+      <w:r>
+        <w:t xml:space="preserve"> to each of the four dimensions using a LEFT JOIN, which keeps every fact row in the result even when the dimension has nothing matching it, and leaves the dimension columns empty wherever the match failed. Counting the rows with an empty dimension key returns 0, so every fact row is linked to a real dimension row.</w:t>
       </w:r>
     </w:p>
     <w:p/>
@@ -4713,8 +5838,13 @@
         </w:rPr>
         <w:t xml:space="preserve">Date coverage (C4). </w:t>
       </w:r>
-      <w:r>
-        <w:t>DimDate runs from 2020-01-01 to 2026-12-31, which is 2,557 days. That covers every borrow date in the data along with the later dates needed for due dates and returns, so no loan was left out because its date fell outside the calendar.</w:t>
+      <w:proofErr w:type="spellStart"/>
+      <w:r>
+        <w:t>DimDate</w:t>
+      </w:r>
+      <w:proofErr w:type="spellEnd"/>
+      <w:r>
+        <w:t xml:space="preserve"> runs from 2020-01-01 to 2026-12-31, which is 2,557 days. That covers every borrow date in the data along with the later dates needed for due dates and returns, so no loan was left out because its date fell outside the calendar.</w:t>
       </w:r>
     </w:p>
     <w:p/>
@@ -4747,7 +5877,15 @@
         </w:numPr>
       </w:pPr>
       <w:r>
-        <w:t xml:space="preserve">Describe and discuss your analysis done using the DW. </w:t>
+        <w:t xml:space="preserve">Describe and discuss your analysis done using </w:t>
+      </w:r>
+      <w:proofErr w:type="gramStart"/>
+      <w:r>
+        <w:t>the DW</w:t>
+      </w:r>
+      <w:proofErr w:type="gramEnd"/>
+      <w:r>
+        <w:t xml:space="preserve">. </w:t>
       </w:r>
       <w:r>
         <w:t>Briefly e</w:t>
@@ -4774,7 +5912,15 @@
         <w:t xml:space="preserve"> if group size is 4.</w:t>
       </w:r>
       <w:r>
-        <w:t xml:space="preserve"> Separately submit all your queries in DW_query.sql. (So do not include </w:t>
+        <w:t xml:space="preserve"> Separately submit all your queries in </w:t>
+      </w:r>
+      <w:proofErr w:type="spellStart"/>
+      <w:r>
+        <w:t>DW_query.sql</w:t>
+      </w:r>
+      <w:proofErr w:type="spellEnd"/>
+      <w:r>
+        <w:t xml:space="preserve">. (So do not include </w:t>
       </w:r>
       <w:r>
         <w:t>your</w:t>
@@ -4824,8 +5970,13 @@
         </w:rPr>
         <w:t xml:space="preserve">Objective: </w:t>
       </w:r>
-      <w:r>
-        <w:t>Analyse completed-loan volume by month and year and assess whether loan duration changes over time.</w:t>
+      <w:proofErr w:type="spellStart"/>
+      <w:r>
+        <w:t>Analyse</w:t>
+      </w:r>
+      <w:proofErr w:type="spellEnd"/>
+      <w:r>
+        <w:t xml:space="preserve"> completed-loan volume by month and year and assess whether loan duration changes over time.</w:t>
       </w:r>
     </w:p>
     <w:p>
@@ -4901,7 +6052,6 @@
         <w:rPr>
           <w:b/>
         </w:rPr>
-        <w:lastRenderedPageBreak/>
         <w:t xml:space="preserve">Objective: </w:t>
       </w:r>
       <w:r>
@@ -4919,6 +6069,7 @@
         <w:rPr>
           <w:b/>
         </w:rPr>
+        <w:lastRenderedPageBreak/>
         <w:t xml:space="preserve">Results: </w:t>
       </w:r>
       <w:r>
@@ -5097,7 +6248,15 @@
         <w:t xml:space="preserve">Insight: </w:t>
       </w:r>
       <w:r>
-        <w:t>Youth borrowing is strongly seasonal and is concentrated in the November-December school-holiday period. The library should schedule programmes, acquisitions and extra copies of popular youth titles before the fourth quarter.</w:t>
+        <w:t xml:space="preserve">Youth borrowing is strongly seasonal and is concentrated in the November-December school-holiday period. The library should schedule </w:t>
+      </w:r>
+      <w:proofErr w:type="spellStart"/>
+      <w:r>
+        <w:t>programmes</w:t>
+      </w:r>
+      <w:proofErr w:type="spellEnd"/>
+      <w:r>
+        <w:t>, acquisitions and extra copies of popular youth titles before the fourth quarter.</w:t>
       </w:r>
     </w:p>
     <w:p>
@@ -5232,11 +6391,14 @@
         <w:rPr>
           <w:b/>
         </w:rPr>
+        <w:t xml:space="preserve">Results: </w:t>
+      </w:r>
+      <w:r>
+        <w:t xml:space="preserve">Average completed loans per active member rises with tier: Basic members average 34.03 completed loans across 172 active members, Advanced members average 42.84 across 88, and Premium members average 68.00 across 40. The late-return rate decreases </w:t>
+      </w:r>
+      <w:r>
         <w:lastRenderedPageBreak/>
-        <w:t xml:space="preserve">Results: </w:t>
-      </w:r>
-      <w:r>
-        <w:t>Average completed loans per active member rises with tier: Basic members average 34.03 completed loans across 172 active members, Advanced members average 42.84 across 88, and Premium members average 68.00 across 40. The late-return rate decreases from 8.94% for Basic to 8.12% for Advanced and 7.94% for Premium, while average duration increases from 8.54 to 9.39 days.</w:t>
+        <w:t>from 8.94% for Basic to 8.12% for Advanced and 7.94% for Premium, while average duration increases from 8.54 to 9.39 days.</w:t>
       </w:r>
     </w:p>
     <w:p>
@@ -5253,7 +6415,15 @@
         <w:t xml:space="preserve">Insight: </w:t>
       </w:r>
       <w:r>
-        <w:t>Higher-tier active members complete more loans on average while also recording lower late-return rates, although this association does not prove that tier causes the behaviour. Premium engagement appears strongest, while reminders and late-return interventions would have the greatest effect when directed at Basic members.</w:t>
+        <w:t xml:space="preserve">Higher-tier active members complete more loans on average while also recording lower late-return rates, although this association does not prove that tier causes the </w:t>
+      </w:r>
+      <w:proofErr w:type="spellStart"/>
+      <w:r>
+        <w:t>behaviour</w:t>
+      </w:r>
+      <w:proofErr w:type="spellEnd"/>
+      <w:r>
+        <w:t>. Premium engagement appears strongest, while reminders and late-return interventions would have the greatest effect when directed at Basic members.</w:t>
       </w:r>
     </w:p>
     <w:p>
@@ -5317,7 +6487,15 @@
         <w:t xml:space="preserve">Results: </w:t>
       </w:r>
       <w:r>
-        <w:t>Research Journal has the highest total volume at 2,093 loans across 96 titles, or 21.8 loans per title. Young Adult has the highest demand per title at 31.2 loans across 39 titles. Children is also strong, with 1,873 loans and 28.0 loans per title. Average duration is similar across the reported genres, at 8.35-9.25 days.</w:t>
+        <w:t xml:space="preserve">Research Journal has the highest total volume at 2,093 loans across 96 titles, or 21.8 loans per title. Young Adult has the highest demand per title at 31.2 loans across 39 titles. Children </w:t>
+      </w:r>
+      <w:proofErr w:type="gramStart"/>
+      <w:r>
+        <w:t>is</w:t>
+      </w:r>
+      <w:proofErr w:type="gramEnd"/>
+      <w:r>
+        <w:t xml:space="preserve"> also strong, with 1,873 loans and 28.0 loans per title. Average duration is similar across the reported genres, at 8.35-9.25 days.</w:t>
       </w:r>
     </w:p>
     <w:p>
@@ -5397,7 +6575,13 @@
         <w:t xml:space="preserve">Results: </w:t>
       </w:r>
       <w:r>
-        <w:t>Of 12,343 completed loans, 11,298 (91.53%) were returned on time or early. Late loans were split into 189 returned 1-3 days late (1.53%), 205 returned 4-7 days late (1.66%), and 651 returned 8 or more days late (5.27%). The average loan duration rises from 7.37 days for on-time or early loans to 28.50 days for loans returned 8 or more days late.</w:t>
+        <w:t xml:space="preserve">Of 12,343 completed loans, 11,298 (91.53%) were returned on time or </w:t>
+      </w:r>
+      <w:r>
+        <w:t>earlier</w:t>
+      </w:r>
+      <w:r>
+        <w:t>. Late loans were split into 189 returned 1-3 days late (1.53%), 205 returned 4-7 days late (1.66%), and 651 returned 8 or more days late (5.27%). The average loan duration rises from 7.37 days for on-time or early loans to 28.50 days for loans returned 8 or more days late.</w:t>
       </w:r>
     </w:p>
     <w:p>
@@ -13003,6 +14187,15 @@
 </file>
 
 <file path=customXml/item1.xml><?xml version="1.0" encoding="utf-8"?>
+<?mso-contentType ?>
+<FormTemplates xmlns="http://schemas.microsoft.com/sharepoint/v3/contenttype/forms">
+  <Display>DocumentLibraryForm</Display>
+  <Edit>DocumentLibraryForm</Edit>
+  <New>DocumentLibraryForm</New>
+</FormTemplates>
+</file>
+
+<file path=customXml/item2.xml><?xml version="1.0" encoding="utf-8"?>
 <p:properties xmlns:p="http://schemas.microsoft.com/office/2006/metadata/properties" xmlns:xsi="http://www.w3.org/2001/XMLSchema-instance" xmlns:pc="http://schemas.microsoft.com/office/infopath/2007/PartnerControls">
   <documentManagement>
     <_ip_UnifiedCompliancePolicyUIAction xmlns="http://schemas.microsoft.com/sharepoint/v3" xsi:nil="true"/>
@@ -13015,16 +14208,11 @@
 </p:properties>
 </file>
 
-<file path=customXml/item2.xml><?xml version="1.0" encoding="utf-8"?>
-<?mso-contentType ?>
-<FormTemplates xmlns="http://schemas.microsoft.com/sharepoint/v3/contenttype/forms">
-  <Display>DocumentLibraryForm</Display>
-  <Edit>DocumentLibraryForm</Edit>
-  <New>DocumentLibraryForm</New>
-</FormTemplates>
+<file path=customXml/item3.xml><?xml version="1.0" encoding="utf-8"?>
+<b:Sources xmlns:b="http://schemas.openxmlformats.org/officeDocument/2006/bibliography" xmlns="http://schemas.openxmlformats.org/officeDocument/2006/bibliography" SelectedStyle="\MLA.XSL" StyleName="MLA"/>
 </file>
 
-<file path=customXml/item3.xml><?xml version="1.0" encoding="utf-8"?>
+<file path=customXml/item4.xml><?xml version="1.0" encoding="utf-8"?>
 <ct:contentTypeSchema xmlns:ct="http://schemas.microsoft.com/office/2006/metadata/contentType" xmlns:ma="http://schemas.microsoft.com/office/2006/metadata/properties/metaAttributes" ct:_="" ma:_="" ma:contentTypeName="Document" ma:contentTypeID="0x01010088CE47F754C76E4E816A66E05339225A" ma:contentTypeVersion="13" ma:contentTypeDescription="Create a new document." ma:contentTypeScope="" ma:versionID="076a7d54fdb0b635cd2e2f75f54c1b16">
   <xsd:schema xmlns:xsd="http://www.w3.org/2001/XMLSchema" xmlns:xs="http://www.w3.org/2001/XMLSchema" xmlns:p="http://schemas.microsoft.com/office/2006/metadata/properties" xmlns:ns1="http://schemas.microsoft.com/sharepoint/v3" xmlns:ns2="72f5c66d-4f9b-4523-9c59-0147434cba56" xmlns:ns3="d5671106-6e7e-4942-8aee-9bcd5dd7e66b" targetNamespace="http://schemas.microsoft.com/office/2006/metadata/properties" ma:root="true" ma:fieldsID="733d59cbe7e7cf634dfb746df9f4de01" ns1:_="" ns2:_="" ns3:_="">
     <xsd:import namespace="http://schemas.microsoft.com/sharepoint/v3"/>
@@ -13236,11 +14424,15 @@
 </ct:contentTypeSchema>
 </file>
 
-<file path=customXml/item4.xml><?xml version="1.0" encoding="utf-8"?>
-<b:Sources xmlns:b="http://schemas.openxmlformats.org/officeDocument/2006/bibliography" xmlns="http://schemas.openxmlformats.org/officeDocument/2006/bibliography" SelectedStyle="\MLA.XSL" StyleName="MLA"/>
+<file path=customXml/itemProps1.xml><?xml version="1.0" encoding="utf-8"?>
+<ds:datastoreItem xmlns:ds="http://schemas.openxmlformats.org/officeDocument/2006/customXml" ds:itemID="{C793F174-B33D-4AAE-9E3B-9A362A6F4892}">
+  <ds:schemaRefs>
+    <ds:schemaRef ds:uri="http://schemas.microsoft.com/sharepoint/v3/contenttype/forms"/>
+  </ds:schemaRefs>
+</ds:datastoreItem>
 </file>
 
-<file path=customXml/itemProps1.xml><?xml version="1.0" encoding="utf-8"?>
+<file path=customXml/itemProps2.xml><?xml version="1.0" encoding="utf-8"?>
 <ds:datastoreItem xmlns:ds="http://schemas.openxmlformats.org/officeDocument/2006/customXml" ds:itemID="{2FE68222-D1D7-4405-9D8B-445901EEA94E}">
   <ds:schemaRefs>
     <ds:schemaRef ds:uri="http://schemas.microsoft.com/office/2006/metadata/properties"/>
@@ -13252,15 +14444,15 @@
 </ds:datastoreItem>
 </file>
 
-<file path=customXml/itemProps2.xml><?xml version="1.0" encoding="utf-8"?>
-<ds:datastoreItem xmlns:ds="http://schemas.openxmlformats.org/officeDocument/2006/customXml" ds:itemID="{C793F174-B33D-4AAE-9E3B-9A362A6F4892}">
+<file path=customXml/itemProps3.xml><?xml version="1.0" encoding="utf-8"?>
+<ds:datastoreItem xmlns:ds="http://schemas.openxmlformats.org/officeDocument/2006/customXml" ds:itemID="{6A404842-743E-4BBC-99A7-70A911F17733}">
   <ds:schemaRefs>
-    <ds:schemaRef ds:uri="http://schemas.microsoft.com/sharepoint/v3/contenttype/forms"/>
+    <ds:schemaRef ds:uri="http://schemas.openxmlformats.org/officeDocument/2006/bibliography"/>
   </ds:schemaRefs>
 </ds:datastoreItem>
 </file>
 
-<file path=customXml/itemProps3.xml><?xml version="1.0" encoding="utf-8"?>
+<file path=customXml/itemProps4.xml><?xml version="1.0" encoding="utf-8"?>
 <ds:datastoreItem xmlns:ds="http://schemas.openxmlformats.org/officeDocument/2006/customXml" ds:itemID="{77819383-3D86-46CF-A5E7-D6F9C756A7E0}">
   <ds:schemaRefs>
     <ds:schemaRef ds:uri="http://schemas.microsoft.com/office/2006/metadata/contentType"/>
@@ -13278,12 +14470,4 @@
     <ds:schemaRef ds:uri="http://schemas.microsoft.com/internal/obd"/>
   </ds:schemaRefs>
 </ds:datastoreItem>
-</file>
-
-<file path=customXml/itemProps4.xml><?xml version="1.0" encoding="utf-8"?>
-<ds:datastoreItem xmlns:ds="http://schemas.openxmlformats.org/officeDocument/2006/customXml" ds:itemID="{6A404842-743E-4BBC-99A7-70A911F17733}">
-  <ds:schemaRefs>
-    <ds:schemaRef ds:uri="http://schemas.openxmlformats.org/officeDocument/2006/bibliography"/>
-  </ds:schemaRefs>
-</ds:datastoreItem>
 </file>
</xml_diff>

<commit_message>
changed like 8 words if you want to pull this okay buddy
</commit_message>
<xml_diff>
--- a/2B21-04_group_submission_revised_updated.docx
+++ b/2B21-04_group_submission_revised_updated.docx
@@ -224,15 +224,7 @@
           </w:tcPr>
           <w:p>
             <w:r>
-              <w:t xml:space="preserve">Kendrick </w:t>
-            </w:r>
-            <w:proofErr w:type="spellStart"/>
-            <w:r>
-              <w:t>Slamat</w:t>
-            </w:r>
-            <w:proofErr w:type="spellEnd"/>
-            <w:r>
-              <w:t xml:space="preserve"> </w:t>
+              <w:t xml:space="preserve">Kendrick Slamat </w:t>
             </w:r>
           </w:p>
         </w:tc>
@@ -2157,21 +2149,7 @@
               <w:rPr>
                 <w:sz w:val="18"/>
               </w:rPr>
-              <w:t xml:space="preserve">Invalid </w:t>
-            </w:r>
-            <w:proofErr w:type="spellStart"/>
-            <w:r>
-              <w:rPr>
-                <w:sz w:val="18"/>
-              </w:rPr>
-              <w:t>TierID</w:t>
-            </w:r>
-            <w:proofErr w:type="spellEnd"/>
-            <w:r>
-              <w:rPr>
-                <w:sz w:val="18"/>
-              </w:rPr>
-              <w:t xml:space="preserve"> 'T00001' (extra zero; no such tier exists)</w:t>
+              <w:t>Invalid TierID 'T00001' (extra zero; no such tier exists)</w:t>
             </w:r>
           </w:p>
         </w:tc>
@@ -2225,62 +2203,20 @@
               <w:rPr>
                 <w:sz w:val="18"/>
               </w:rPr>
-              <w:t>Gender stored as 'Male'/'Female</w:t>
-            </w:r>
-            <w:proofErr w:type="gramStart"/>
+              <w:t>Gender stored as 'Male'/'Female' but schema requires CHAR(1)</w:t>
+            </w:r>
+          </w:p>
+        </w:tc>
+        <w:tc>
+          <w:tcPr>
+            <w:tcW w:w="2994" w:type="dxa"/>
+          </w:tcPr>
+          <w:p>
             <w:r>
               <w:rPr>
                 <w:sz w:val="18"/>
               </w:rPr>
-              <w:t>'</w:t>
-            </w:r>
-            <w:proofErr w:type="gramEnd"/>
-            <w:r>
-              <w:rPr>
-                <w:sz w:val="18"/>
-              </w:rPr>
-              <w:t xml:space="preserve"> but schema requires </w:t>
-            </w:r>
-            <w:proofErr w:type="gramStart"/>
-            <w:r>
-              <w:rPr>
-                <w:sz w:val="18"/>
-              </w:rPr>
-              <w:t>CHAR(</w:t>
-            </w:r>
-            <w:proofErr w:type="gramEnd"/>
-            <w:r>
-              <w:rPr>
-                <w:sz w:val="18"/>
-              </w:rPr>
-              <w:t>1)</w:t>
-            </w:r>
-          </w:p>
-        </w:tc>
-        <w:tc>
-          <w:tcPr>
-            <w:tcW w:w="2994" w:type="dxa"/>
-          </w:tcPr>
-          <w:p>
-            <w:r>
-              <w:rPr>
-                <w:sz w:val="18"/>
-              </w:rPr>
-              <w:t>Mapped to 'M</w:t>
-            </w:r>
-            <w:proofErr w:type="gramStart"/>
-            <w:r>
-              <w:rPr>
-                <w:sz w:val="18"/>
-              </w:rPr>
-              <w:t>'/'</w:t>
-            </w:r>
-            <w:proofErr w:type="gramEnd"/>
-            <w:r>
-              <w:rPr>
-                <w:sz w:val="18"/>
-              </w:rPr>
-              <w:t>F'</w:t>
+              <w:t>Mapped to 'M'/'F'</w:t>
             </w:r>
           </w:p>
         </w:tc>
@@ -2317,19 +2253,11 @@
             <w:tcW w:w="2700" w:type="dxa"/>
           </w:tcPr>
           <w:p>
-            <w:proofErr w:type="spellStart"/>
             <w:r>
               <w:rPr>
                 <w:sz w:val="18"/>
               </w:rPr>
-              <w:t>DateOfBirth</w:t>
-            </w:r>
-            <w:proofErr w:type="spellEnd"/>
-            <w:r>
-              <w:rPr>
-                <w:sz w:val="18"/>
-              </w:rPr>
-              <w:t xml:space="preserve"> stored as datetime '1990-05-08 00:00:00' instead of a date</w:t>
+              <w:t>DateOfBirth stored as datetime '1990-05-08 00:00:00' instead of a date</w:t>
             </w:r>
           </w:p>
         </w:tc>
@@ -2383,21 +2311,7 @@
               <w:rPr>
                 <w:sz w:val="18"/>
               </w:rPr>
-              <w:t>Two contact fields (</w:t>
-            </w:r>
-            <w:proofErr w:type="spellStart"/>
-            <w:r>
-              <w:rPr>
-                <w:sz w:val="18"/>
-              </w:rPr>
-              <w:t>ContactNo</w:t>
-            </w:r>
-            <w:proofErr w:type="spellEnd"/>
-            <w:r>
-              <w:rPr>
-                <w:sz w:val="18"/>
-              </w:rPr>
-              <w:t>, Email) but Member table has a single Contact column</w:t>
+              <w:t>Two contact fields (ContactNo, Email) but Member table has a single Contact column</w:t>
             </w:r>
           </w:p>
         </w:tc>
@@ -2529,62 +2443,20 @@
               <w:rPr>
                 <w:sz w:val="18"/>
               </w:rPr>
-              <w:t>Gender stored as 'Male'/'Female</w:t>
-            </w:r>
-            <w:proofErr w:type="gramStart"/>
+              <w:t>Gender stored as 'Male'/'Female' but schema requires CHAR(1)</w:t>
+            </w:r>
+          </w:p>
+        </w:tc>
+        <w:tc>
+          <w:tcPr>
+            <w:tcW w:w="2994" w:type="dxa"/>
+          </w:tcPr>
+          <w:p>
             <w:r>
               <w:rPr>
                 <w:sz w:val="18"/>
               </w:rPr>
-              <w:t>'</w:t>
-            </w:r>
-            <w:proofErr w:type="gramEnd"/>
-            <w:r>
-              <w:rPr>
-                <w:sz w:val="18"/>
-              </w:rPr>
-              <w:t xml:space="preserve"> but schema requires </w:t>
-            </w:r>
-            <w:proofErr w:type="gramStart"/>
-            <w:r>
-              <w:rPr>
-                <w:sz w:val="18"/>
-              </w:rPr>
-              <w:t>CHAR(</w:t>
-            </w:r>
-            <w:proofErr w:type="gramEnd"/>
-            <w:r>
-              <w:rPr>
-                <w:sz w:val="18"/>
-              </w:rPr>
-              <w:t>1)</w:t>
-            </w:r>
-          </w:p>
-        </w:tc>
-        <w:tc>
-          <w:tcPr>
-            <w:tcW w:w="2994" w:type="dxa"/>
-          </w:tcPr>
-          <w:p>
-            <w:r>
-              <w:rPr>
-                <w:sz w:val="18"/>
-              </w:rPr>
-              <w:t>Mapped to 'M</w:t>
-            </w:r>
-            <w:proofErr w:type="gramStart"/>
-            <w:r>
-              <w:rPr>
-                <w:sz w:val="18"/>
-              </w:rPr>
-              <w:t>'/'</w:t>
-            </w:r>
-            <w:proofErr w:type="gramEnd"/>
-            <w:r>
-              <w:rPr>
-                <w:sz w:val="18"/>
-              </w:rPr>
-              <w:t>F'</w:t>
+              <w:t>Mapped to 'M'/'F'</w:t>
             </w:r>
           </w:p>
         </w:tc>
@@ -2660,55 +2532,33 @@
               <w:rPr>
                 <w:sz w:val="18"/>
               </w:rPr>
-              <w:t xml:space="preserve">data.xlsx / </w:t>
-            </w:r>
-            <w:proofErr w:type="spellStart"/>
+              <w:t>data.xlsx / BookCopies</w:t>
+            </w:r>
+          </w:p>
+        </w:tc>
+        <w:tc>
+          <w:tcPr>
+            <w:tcW w:w="1620" w:type="dxa"/>
+          </w:tcPr>
+          <w:p>
             <w:r>
               <w:rPr>
                 <w:sz w:val="18"/>
               </w:rPr>
-              <w:t>BookCopies</w:t>
-            </w:r>
-            <w:proofErr w:type="spellEnd"/>
-          </w:p>
-        </w:tc>
-        <w:tc>
-          <w:tcPr>
-            <w:tcW w:w="1620" w:type="dxa"/>
+              <w:t>4 rows</w:t>
+            </w:r>
+          </w:p>
+        </w:tc>
+        <w:tc>
+          <w:tcPr>
+            <w:tcW w:w="2700" w:type="dxa"/>
           </w:tcPr>
           <w:p>
             <w:r>
               <w:rPr>
                 <w:sz w:val="18"/>
               </w:rPr>
-              <w:t>4 rows</w:t>
-            </w:r>
-          </w:p>
-        </w:tc>
-        <w:tc>
-          <w:tcPr>
-            <w:tcW w:w="2700" w:type="dxa"/>
-          </w:tcPr>
-          <w:p>
-            <w:r>
-              <w:rPr>
-                <w:sz w:val="18"/>
-              </w:rPr>
-              <w:t>Status misspelled as '</w:t>
-            </w:r>
-            <w:proofErr w:type="spellStart"/>
-            <w:r>
-              <w:rPr>
-                <w:sz w:val="18"/>
-              </w:rPr>
-              <w:t>Availble</w:t>
-            </w:r>
-            <w:proofErr w:type="spellEnd"/>
-            <w:r>
-              <w:rPr>
-                <w:sz w:val="18"/>
-              </w:rPr>
-              <w:t>'</w:t>
+              <w:t>Status misspelled as 'Availble'</w:t>
             </w:r>
           </w:p>
         </w:tc>
@@ -2736,16 +2586,8 @@
               <w:rPr>
                 <w:sz w:val="18"/>
               </w:rPr>
-              <w:t xml:space="preserve">data.xlsx / </w:t>
-            </w:r>
-            <w:proofErr w:type="spellStart"/>
-            <w:r>
-              <w:rPr>
-                <w:sz w:val="18"/>
-              </w:rPr>
-              <w:t>BookCopies</w:t>
-            </w:r>
-            <w:proofErr w:type="spellEnd"/>
+              <w:t>data.xlsx / BookCopies</w:t>
+            </w:r>
           </w:p>
         </w:tc>
         <w:tc>
@@ -2824,63 +2666,7 @@
               <w:rPr>
                 <w:sz w:val="18"/>
               </w:rPr>
-              <w:t xml:space="preserve">Row references </w:t>
-            </w:r>
-            <w:proofErr w:type="spellStart"/>
-            <w:r>
-              <w:rPr>
-                <w:sz w:val="18"/>
-              </w:rPr>
-              <w:t>StaffID</w:t>
-            </w:r>
-            <w:proofErr w:type="spellEnd"/>
-            <w:r>
-              <w:rPr>
-                <w:sz w:val="18"/>
-              </w:rPr>
-              <w:t xml:space="preserve"> 'S0101' (staff run S0001-S0051) and </w:t>
-            </w:r>
-            <w:proofErr w:type="spellStart"/>
-            <w:r>
-              <w:rPr>
-                <w:sz w:val="18"/>
-              </w:rPr>
-              <w:t>CopySeqNo</w:t>
-            </w:r>
-            <w:proofErr w:type="spellEnd"/>
-            <w:r>
-              <w:rPr>
-                <w:sz w:val="18"/>
-              </w:rPr>
-              <w:t xml:space="preserve"> 8 (book has 3 copies); </w:t>
-            </w:r>
-            <w:proofErr w:type="spellStart"/>
-            <w:r>
-              <w:rPr>
-                <w:sz w:val="18"/>
-              </w:rPr>
-              <w:t>DueDate</w:t>
-            </w:r>
-            <w:proofErr w:type="spellEnd"/>
-            <w:r>
-              <w:rPr>
-                <w:sz w:val="18"/>
-              </w:rPr>
-              <w:t xml:space="preserve"> 2023-04-02 precedes </w:t>
-            </w:r>
-            <w:proofErr w:type="spellStart"/>
-            <w:r>
-              <w:rPr>
-                <w:sz w:val="18"/>
-              </w:rPr>
-              <w:t>LoanDatetime</w:t>
-            </w:r>
-            <w:proofErr w:type="spellEnd"/>
-            <w:r>
-              <w:rPr>
-                <w:sz w:val="18"/>
-              </w:rPr>
-              <w:t xml:space="preserve"> 2024-07-04</w:t>
+              <w:t>Row references StaffID 'S0101' (staff run S0001-S0051) and CopySeqNo 8 (book has 3 copies); DueDate 2023-04-02 precedes LoanDatetime 2024-07-04</w:t>
             </w:r>
           </w:p>
         </w:tc>
@@ -2909,15 +2695,7 @@
         <w:pStyle w:val="ListParagraph"/>
       </w:pPr>
       <w:r>
-        <w:t xml:space="preserve">Submit your SQL INSERT statements for data insertion to the OLTP tables in </w:t>
-      </w:r>
-      <w:proofErr w:type="spellStart"/>
-      <w:r>
-        <w:t>OLTP_insert.sql</w:t>
-      </w:r>
-      <w:proofErr w:type="spellEnd"/>
-      <w:r>
-        <w:t>. If you apply bulk loading, submit each of the cleaned data files used during insertion as well.</w:t>
+        <w:t>Submit your SQL INSERT statements for data insertion to the OLTP tables in OLTP_insert.sql. If you apply bulk loading, submit each of the cleaned data files used during insertion as well.</w:t>
       </w:r>
     </w:p>
     <w:p>
@@ -3082,55 +2860,7 @@
     </w:p>
     <w:p>
       <w:r>
-        <w:t xml:space="preserve">The warehouse uses a star schema: one central fact table holding the numbers we </w:t>
-      </w:r>
-      <w:proofErr w:type="spellStart"/>
-      <w:r>
-        <w:t>analyse</w:t>
-      </w:r>
-      <w:proofErr w:type="spellEnd"/>
-      <w:r>
-        <w:t xml:space="preserve">, surrounded by a single layer of dimension tables holding the descriptive context. There is one fact table, </w:t>
-      </w:r>
-      <w:proofErr w:type="spellStart"/>
-      <w:r>
-        <w:t>FactLoan</w:t>
-      </w:r>
-      <w:proofErr w:type="spellEnd"/>
-      <w:r>
-        <w:t xml:space="preserve">, and four dimensions: </w:t>
-      </w:r>
-      <w:proofErr w:type="spellStart"/>
-      <w:r>
-        <w:t>DimMember</w:t>
-      </w:r>
-      <w:proofErr w:type="spellEnd"/>
-      <w:r>
-        <w:t xml:space="preserve">, </w:t>
-      </w:r>
-      <w:proofErr w:type="spellStart"/>
-      <w:r>
-        <w:t>DimStaff</w:t>
-      </w:r>
-      <w:proofErr w:type="spellEnd"/>
-      <w:r>
-        <w:t xml:space="preserve">, </w:t>
-      </w:r>
-      <w:proofErr w:type="spellStart"/>
-      <w:r>
-        <w:t>DimBook</w:t>
-      </w:r>
-      <w:proofErr w:type="spellEnd"/>
-      <w:r>
-        <w:t xml:space="preserve"> and </w:t>
-      </w:r>
-      <w:proofErr w:type="spellStart"/>
-      <w:r>
-        <w:t>DimDate</w:t>
-      </w:r>
-      <w:proofErr w:type="spellEnd"/>
-      <w:r>
-        <w:t>.</w:t>
+        <w:t>The warehouse uses a star schema: one central fact table holding the numbers we analyse, surrounded by a single layer of dimension tables holding the descriptive context. There is one fact table, FactLoan, and four dimensions: DimMember, DimStaff, DimBook and DimDate.</w:t>
       </w:r>
     </w:p>
     <w:p>
@@ -3147,39 +2877,7 @@
         <w:t xml:space="preserve">it </w:t>
       </w:r>
       <w:r>
-        <w:t xml:space="preserve">splits dimensions further into sub-tables to remove repeated values. The only table worth splitting here is </w:t>
-      </w:r>
-      <w:proofErr w:type="spellStart"/>
-      <w:r>
-        <w:t>MembershipTier</w:t>
-      </w:r>
-      <w:proofErr w:type="spellEnd"/>
-      <w:r>
-        <w:t xml:space="preserve">, which supplies tier attributes to both </w:t>
-      </w:r>
-      <w:proofErr w:type="spellStart"/>
-      <w:r>
-        <w:t>DimMember</w:t>
-      </w:r>
-      <w:proofErr w:type="spellEnd"/>
-      <w:r>
-        <w:t xml:space="preserve"> and </w:t>
-      </w:r>
-      <w:proofErr w:type="spellStart"/>
-      <w:r>
-        <w:t>DimBook</w:t>
-      </w:r>
-      <w:proofErr w:type="spellEnd"/>
-      <w:r>
-        <w:t xml:space="preserve">. Keeping it separate would add a second join to every tier-based question and save three rows, so we </w:t>
-      </w:r>
-      <w:proofErr w:type="spellStart"/>
-      <w:r>
-        <w:t>denormalised</w:t>
-      </w:r>
-      <w:proofErr w:type="spellEnd"/>
-      <w:r>
-        <w:t xml:space="preserve"> its attributes into both dimensions instead, meaning we copied them in and accepted the duplication. With 301 members, 500 books and 51 staff, dimension size is not</w:t>
+        <w:t>splits dimensions further into sub-tables to remove repeated values. The only table worth splitting here is MembershipTier, which supplies tier attributes to both DimMember and DimBook. Keeping it separate would add a second join to every tier-based question and save three rows, so we denormalised its attributes into both dimensions instead, meaning we copied them in and accepted the duplication. With 301 members, 500 books and 51 staff, dimension size is not</w:t>
       </w:r>
       <w:r>
         <w:t xml:space="preserve"> so much of</w:t>
@@ -3203,25 +2901,12 @@
     <w:p>
       <w:r>
         <w:lastRenderedPageBreak/>
-        <w:t xml:space="preserve">The grain of </w:t>
-      </w:r>
-      <w:proofErr w:type="spellStart"/>
-      <w:r>
-        <w:t>FactLoan</w:t>
-      </w:r>
-      <w:proofErr w:type="spellEnd"/>
-      <w:r>
-        <w:t>, meaning the exact real-world event that one fact row represents, is one completed loan transaction: one physical copy of one book, borrowed by one member, issued by one staff member, and returned. Every measure in the table is true at that level, and each fact row holds one foreign key, a column pointing at another table’s primary key, per dimension.</w:t>
+        <w:t>The grain of FactLoan, meaning the exact real-world event that one fact row represents, is one completed loan transaction: one physical copy of one book, borrowed by one member, issued by one staff member, and returned. Every measure in the table is true at that level, and each fact row holds one foreign key, a column pointing at another table’s primary key, per dimension.</w:t>
       </w:r>
     </w:p>
     <w:p>
-      <w:proofErr w:type="spellStart"/>
-      <w:r>
-        <w:t>FactLoan</w:t>
-      </w:r>
-      <w:proofErr w:type="spellEnd"/>
-      <w:r>
-        <w:t xml:space="preserve"> is a transaction fact table, so each row records one business event and is never updated afterwards. That suits the job here, because the analysis we need is about loans that have run their full course, from borrowing through to return.</w:t>
+      <w:r>
+        <w:t>FactLoan is a transaction fact table, so each row records one business event and is never updated afterwards. That suits the job here, because the analysis we need is about loans that have run their full course, from borrowing through to return.</w:t>
       </w:r>
     </w:p>
     <w:p/>
@@ -3230,34 +2915,12 @@
         <w:rPr>
           <w:b/>
         </w:rPr>
-        <w:t xml:space="preserve">What the design </w:t>
-      </w:r>
-      <w:proofErr w:type="gramStart"/>
-      <w:r>
-        <w:rPr>
-          <w:b/>
-        </w:rPr>
-        <w:t>has to</w:t>
-      </w:r>
-      <w:proofErr w:type="gramEnd"/>
-      <w:r>
-        <w:rPr>
-          <w:b/>
-        </w:rPr>
-        <w:t xml:space="preserve"> support</w:t>
+        <w:t>What the design has to support</w:t>
       </w:r>
     </w:p>
     <w:p>
       <w:r>
-        <w:t xml:space="preserve">The warehouse </w:t>
-      </w:r>
-      <w:proofErr w:type="gramStart"/>
-      <w:r>
-        <w:t>has to</w:t>
-      </w:r>
-      <w:proofErr w:type="gramEnd"/>
-      <w:r>
-        <w:t xml:space="preserve"> answer questions about loan duration and borrowing activity, and on top of that transaction volume, book popularity and seasonal trends. </w:t>
+        <w:t xml:space="preserve">The warehouse has to answer questions about loan duration and borrowing activity, and on top of that transaction volume, book popularity and seasonal trends. </w:t>
       </w:r>
       <w:r>
         <w:t xml:space="preserve">These are used in our </w:t>
@@ -3358,14 +3021,12 @@
             <w:tcW w:w="3250" w:type="dxa"/>
           </w:tcPr>
           <w:p>
-            <w:proofErr w:type="spellStart"/>
             <w:r>
               <w:rPr>
                 <w:sz w:val="20"/>
               </w:rPr>
               <w:t>LoanDurationDays</w:t>
             </w:r>
-            <w:proofErr w:type="spellEnd"/>
           </w:p>
         </w:tc>
         <w:tc>
@@ -3405,30 +3066,8 @@
               <w:rPr>
                 <w:sz w:val="20"/>
               </w:rPr>
-              <w:t xml:space="preserve">Grain of </w:t>
-            </w:r>
-            <w:proofErr w:type="spellStart"/>
-            <w:r>
-              <w:rPr>
-                <w:sz w:val="20"/>
-              </w:rPr>
-              <w:t>FactLoan</w:t>
-            </w:r>
-            <w:proofErr w:type="spellEnd"/>
-            <w:r>
-              <w:rPr>
-                <w:sz w:val="20"/>
-              </w:rPr>
-              <w:t xml:space="preserve">, with </w:t>
-            </w:r>
-            <w:proofErr w:type="spellStart"/>
-            <w:r>
-              <w:rPr>
-                <w:sz w:val="20"/>
-              </w:rPr>
-              <w:t>DimMember</w:t>
-            </w:r>
-            <w:proofErr w:type="spellEnd"/>
+              <w:t>Grain of FactLoan, with DimMember</w:t>
+            </w:r>
           </w:p>
         </w:tc>
         <w:tc>
@@ -3468,21 +3107,7 @@
               <w:rPr>
                 <w:sz w:val="20"/>
               </w:rPr>
-              <w:t xml:space="preserve">Row count of </w:t>
-            </w:r>
-            <w:proofErr w:type="spellStart"/>
-            <w:r>
-              <w:rPr>
-                <w:sz w:val="20"/>
-              </w:rPr>
-              <w:t>FactLoan</w:t>
-            </w:r>
-            <w:proofErr w:type="spellEnd"/>
-            <w:r>
-              <w:rPr>
-                <w:sz w:val="20"/>
-              </w:rPr>
-              <w:t>, sliced by any dimension</w:t>
+              <w:t>Row count of FactLoan, sliced by any dimension</w:t>
             </w:r>
           </w:p>
         </w:tc>
@@ -3519,19 +3144,11 @@
             <w:tcW w:w="3250" w:type="dxa"/>
           </w:tcPr>
           <w:p>
-            <w:proofErr w:type="spellStart"/>
             <w:r>
               <w:rPr>
                 <w:sz w:val="20"/>
               </w:rPr>
-              <w:t>DimBook</w:t>
-            </w:r>
-            <w:proofErr w:type="spellEnd"/>
-            <w:r>
-              <w:rPr>
-                <w:sz w:val="20"/>
-              </w:rPr>
-              <w:t xml:space="preserve"> (Genre, Title, Author)</w:t>
+              <w:t>DimBook (Genre, Title, Author)</w:t>
             </w:r>
           </w:p>
         </w:tc>
@@ -3568,47 +3185,11 @@
             <w:tcW w:w="3250" w:type="dxa"/>
           </w:tcPr>
           <w:p>
-            <w:proofErr w:type="spellStart"/>
             <w:r>
               <w:rPr>
                 <w:sz w:val="20"/>
               </w:rPr>
-              <w:t>DimDate</w:t>
-            </w:r>
-            <w:proofErr w:type="spellEnd"/>
-            <w:r>
-              <w:rPr>
-                <w:sz w:val="20"/>
-              </w:rPr>
-              <w:t xml:space="preserve"> (Month, Quarter, </w:t>
-            </w:r>
-            <w:proofErr w:type="spellStart"/>
-            <w:r>
-              <w:rPr>
-                <w:sz w:val="20"/>
-              </w:rPr>
-              <w:t>DayOfWeek</w:t>
-            </w:r>
-            <w:proofErr w:type="spellEnd"/>
-            <w:r>
-              <w:rPr>
-                <w:sz w:val="20"/>
-              </w:rPr>
-              <w:t xml:space="preserve">, </w:t>
-            </w:r>
-            <w:proofErr w:type="spellStart"/>
-            <w:r>
-              <w:rPr>
-                <w:sz w:val="20"/>
-              </w:rPr>
-              <w:t>IsWeekend</w:t>
-            </w:r>
-            <w:proofErr w:type="spellEnd"/>
-            <w:r>
-              <w:rPr>
-                <w:sz w:val="20"/>
-              </w:rPr>
-              <w:t>)</w:t>
+              <w:t>DimDate (Month, Quarter, DayOfWeek, IsWeekend)</w:t>
             </w:r>
           </w:p>
         </w:tc>
@@ -3645,28 +3226,12 @@
             <w:tcW w:w="3250" w:type="dxa"/>
           </w:tcPr>
           <w:p>
-            <w:proofErr w:type="spellStart"/>
             <w:r>
               <w:rPr>
                 <w:sz w:val="20"/>
               </w:rPr>
-              <w:t>DaysBeforeDue</w:t>
-            </w:r>
-            <w:proofErr w:type="spellEnd"/>
-            <w:r>
-              <w:rPr>
-                <w:sz w:val="20"/>
-              </w:rPr>
-              <w:t xml:space="preserve">, </w:t>
-            </w:r>
-            <w:proofErr w:type="spellStart"/>
-            <w:r>
-              <w:rPr>
-                <w:sz w:val="20"/>
-              </w:rPr>
-              <w:t>IsLate</w:t>
-            </w:r>
-            <w:proofErr w:type="spellEnd"/>
+              <w:t>DaysBeforeDue, IsLate</w:t>
+            </w:r>
           </w:p>
         </w:tc>
         <w:tc>
@@ -3687,21 +3252,22 @@
     <w:p/>
     <w:p>
       <w:r>
-        <w:t xml:space="preserve">Every analysis reads </w:t>
-      </w:r>
-      <w:proofErr w:type="spellStart"/>
-      <w:r>
-        <w:t>FactLoan</w:t>
-      </w:r>
-      <w:proofErr w:type="spellEnd"/>
+        <w:t xml:space="preserve">Every analysis reads FactLoan </w:t>
+      </w:r>
+      <w:r>
+        <w:t>and</w:t>
+      </w:r>
+      <w:r>
+        <w:t xml:space="preserve"> at most two dimensions, with no chained dimension joins</w:t>
+      </w:r>
+      <w:r>
+        <w:t xml:space="preserve"> (joining a dimension to a sub-dimension) which would be required in a snowflake schema</w:t>
+      </w:r>
+      <w:r>
+        <w:t>.</w:t>
+      </w:r>
       <w:r>
         <w:t xml:space="preserve"> </w:t>
-      </w:r>
-      <w:r>
-        <w:t>and</w:t>
-      </w:r>
-      <w:r>
-        <w:t xml:space="preserve"> at most two dimensions, with no chained dimension joins.</w:t>
       </w:r>
     </w:p>
     <w:p/>
@@ -3800,28 +3366,12 @@
             <w:tcW w:w="3250" w:type="dxa"/>
           </w:tcPr>
           <w:p>
-            <w:proofErr w:type="spellStart"/>
             <w:r>
               <w:rPr>
                 <w:sz w:val="20"/>
               </w:rPr>
-              <w:t>DimMember</w:t>
-            </w:r>
-            <w:proofErr w:type="spellEnd"/>
-            <w:r>
-              <w:rPr>
-                <w:sz w:val="20"/>
-              </w:rPr>
-              <w:t xml:space="preserve">, </w:t>
-            </w:r>
-            <w:proofErr w:type="spellStart"/>
-            <w:r>
-              <w:rPr>
-                <w:sz w:val="20"/>
-              </w:rPr>
-              <w:t>FactLoan</w:t>
-            </w:r>
-            <w:proofErr w:type="spellEnd"/>
+              <w:t>DimMember, FactLoan</w:t>
+            </w:r>
           </w:p>
         </w:tc>
       </w:tr>
@@ -3857,28 +3407,12 @@
             <w:tcW w:w="3250" w:type="dxa"/>
           </w:tcPr>
           <w:p>
-            <w:proofErr w:type="spellStart"/>
             <w:r>
               <w:rPr>
                 <w:sz w:val="20"/>
               </w:rPr>
-              <w:t>MemberKey</w:t>
-            </w:r>
-            <w:proofErr w:type="spellEnd"/>
-            <w:r>
-              <w:rPr>
-                <w:sz w:val="20"/>
-              </w:rPr>
-              <w:t xml:space="preserve">, </w:t>
-            </w:r>
-            <w:proofErr w:type="spellStart"/>
-            <w:r>
-              <w:rPr>
-                <w:sz w:val="20"/>
-              </w:rPr>
-              <w:t>BorrowDateKey</w:t>
-            </w:r>
-            <w:proofErr w:type="spellEnd"/>
+              <w:t>MemberKey, BorrowDateKey</w:t>
+            </w:r>
           </w:p>
         </w:tc>
       </w:tr>
@@ -3914,28 +3448,12 @@
             <w:tcW w:w="3250" w:type="dxa"/>
           </w:tcPr>
           <w:p>
-            <w:proofErr w:type="spellStart"/>
             <w:r>
               <w:rPr>
                 <w:sz w:val="20"/>
               </w:rPr>
-              <w:t>MemberID</w:t>
-            </w:r>
-            <w:proofErr w:type="spellEnd"/>
-            <w:r>
-              <w:rPr>
-                <w:sz w:val="20"/>
-              </w:rPr>
-              <w:t xml:space="preserve">, </w:t>
-            </w:r>
-            <w:proofErr w:type="spellStart"/>
-            <w:r>
-              <w:rPr>
-                <w:sz w:val="20"/>
-              </w:rPr>
-              <w:t>BookID</w:t>
-            </w:r>
-            <w:proofErr w:type="spellEnd"/>
+              <w:t>MemberID, BookID</w:t>
+            </w:r>
           </w:p>
         </w:tc>
       </w:tr>
@@ -3971,28 +3489,12 @@
             <w:tcW w:w="3250" w:type="dxa"/>
           </w:tcPr>
           <w:p>
-            <w:proofErr w:type="spellStart"/>
             <w:r>
               <w:rPr>
                 <w:sz w:val="20"/>
               </w:rPr>
-              <w:t>LoanDurationDays</w:t>
-            </w:r>
-            <w:proofErr w:type="spellEnd"/>
-            <w:r>
-              <w:rPr>
-                <w:sz w:val="20"/>
-              </w:rPr>
-              <w:t xml:space="preserve">, </w:t>
-            </w:r>
-            <w:proofErr w:type="spellStart"/>
-            <w:r>
-              <w:rPr>
-                <w:sz w:val="20"/>
-              </w:rPr>
-              <w:t>DaysBeforeDue</w:t>
-            </w:r>
-            <w:proofErr w:type="spellEnd"/>
+              <w:t>LoanDurationDays, DaysBeforeDue</w:t>
+            </w:r>
           </w:p>
         </w:tc>
       </w:tr>
@@ -4019,51 +3521,21 @@
               <w:rPr>
                 <w:sz w:val="20"/>
               </w:rPr>
-              <w:t xml:space="preserve">A </w:t>
-            </w:r>
-            <w:proofErr w:type="spellStart"/>
+              <w:t>A boolean flag where 1 means true</w:t>
+            </w:r>
+          </w:p>
+        </w:tc>
+        <w:tc>
+          <w:tcPr>
+            <w:tcW w:w="3250" w:type="dxa"/>
+          </w:tcPr>
+          <w:p>
             <w:r>
               <w:rPr>
                 <w:sz w:val="20"/>
               </w:rPr>
-              <w:t>boolean</w:t>
-            </w:r>
-            <w:proofErr w:type="spellEnd"/>
-            <w:r>
-              <w:rPr>
-                <w:sz w:val="20"/>
-              </w:rPr>
-              <w:t xml:space="preserve"> flag where 1 means true</w:t>
-            </w:r>
-          </w:p>
-        </w:tc>
-        <w:tc>
-          <w:tcPr>
-            <w:tcW w:w="3250" w:type="dxa"/>
-          </w:tcPr>
-          <w:p>
-            <w:proofErr w:type="spellStart"/>
-            <w:r>
-              <w:rPr>
-                <w:sz w:val="20"/>
-              </w:rPr>
-              <w:t>IsLate</w:t>
-            </w:r>
-            <w:proofErr w:type="spellEnd"/>
-            <w:r>
-              <w:rPr>
-                <w:sz w:val="20"/>
-              </w:rPr>
-              <w:t xml:space="preserve">, </w:t>
-            </w:r>
-            <w:proofErr w:type="spellStart"/>
-            <w:r>
-              <w:rPr>
-                <w:sz w:val="20"/>
-              </w:rPr>
-              <w:t>IsWeekend</w:t>
-            </w:r>
-            <w:proofErr w:type="spellEnd"/>
+              <w:t>IsLate, IsWeekend</w:t>
+            </w:r>
           </w:p>
         </w:tc>
       </w:tr>
@@ -4099,28 +3571,12 @@
             <w:tcW w:w="3250" w:type="dxa"/>
           </w:tcPr>
           <w:p>
-            <w:proofErr w:type="spellStart"/>
             <w:r>
               <w:rPr>
                 <w:sz w:val="20"/>
               </w:rPr>
-              <w:t>MinTierName</w:t>
-            </w:r>
-            <w:proofErr w:type="spellEnd"/>
-            <w:r>
-              <w:rPr>
-                <w:sz w:val="20"/>
-              </w:rPr>
-              <w:t xml:space="preserve">, </w:t>
-            </w:r>
-            <w:proofErr w:type="spellStart"/>
-            <w:r>
-              <w:rPr>
-                <w:sz w:val="20"/>
-              </w:rPr>
-              <w:t>MinTierLevel</w:t>
-            </w:r>
-            <w:proofErr w:type="spellEnd"/>
+              <w:t>MinTierName, MinTierLevel</w:t>
+            </w:r>
           </w:p>
         </w:tc>
       </w:tr>
@@ -4156,28 +3612,12 @@
             <w:tcW w:w="3250" w:type="dxa"/>
           </w:tcPr>
           <w:p>
-            <w:proofErr w:type="spellStart"/>
             <w:r>
               <w:rPr>
                 <w:sz w:val="20"/>
               </w:rPr>
-              <w:t>EmploymentType</w:t>
-            </w:r>
-            <w:proofErr w:type="spellEnd"/>
-            <w:r>
-              <w:rPr>
-                <w:sz w:val="20"/>
-              </w:rPr>
-              <w:t xml:space="preserve">, </w:t>
-            </w:r>
-            <w:proofErr w:type="spellStart"/>
-            <w:r>
-              <w:rPr>
-                <w:sz w:val="20"/>
-              </w:rPr>
-              <w:t>RegistrationDate</w:t>
-            </w:r>
-            <w:proofErr w:type="spellEnd"/>
+              <w:t>EmploymentType, RegistrationDate</w:t>
+            </w:r>
           </w:p>
         </w:tc>
       </w:tr>
@@ -4193,182 +3633,23 @@
     </w:p>
     <w:p>
       <w:r>
-        <w:t xml:space="preserve">All five tables, including </w:t>
-      </w:r>
-      <w:proofErr w:type="spellStart"/>
-      <w:r>
-        <w:t>DimDate</w:t>
-      </w:r>
-      <w:proofErr w:type="spellEnd"/>
-      <w:r>
-        <w:t xml:space="preserve"> and </w:t>
-      </w:r>
-      <w:proofErr w:type="spellStart"/>
-      <w:r>
-        <w:t>FactLoan</w:t>
-      </w:r>
-      <w:proofErr w:type="spellEnd"/>
-      <w:r>
-        <w:t>, use an AUTO_INCREMENT surrogate key as the primary key. A surrogate key is a system-generated identifier with no business meaning, used only inside the warehouse. Each dimension also keeps its natural key from the OLTP system (</w:t>
-      </w:r>
-      <w:proofErr w:type="spellStart"/>
-      <w:r>
-        <w:t>MemberID</w:t>
-      </w:r>
-      <w:proofErr w:type="spellEnd"/>
-      <w:r>
-        <w:t xml:space="preserve">, </w:t>
-      </w:r>
-      <w:proofErr w:type="spellStart"/>
-      <w:r>
-        <w:t>StaffID</w:t>
-      </w:r>
-      <w:proofErr w:type="spellEnd"/>
-      <w:r>
-        <w:t xml:space="preserve">, </w:t>
-      </w:r>
-      <w:proofErr w:type="spellStart"/>
-      <w:r>
-        <w:t>BookID</w:t>
-      </w:r>
-      <w:proofErr w:type="spellEnd"/>
-      <w:r>
-        <w:t>) under a unique constraint, so any warehouse row can be traced back to its source record.</w:t>
+        <w:t>All five tables, including DimDate and FactLoan, use an AUTO_INCREMENT surrogate key as the primary key. A surrogate key is a system-generated identifier with no business meaning, used only inside the warehouse. Each dimension also keeps its natural key from the OLTP system (MemberID, StaffID, BookID) under a unique constraint, so any warehouse row can be traced back to its source record.</w:t>
       </w:r>
     </w:p>
     <w:p>
-      <w:proofErr w:type="spellStart"/>
-      <w:r>
-        <w:t>DimMember</w:t>
-      </w:r>
-      <w:proofErr w:type="spellEnd"/>
-      <w:r>
-        <w:t xml:space="preserve"> carries the member’s tier attributes (</w:t>
-      </w:r>
-      <w:proofErr w:type="spellStart"/>
-      <w:r>
-        <w:t>TierName</w:t>
-      </w:r>
-      <w:proofErr w:type="spellEnd"/>
-      <w:r>
-        <w:t xml:space="preserve">, </w:t>
-      </w:r>
-      <w:proofErr w:type="spellStart"/>
-      <w:r>
-        <w:t>TierLevel</w:t>
-      </w:r>
-      <w:proofErr w:type="spellEnd"/>
-      <w:r>
-        <w:t xml:space="preserve">, </w:t>
-      </w:r>
-      <w:proofErr w:type="spellStart"/>
-      <w:r>
-        <w:t>BorrowLimit</w:t>
-      </w:r>
-      <w:proofErr w:type="spellEnd"/>
-      <w:r>
-        <w:t xml:space="preserve">) and </w:t>
-      </w:r>
-      <w:proofErr w:type="spellStart"/>
-      <w:r>
-        <w:t>DimBook</w:t>
-      </w:r>
-      <w:proofErr w:type="spellEnd"/>
-      <w:r>
-        <w:t xml:space="preserve"> carries the minimum tier needed to borrow the title (</w:t>
-      </w:r>
-      <w:proofErr w:type="spellStart"/>
-      <w:r>
-        <w:t>MinTierName</w:t>
-      </w:r>
-      <w:proofErr w:type="spellEnd"/>
-      <w:r>
-        <w:t xml:space="preserve">, </w:t>
-      </w:r>
-      <w:proofErr w:type="spellStart"/>
-      <w:r>
-        <w:t>MinTierLevel</w:t>
-      </w:r>
-      <w:proofErr w:type="spellEnd"/>
-      <w:r>
-        <w:t xml:space="preserve">). Both come from </w:t>
-      </w:r>
-      <w:proofErr w:type="spellStart"/>
-      <w:r>
-        <w:t>MembershipTier</w:t>
-      </w:r>
-      <w:proofErr w:type="spellEnd"/>
-      <w:r>
-        <w:t xml:space="preserve">, </w:t>
-      </w:r>
-      <w:proofErr w:type="spellStart"/>
-      <w:r>
-        <w:t>denormalised</w:t>
-      </w:r>
-      <w:proofErr w:type="spellEnd"/>
-      <w:r>
-        <w:t xml:space="preserve"> as described above.</w:t>
+      <w:r>
+        <w:t>DimMember carries the member’s tier attributes (TierName, TierLevel, BorrowLimit) and DimBook carries the minimum tier needed to borrow the title (MinTierName, MinTierLevel). Both come from MembershipTier, denormalised as described above.</w:t>
       </w:r>
     </w:p>
     <w:p>
-      <w:proofErr w:type="spellStart"/>
       <w:r>
         <w:lastRenderedPageBreak/>
-        <w:t>DimDate</w:t>
-      </w:r>
-      <w:proofErr w:type="spellEnd"/>
-      <w:r>
-        <w:t xml:space="preserve"> is day-level and holds </w:t>
-      </w:r>
-      <w:proofErr w:type="spellStart"/>
-      <w:r>
-        <w:t>FullDate</w:t>
-      </w:r>
-      <w:proofErr w:type="spellEnd"/>
-      <w:r>
-        <w:t xml:space="preserve">, Day, </w:t>
-      </w:r>
-      <w:proofErr w:type="spellStart"/>
-      <w:r>
-        <w:t>DayOfWeek</w:t>
-      </w:r>
-      <w:proofErr w:type="spellEnd"/>
-      <w:r>
-        <w:t xml:space="preserve">, </w:t>
-      </w:r>
-      <w:proofErr w:type="spellStart"/>
-      <w:r>
-        <w:t>IsWeekend</w:t>
-      </w:r>
-      <w:proofErr w:type="spellEnd"/>
-      <w:r>
-        <w:t xml:space="preserve">, Month, </w:t>
-      </w:r>
-      <w:proofErr w:type="spellStart"/>
-      <w:r>
-        <w:t>MonthName</w:t>
-      </w:r>
-      <w:proofErr w:type="spellEnd"/>
-      <w:r>
-        <w:t>, Quarter and Year. Because these are stored as columns, our queries group on them directly and never apply date functions to fact rows.</w:t>
+        <w:t>DimDate is day-level and holds FullDate, Day, DayOfWeek, IsWeekend, Month, MonthName, Quarter and Year. Because these are stored as columns, our queries group on them directly and never apply date functions to fact rows.</w:t>
       </w:r>
     </w:p>
     <w:p>
-      <w:proofErr w:type="spellStart"/>
-      <w:r>
-        <w:t>CopySeqNo</w:t>
-      </w:r>
-      <w:proofErr w:type="spellEnd"/>
-      <w:r>
-        <w:t xml:space="preserve"> stays in </w:t>
-      </w:r>
-      <w:proofErr w:type="spellStart"/>
-      <w:r>
-        <w:t>FactLoan</w:t>
-      </w:r>
-      <w:proofErr w:type="spellEnd"/>
-      <w:r>
-        <w:t xml:space="preserve"> as a degenerate dimension, which is an identifier taken from the source system that has no descriptive attributes of its own to justify a dimension table. Combined with BookKey it identifies the physical copy, so any fact row can be traced back to its OLTP Loan record. We keep it for traceability rather than analysis; none of our analyses group by it.</w:t>
+      <w:r>
+        <w:t>CopySeqNo stays in FactLoan as a degenerate dimension, which is an identifier taken from the source system that has no descriptive attributes of its own to justify a dimension table. Combined with BookKey it identifies the physical copy, so any fact row can be traced back to its OLTP Loan record. We keep it for traceability rather than analysis; none of our analyses group by it.</w:t>
       </w:r>
     </w:p>
     <w:p/>
@@ -4381,13 +3662,8 @@
       </w:r>
     </w:p>
     <w:p>
-      <w:proofErr w:type="spellStart"/>
-      <w:r>
-        <w:t>FactLoan</w:t>
-      </w:r>
-      <w:proofErr w:type="spellEnd"/>
-      <w:r>
-        <w:t xml:space="preserve"> stores three measures, meaning numeric values meant to be aggregated. All three are computed once during the ETL load (Extract from OLTP, Transform, Load into the warehouse) rather than recalculated in every query.</w:t>
+      <w:r>
+        <w:t>FactLoan stores three measures, meaning numeric values meant to be aggregated. All three are computed once during the ETL load (Extract from OLTP, Transform, Load into the warehouse) rather than recalculated in every query.</w:t>
       </w:r>
     </w:p>
     <w:p/>
@@ -4452,14 +3728,12 @@
             <w:tcW w:w="3250" w:type="dxa"/>
           </w:tcPr>
           <w:p>
-            <w:proofErr w:type="spellStart"/>
             <w:r>
               <w:rPr>
                 <w:sz w:val="20"/>
               </w:rPr>
               <w:t>LoanDurationDays</w:t>
             </w:r>
-            <w:proofErr w:type="spellEnd"/>
           </w:p>
         </w:tc>
         <w:tc>
@@ -4495,14 +3769,12 @@
             <w:tcW w:w="3250" w:type="dxa"/>
           </w:tcPr>
           <w:p>
-            <w:proofErr w:type="spellStart"/>
             <w:r>
               <w:rPr>
                 <w:sz w:val="20"/>
               </w:rPr>
               <w:t>DaysBeforeDue</w:t>
             </w:r>
-            <w:proofErr w:type="spellEnd"/>
           </w:p>
         </w:tc>
         <w:tc>
@@ -4527,21 +3799,7 @@
               <w:rPr>
                 <w:sz w:val="20"/>
               </w:rPr>
-              <w:t xml:space="preserve">Additive, but averaged rather than </w:t>
-            </w:r>
-            <w:proofErr w:type="gramStart"/>
-            <w:r>
-              <w:rPr>
-                <w:sz w:val="20"/>
-              </w:rPr>
-              <w:t>summed</w:t>
-            </w:r>
-            <w:proofErr w:type="gramEnd"/>
-            <w:r>
-              <w:rPr>
-                <w:sz w:val="20"/>
-              </w:rPr>
-              <w:t xml:space="preserve"> in practice</w:t>
+              <w:t>Additive, but averaged rather than summed in practice</w:t>
             </w:r>
           </w:p>
         </w:tc>
@@ -4552,14 +3810,12 @@
             <w:tcW w:w="3250" w:type="dxa"/>
           </w:tcPr>
           <w:p>
-            <w:proofErr w:type="spellStart"/>
             <w:r>
               <w:rPr>
                 <w:sz w:val="20"/>
               </w:rPr>
               <w:t>IsLate</w:t>
             </w:r>
-            <w:proofErr w:type="spellEnd"/>
           </w:p>
         </w:tc>
         <w:tc>
@@ -4571,48 +3827,20 @@
               <w:rPr>
                 <w:sz w:val="20"/>
               </w:rPr>
-              <w:t xml:space="preserve">BOOLEAN, stored by MySQL as </w:t>
-            </w:r>
-            <w:proofErr w:type="gramStart"/>
+              <w:t>BOOLEAN, stored by MySQL as TINYINT(1): 1 = late, 0 = on time. Set where the return date is after the due date</w:t>
+            </w:r>
+          </w:p>
+        </w:tc>
+        <w:tc>
+          <w:tcPr>
+            <w:tcW w:w="3250" w:type="dxa"/>
+          </w:tcPr>
+          <w:p>
             <w:r>
               <w:rPr>
                 <w:sz w:val="20"/>
               </w:rPr>
-              <w:t>TINYINT(</w:t>
-            </w:r>
-            <w:proofErr w:type="gramEnd"/>
-            <w:r>
-              <w:rPr>
-                <w:sz w:val="20"/>
-              </w:rPr>
-              <w:t>1): 1 = late, 0 = on time. Set where the return date is after the due date</w:t>
-            </w:r>
-          </w:p>
-        </w:tc>
-        <w:tc>
-          <w:tcPr>
-            <w:tcW w:w="3250" w:type="dxa"/>
-          </w:tcPr>
-          <w:p>
-            <w:r>
-              <w:rPr>
-                <w:sz w:val="20"/>
-              </w:rPr>
-              <w:t>Not additive as a flag; AVG(</w:t>
-            </w:r>
-            <w:proofErr w:type="spellStart"/>
-            <w:r>
-              <w:rPr>
-                <w:sz w:val="20"/>
-              </w:rPr>
-              <w:t>IsLate</w:t>
-            </w:r>
-            <w:proofErr w:type="spellEnd"/>
-            <w:r>
-              <w:rPr>
-                <w:sz w:val="20"/>
-              </w:rPr>
-              <w:t>) gives the late-return rate</w:t>
+              <w:t>Not additive as a flag; AVG(IsLate) gives the late-return rate</w:t>
             </w:r>
           </w:p>
         </w:tc>
@@ -4620,45 +3848,8 @@
     </w:tbl>
     <w:p/>
     <w:p>
-      <w:proofErr w:type="spellStart"/>
-      <w:r>
-        <w:t>IsLate</w:t>
-      </w:r>
-      <w:proofErr w:type="spellEnd"/>
-      <w:r>
-        <w:t xml:space="preserve"> duplicates the sign of </w:t>
-      </w:r>
-      <w:proofErr w:type="spellStart"/>
-      <w:r>
-        <w:t>DaysBeforeDue</w:t>
-      </w:r>
-      <w:proofErr w:type="spellEnd"/>
-      <w:r>
-        <w:t xml:space="preserve">. We store it anyway so that a late-return rate is one </w:t>
-      </w:r>
-      <w:proofErr w:type="gramStart"/>
-      <w:r>
-        <w:t>AVG(</w:t>
-      </w:r>
-      <w:proofErr w:type="gramEnd"/>
-      <w:r>
-        <w:t xml:space="preserve">) instead of a CASE expression repeated in every query, which is how the staff and membership-tier analyses use it. Together with </w:t>
-      </w:r>
-      <w:proofErr w:type="spellStart"/>
-      <w:r>
-        <w:t>BorrowDateKey</w:t>
-      </w:r>
-      <w:proofErr w:type="spellEnd"/>
-      <w:r>
-        <w:t xml:space="preserve">, these measures carry all three dates of a loan: borrow, return and due. That is why we did not need a second foreign key to </w:t>
-      </w:r>
-      <w:proofErr w:type="spellStart"/>
-      <w:r>
-        <w:t>DimDate</w:t>
-      </w:r>
-      <w:proofErr w:type="spellEnd"/>
-      <w:r>
-        <w:t>, and we come back to that in the assumptions below.</w:t>
+      <w:r>
+        <w:t>IsLate duplicates the sign of DaysBeforeDue. We store it anyway so that a late-return rate is one AVG() instead of a CASE expression repeated in every query, which is how the staff and membership-tier analyses use it. Together with BorrowDateKey, these measures carry all three dates of a loan: borrow, return and due. That is why we did not need a second foreign key to DimDate, and we come back to that in the assumptions below.</w:t>
       </w:r>
     </w:p>
     <w:p/>
@@ -4689,15 +3880,7 @@
     </w:p>
     <w:p>
       <w:r>
-        <w:t xml:space="preserve">The brief asks us to focus on loan duration and borrowing activity for books that have been borrowed and returned, so </w:t>
-      </w:r>
-      <w:proofErr w:type="spellStart"/>
-      <w:r>
-        <w:t>FactLoan</w:t>
-      </w:r>
-      <w:proofErr w:type="spellEnd"/>
-      <w:r>
-        <w:t xml:space="preserve"> holds 12,343 of the 12,344 OLTP loan records. The one outstanding loan has no return date, which leaves all three measures undefined, so it cannot sit at this grain. Reporting on loans still out is therefore out of scope. The structure for that would be an accumulating snapshot fact table, whose rows are updated as an event progresses, and we were not asked for it.</w:t>
+        <w:t>The brief asks us to focus on loan duration and borrowing activity for books that have been borrowed and returned, so FactLoan holds 12,343 of the 12,344 OLTP loan records. The one outstanding loan has no return date, which leaves all three measures undefined, so it cannot sit at this grain. Reporting on loans still out is therefore out of scope. The structure for that would be an accumulating snapshot fact table, whose rows are updated as an event progresses, and we were not asked for it.</w:t>
       </w:r>
     </w:p>
     <w:p/>
@@ -4707,35 +3890,14 @@
       </w:r>
     </w:p>
     <w:p>
-      <w:proofErr w:type="spellStart"/>
-      <w:r>
-        <w:t>DimMember</w:t>
-      </w:r>
-      <w:proofErr w:type="spellEnd"/>
-      <w:r>
-        <w:t xml:space="preserve"> and </w:t>
-      </w:r>
-      <w:proofErr w:type="spellStart"/>
-      <w:r>
-        <w:t>DimBook</w:t>
-      </w:r>
-      <w:proofErr w:type="spellEnd"/>
-      <w:r>
-        <w:t xml:space="preserve"> hold current values only. This is</w:t>
+      <w:r>
+        <w:t>DimMember and DimBook hold current values only. This is</w:t>
       </w:r>
       <w:r>
         <w:t xml:space="preserve"> a SCD</w:t>
       </w:r>
       <w:r>
-        <w:t xml:space="preserve"> Type 1, where an update overwrites the old value and no history is kept. The consequence is that a member’s 2020 loans are counted against the tier they hold today, which is worth bearing in mind when reading Analysis 6, since it groups by current </w:t>
-      </w:r>
-      <w:proofErr w:type="spellStart"/>
-      <w:r>
-        <w:t>TierName</w:t>
-      </w:r>
-      <w:proofErr w:type="spellEnd"/>
-      <w:r>
-        <w:t xml:space="preserve"> rather than the tier held at the time of each loan. Tracking that history would need SCD Type 2, where each change adds a new dimension row with validity dates.</w:t>
+        <w:t xml:space="preserve"> Type 1, where an update overwrites the old value and no history is kept. The consequence is that a member’s 2020 loans are counted against the tier they hold today, which is worth bearing in mind when reading Analysis 6, since it groups by current TierName rather than the tier held at the time of each loan. Tracking that history would need SCD Type 2, where each change adds a new dimension row with validity dates.</w:t>
       </w:r>
     </w:p>
     <w:p/>
@@ -4754,21 +3916,8 @@
       </w:r>
     </w:p>
     <w:p>
-      <w:proofErr w:type="spellStart"/>
-      <w:r>
-        <w:t>FactLoan</w:t>
-      </w:r>
-      <w:proofErr w:type="spellEnd"/>
-      <w:r>
-        <w:t xml:space="preserve"> carries one foreign key to </w:t>
-      </w:r>
-      <w:proofErr w:type="spellStart"/>
-      <w:r>
-        <w:t>DimDate</w:t>
-      </w:r>
-      <w:proofErr w:type="spellEnd"/>
-      <w:r>
-        <w:t xml:space="preserve">, on the borrow date. We considered a second key for the return date </w:t>
+      <w:r>
+        <w:t xml:space="preserve">FactLoan carries one foreign key to DimDate, on the borrow date. We considered a second key for the return date </w:t>
       </w:r>
       <w:r>
         <w:t>but</w:t>
@@ -4780,47 +3929,7 @@
         <w:t xml:space="preserve">it was </w:t>
       </w:r>
       <w:r>
-        <w:t xml:space="preserve">redundant: </w:t>
-      </w:r>
-      <w:proofErr w:type="spellStart"/>
-      <w:r>
-        <w:t>LoanDurationDays</w:t>
-      </w:r>
-      <w:proofErr w:type="spellEnd"/>
-      <w:r>
-        <w:t xml:space="preserve"> is the difference between the borrow and return dates, so the return date is recoverable as borrow date + </w:t>
-      </w:r>
-      <w:proofErr w:type="spellStart"/>
-      <w:r>
-        <w:t>LoanDurationDays</w:t>
-      </w:r>
-      <w:proofErr w:type="spellEnd"/>
-      <w:r>
-        <w:t xml:space="preserve">, and the due date as borrow date + </w:t>
-      </w:r>
-      <w:proofErr w:type="spellStart"/>
-      <w:r>
-        <w:t>LoanDurationDays</w:t>
-      </w:r>
-      <w:proofErr w:type="spellEnd"/>
-      <w:r>
-        <w:t xml:space="preserve"> + </w:t>
-      </w:r>
-      <w:proofErr w:type="spellStart"/>
-      <w:r>
-        <w:t>DaysBeforeDue</w:t>
-      </w:r>
-      <w:proofErr w:type="spellEnd"/>
-      <w:r>
-        <w:t xml:space="preserve">. One date key and two measures therefore carry all three dates without a second relationship. Every analysis we run is anchored to when a loan started, so the borrow date is the role that earns a foreign key. The trade-off we accept is that grouping returns by calendar attributes such as month or quarter would mean deriving the return date first and re-joining to </w:t>
-      </w:r>
-      <w:proofErr w:type="spellStart"/>
-      <w:r>
-        <w:t>DimDate</w:t>
-      </w:r>
-      <w:proofErr w:type="spellEnd"/>
-      <w:r>
-        <w:t>, rather than joining on a stored key.</w:t>
+        <w:t>redundant: LoanDurationDays is the difference between the borrow and return dates, so the return date is recoverable as borrow date + LoanDurationDays, and the due date as borrow date + LoanDurationDays + DaysBeforeDue. One date key and two measures therefore carry all three dates without a second relationship. Every analysis we run is anchored to when a loan started, so the borrow date is the role that earns a foreign key. The trade-off we accept is that grouping returns by calendar attributes such as month or quarter would mean deriving the return date first and re-joining to DimDate, rather than joining on a stored key.</w:t>
       </w:r>
     </w:p>
     <w:p/>
@@ -4830,13 +3939,8 @@
       </w:r>
     </w:p>
     <w:p>
-      <w:proofErr w:type="spellStart"/>
-      <w:r>
-        <w:t>DimDate</w:t>
-      </w:r>
-      <w:proofErr w:type="spellEnd"/>
-      <w:r>
-        <w:t xml:space="preserve"> is pre-</w:t>
+      <w:r>
+        <w:t>DimDate is pre-</w:t>
       </w:r>
       <w:r>
         <w:t>populated</w:t>
@@ -5203,16 +4307,8 @@
               <w:rPr>
                 <w:sz w:val="20"/>
               </w:rPr>
-              <w:t xml:space="preserve">The identifier inherited from the source system, such as </w:t>
-            </w:r>
-            <w:proofErr w:type="spellStart"/>
-            <w:r>
-              <w:rPr>
-                <w:sz w:val="20"/>
-              </w:rPr>
-              <w:t>MemberID</w:t>
-            </w:r>
-            <w:proofErr w:type="spellEnd"/>
+              <w:t>The identifier inherited from the source system, such as MemberID</w:t>
+            </w:r>
           </w:p>
         </w:tc>
       </w:tr>
@@ -5278,14 +4374,12 @@
             <w:tcW w:w="4874" w:type="dxa"/>
           </w:tcPr>
           <w:p>
-            <w:proofErr w:type="spellStart"/>
             <w:r>
               <w:rPr>
                 <w:sz w:val="20"/>
               </w:rPr>
               <w:t>Denormalisation</w:t>
             </w:r>
-            <w:proofErr w:type="spellEnd"/>
           </w:p>
         </w:tc>
         <w:tc>
@@ -5297,21 +4391,7 @@
               <w:rPr>
                 <w:sz w:val="20"/>
               </w:rPr>
-              <w:t xml:space="preserve">Deliberately copying attributes into a table to </w:t>
-            </w:r>
-            <w:proofErr w:type="gramStart"/>
-            <w:r>
-              <w:rPr>
-                <w:sz w:val="20"/>
-              </w:rPr>
-              <w:t>avoid a join</w:t>
-            </w:r>
-            <w:proofErr w:type="gramEnd"/>
-            <w:r>
-              <w:rPr>
-                <w:sz w:val="20"/>
-              </w:rPr>
-              <w:t>, accepting the duplication</w:t>
+              <w:t>Deliberately copying attributes into a table to avoid a join, accepting the duplication</w:t>
             </w:r>
           </w:p>
         </w:tc>
@@ -5463,19 +4543,11 @@
             <w:tcW w:w="4874" w:type="dxa"/>
           </w:tcPr>
           <w:p>
-            <w:proofErr w:type="gramStart"/>
             <w:r>
               <w:rPr>
                 <w:sz w:val="20"/>
               </w:rPr>
-              <w:t>TINYINT(</w:t>
-            </w:r>
-            <w:proofErr w:type="gramEnd"/>
-            <w:r>
-              <w:rPr>
-                <w:sz w:val="20"/>
-              </w:rPr>
-              <w:t>1)</w:t>
+              <w:t>TINYINT(1)</w:t>
             </w:r>
           </w:p>
         </w:tc>
@@ -5510,45 +4582,13 @@
       </w:pPr>
       <w:r>
         <w:lastRenderedPageBreak/>
-        <w:t xml:space="preserve">Submit your </w:t>
-      </w:r>
-      <w:proofErr w:type="gramStart"/>
-      <w:r>
-        <w:t>CREATE table</w:t>
-      </w:r>
-      <w:proofErr w:type="gramEnd"/>
-      <w:r>
-        <w:t xml:space="preserve"> statements for DW table creations in </w:t>
-      </w:r>
-      <w:proofErr w:type="spellStart"/>
-      <w:r>
-        <w:t>DW_create.sql</w:t>
-      </w:r>
-      <w:proofErr w:type="spellEnd"/>
-      <w:r>
-        <w:t xml:space="preserve">. Use appropriate SQL statements to extract and load data from OLTP tables to </w:t>
-      </w:r>
-      <w:proofErr w:type="gramStart"/>
-      <w:r>
-        <w:t xml:space="preserve">the </w:t>
-      </w:r>
-      <w:r>
-        <w:t>DW</w:t>
-      </w:r>
-      <w:proofErr w:type="gramEnd"/>
-      <w:r>
-        <w:t xml:space="preserve"> and</w:t>
-      </w:r>
-      <w:r>
-        <w:t xml:space="preserve"> submit all your queries in </w:t>
-      </w:r>
-      <w:proofErr w:type="spellStart"/>
-      <w:r>
-        <w:t>DW_insert.sql</w:t>
-      </w:r>
-      <w:proofErr w:type="spellEnd"/>
-      <w:r>
-        <w:t>.</w:t>
+        <w:t xml:space="preserve">Submit your CREATE table statements for DW table creations in DW_create.sql. Use appropriate SQL statements to extract and load data from OLTP tables to the </w:t>
+      </w:r>
+      <w:r>
+        <w:t>DW and</w:t>
+      </w:r>
+      <w:r>
+        <w:t xml:space="preserve"> submit all your queries in DW_insert.sql.</w:t>
       </w:r>
     </w:p>
     <w:bookmarkEnd w:id="1"/>
@@ -5703,15 +4743,7 @@
     <w:bookmarkEnd w:id="0"/>
     <w:p>
       <w:r>
-        <w:t xml:space="preserve">We ran four checks, all of them in </w:t>
-      </w:r>
-      <w:proofErr w:type="spellStart"/>
-      <w:r>
-        <w:t>DW_verify.sql</w:t>
-      </w:r>
-      <w:proofErr w:type="spellEnd"/>
-      <w:r>
-        <w:t>, labelled C1 to C4 in that file. Each one compares something in the warehouse against the OLTP database it was loaded from, so anything that went wrong during the load would show up as a pair of numbers that fail to agree.</w:t>
+        <w:t>We ran four checks, all of them in DW_verify.sql, labelled C1 to C4 in that file. Each one compares something in the warehouse against the OLTP database it was loaded from, so anything that went wrong during the load would show up as a pair of numbers that fail to agree.</w:t>
       </w:r>
     </w:p>
     <w:p/>
@@ -5722,45 +4754,8 @@
         </w:rPr>
         <w:t xml:space="preserve">Row counts (C1). </w:t>
       </w:r>
-      <w:proofErr w:type="spellStart"/>
-      <w:r>
-        <w:t>FactLoan</w:t>
-      </w:r>
-      <w:proofErr w:type="spellEnd"/>
-      <w:r>
-        <w:t xml:space="preserve"> contains 12,343 rows, which is exactly the number of Loan records in the OLTP database that have a return date. The dimensions match their source tables too: </w:t>
-      </w:r>
-      <w:proofErr w:type="spellStart"/>
-      <w:r>
-        <w:t>DimMember</w:t>
-      </w:r>
-      <w:proofErr w:type="spellEnd"/>
-      <w:r>
-        <w:t xml:space="preserve"> 301 against Member 301, </w:t>
-      </w:r>
-      <w:proofErr w:type="spellStart"/>
-      <w:r>
-        <w:t>DimBook</w:t>
-      </w:r>
-      <w:proofErr w:type="spellEnd"/>
-      <w:r>
-        <w:t xml:space="preserve"> 500 against Book 500, and </w:t>
-      </w:r>
-      <w:proofErr w:type="spellStart"/>
-      <w:r>
-        <w:t>DimStaff</w:t>
-      </w:r>
-      <w:proofErr w:type="spellEnd"/>
-      <w:r>
-        <w:t xml:space="preserve"> 51 against Staff 51. </w:t>
-      </w:r>
-      <w:proofErr w:type="spellStart"/>
-      <w:r>
-        <w:t>DimDate</w:t>
-      </w:r>
-      <w:proofErr w:type="spellEnd"/>
-      <w:r>
-        <w:t xml:space="preserve"> holds 2,557 rows, one per day. Counting both sides and getting the same answer tells us that nothing was dropped on the way in and nothing was written twice.</w:t>
+      <w:r>
+        <w:t>FactLoan contains 12,343 rows, which is exactly the number of Loan records in the OLTP database that have a return date. The dimensions match their source tables too: DimMember 301 against Member 301, DimBook 500 against Book 500, and DimStaff 51 against Staff 51. DimDate holds 2,557 rows, one per day. Counting both sides and getting the same answer tells us that nothing was dropped on the way in and nothing was written twice.</w:t>
       </w:r>
     </w:p>
     <w:p/>
@@ -5771,35 +4766,14 @@
         </w:rPr>
         <w:t xml:space="preserve">Loan duration (C2). </w:t>
       </w:r>
-      <w:proofErr w:type="spellStart"/>
-      <w:r>
-        <w:t>LoanDurationDays</w:t>
-      </w:r>
-      <w:proofErr w:type="spellEnd"/>
-      <w:r>
-        <w:t xml:space="preserve"> is not copied from the OLTP database; it is worked out during the load as the return date minus the borrow date. To check that this calculation ran correctly on every row </w:t>
+      <w:r>
+        <w:t xml:space="preserve">LoanDurationDays is not copied from the OLTP database; it is worked out during the load as the return date minus the borrow date. To check that this calculation ran correctly on every row </w:t>
       </w:r>
       <w:r>
         <w:t>instead of just most</w:t>
       </w:r>
       <w:r>
-        <w:t xml:space="preserve"> of them, we added up the durations straight from the OLTP loans, then separately added up the </w:t>
-      </w:r>
-      <w:proofErr w:type="spellStart"/>
-      <w:r>
-        <w:t>LoanDurationDays</w:t>
-      </w:r>
-      <w:proofErr w:type="spellEnd"/>
-      <w:r>
-        <w:t xml:space="preserve"> column in </w:t>
-      </w:r>
-      <w:proofErr w:type="spellStart"/>
-      <w:r>
-        <w:t>FactLoan</w:t>
-      </w:r>
-      <w:proofErr w:type="spellEnd"/>
-      <w:r>
-        <w:t>. Both totals come to 108,801 days. Since the two agree exactly, the same calculation was applied to every fact row.</w:t>
+        <w:t xml:space="preserve"> of them, we added up the durations straight from the OLTP loans, then separately added up the LoanDurationDays column in FactLoan. Both totals come to 108,801 days. Since the two agree exactly, the same calculation was applied to every fact row.</w:t>
       </w:r>
     </w:p>
     <w:p/>
@@ -5811,23 +4785,7 @@
         <w:t xml:space="preserve">Orphan keys (C3). </w:t>
       </w:r>
       <w:r>
-        <w:t xml:space="preserve">Every row in </w:t>
-      </w:r>
-      <w:proofErr w:type="spellStart"/>
-      <w:r>
-        <w:t>FactLoan</w:t>
-      </w:r>
-      <w:proofErr w:type="spellEnd"/>
-      <w:r>
-        <w:t xml:space="preserve"> points at a member, a staff member, a book and a borrow date. A fact row that points at something which does not actually exist is called an orphan, and it normally means a key failed to match while the data was being loaded. To look for any, we joined </w:t>
-      </w:r>
-      <w:proofErr w:type="spellStart"/>
-      <w:r>
-        <w:t>FactLoan</w:t>
-      </w:r>
-      <w:proofErr w:type="spellEnd"/>
-      <w:r>
-        <w:t xml:space="preserve"> to each of the four dimensions using a LEFT JOIN, which keeps every fact row in the result even when the dimension has nothing matching it, and leaves the dimension columns empty wherever the match failed. Counting the rows with an empty dimension key returns 0, so every fact row is linked to a real dimension row.</w:t>
+        <w:t>Every row in FactLoan points at a member, a staff member, a book and a borrow date. A fact row that points at something which does not actually exist is called an orphan, and it normally means a key failed to match while the data was being loaded. To look for any, we joined FactLoan to each of the four dimensions using a LEFT JOIN, which keeps every fact row in the result even when the dimension has nothing matching it, and leaves the dimension columns empty wherever the match failed. Counting the rows with an empty dimension key returns 0, so every fact row is linked to a real dimension row.</w:t>
       </w:r>
     </w:p>
     <w:p/>
@@ -5838,13 +4796,8 @@
         </w:rPr>
         <w:t xml:space="preserve">Date coverage (C4). </w:t>
       </w:r>
-      <w:proofErr w:type="spellStart"/>
-      <w:r>
-        <w:t>DimDate</w:t>
-      </w:r>
-      <w:proofErr w:type="spellEnd"/>
-      <w:r>
-        <w:t xml:space="preserve"> runs from 2020-01-01 to 2026-12-31, which is 2,557 days. That covers every borrow date in the data along with the later dates needed for due dates and returns, so no loan was left out because its date fell outside the calendar.</w:t>
+      <w:r>
+        <w:t>DimDate runs from 2020-01-01 to 2026-12-31, which is 2,557 days. That covers every borrow date in the data along with the later dates needed for due dates and returns, so no loan was left out because its date fell outside the calendar.</w:t>
       </w:r>
     </w:p>
     <w:p/>
@@ -5877,15 +4830,7 @@
         </w:numPr>
       </w:pPr>
       <w:r>
-        <w:t xml:space="preserve">Describe and discuss your analysis done using </w:t>
-      </w:r>
-      <w:proofErr w:type="gramStart"/>
-      <w:r>
-        <w:t>the DW</w:t>
-      </w:r>
-      <w:proofErr w:type="gramEnd"/>
-      <w:r>
-        <w:t xml:space="preserve">. </w:t>
+        <w:t xml:space="preserve">Describe and discuss your analysis done using the DW. </w:t>
       </w:r>
       <w:r>
         <w:t>Briefly e</w:t>
@@ -5912,15 +4857,7 @@
         <w:t xml:space="preserve"> if group size is 4.</w:t>
       </w:r>
       <w:r>
-        <w:t xml:space="preserve"> Separately submit all your queries in </w:t>
-      </w:r>
-      <w:proofErr w:type="spellStart"/>
-      <w:r>
-        <w:t>DW_query.sql</w:t>
-      </w:r>
-      <w:proofErr w:type="spellEnd"/>
-      <w:r>
-        <w:t xml:space="preserve">. (So do not include </w:t>
+        <w:t xml:space="preserve"> Separately submit all your queries in DW_query.sql. (So do not include </w:t>
       </w:r>
       <w:r>
         <w:t>your</w:t>
@@ -5970,13 +4907,8 @@
         </w:rPr>
         <w:t xml:space="preserve">Objective: </w:t>
       </w:r>
-      <w:proofErr w:type="spellStart"/>
-      <w:r>
-        <w:t>Analyse</w:t>
-      </w:r>
-      <w:proofErr w:type="spellEnd"/>
-      <w:r>
-        <w:t xml:space="preserve"> completed-loan volume by month and year and assess whether loan duration changes over time.</w:t>
+      <w:r>
+        <w:t>Analyse completed-loan volume by month and year and assess whether loan duration changes over time.</w:t>
       </w:r>
     </w:p>
     <w:p>
@@ -6248,15 +5180,7 @@
         <w:t xml:space="preserve">Insight: </w:t>
       </w:r>
       <w:r>
-        <w:t xml:space="preserve">Youth borrowing is strongly seasonal and is concentrated in the November-December school-holiday period. The library should schedule </w:t>
-      </w:r>
-      <w:proofErr w:type="spellStart"/>
-      <w:r>
-        <w:t>programmes</w:t>
-      </w:r>
-      <w:proofErr w:type="spellEnd"/>
-      <w:r>
-        <w:t>, acquisitions and extra copies of popular youth titles before the fourth quarter.</w:t>
+        <w:t>Youth borrowing is strongly seasonal and is concentrated in the November-December school-holiday period. The library should schedule programmes, acquisitions and extra copies of popular youth titles before the fourth quarter.</w:t>
       </w:r>
     </w:p>
     <w:p>
@@ -6415,15 +5339,7 @@
         <w:t xml:space="preserve">Insight: </w:t>
       </w:r>
       <w:r>
-        <w:t xml:space="preserve">Higher-tier active members complete more loans on average while also recording lower late-return rates, although this association does not prove that tier causes the </w:t>
-      </w:r>
-      <w:proofErr w:type="spellStart"/>
-      <w:r>
-        <w:t>behaviour</w:t>
-      </w:r>
-      <w:proofErr w:type="spellEnd"/>
-      <w:r>
-        <w:t>. Premium engagement appears strongest, while reminders and late-return interventions would have the greatest effect when directed at Basic members.</w:t>
+        <w:t>Higher-tier active members complete more loans on average while also recording lower late-return rates, although this association does not prove that tier causes the behaviour. Premium engagement appears strongest, while reminders and late-return interventions would have the greatest effect when directed at Basic members.</w:t>
       </w:r>
     </w:p>
     <w:p>
@@ -6487,15 +5403,7 @@
         <w:t xml:space="preserve">Results: </w:t>
       </w:r>
       <w:r>
-        <w:t xml:space="preserve">Research Journal has the highest total volume at 2,093 loans across 96 titles, or 21.8 loans per title. Young Adult has the highest demand per title at 31.2 loans across 39 titles. Children </w:t>
-      </w:r>
-      <w:proofErr w:type="gramStart"/>
-      <w:r>
-        <w:t>is</w:t>
-      </w:r>
-      <w:proofErr w:type="gramEnd"/>
-      <w:r>
-        <w:t xml:space="preserve"> also strong, with 1,873 loans and 28.0 loans per title. Average duration is similar across the reported genres, at 8.35-9.25 days.</w:t>
+        <w:t>Research Journal has the highest total volume at 2,093 loans across 96 titles, or 21.8 loans per title. Young Adult has the highest demand per title at 31.2 loans across 39 titles. Children is also strong, with 1,873 loans and 28.0 loans per title. Average duration is similar across the reported genres, at 8.35-9.25 days.</w:t>
       </w:r>
     </w:p>
     <w:p>
@@ -14196,23 +13104,6 @@
 </file>
 
 <file path=customXml/item2.xml><?xml version="1.0" encoding="utf-8"?>
-<p:properties xmlns:p="http://schemas.microsoft.com/office/2006/metadata/properties" xmlns:xsi="http://www.w3.org/2001/XMLSchema-instance" xmlns:pc="http://schemas.microsoft.com/office/infopath/2007/PartnerControls">
-  <documentManagement>
-    <_ip_UnifiedCompliancePolicyUIAction xmlns="http://schemas.microsoft.com/sharepoint/v3" xsi:nil="true"/>
-    <lcf76f155ced4ddcb4097134ff3c332f xmlns="72f5c66d-4f9b-4523-9c59-0147434cba56">
-      <Terms xmlns="http://schemas.microsoft.com/office/infopath/2007/PartnerControls"/>
-    </lcf76f155ced4ddcb4097134ff3c332f>
-    <TaxCatchAll xmlns="d5671106-6e7e-4942-8aee-9bcd5dd7e66b" xsi:nil="true"/>
-    <_ip_UnifiedCompliancePolicyProperties xmlns="http://schemas.microsoft.com/sharepoint/v3" xsi:nil="true"/>
-  </documentManagement>
-</p:properties>
-</file>
-
-<file path=customXml/item3.xml><?xml version="1.0" encoding="utf-8"?>
-<b:Sources xmlns:b="http://schemas.openxmlformats.org/officeDocument/2006/bibliography" xmlns="http://schemas.openxmlformats.org/officeDocument/2006/bibliography" SelectedStyle="\MLA.XSL" StyleName="MLA"/>
-</file>
-
-<file path=customXml/item4.xml><?xml version="1.0" encoding="utf-8"?>
 <ct:contentTypeSchema xmlns:ct="http://schemas.microsoft.com/office/2006/metadata/contentType" xmlns:ma="http://schemas.microsoft.com/office/2006/metadata/properties/metaAttributes" ct:_="" ma:_="" ma:contentTypeName="Document" ma:contentTypeID="0x01010088CE47F754C76E4E816A66E05339225A" ma:contentTypeVersion="13" ma:contentTypeDescription="Create a new document." ma:contentTypeScope="" ma:versionID="076a7d54fdb0b635cd2e2f75f54c1b16">
   <xsd:schema xmlns:xsd="http://www.w3.org/2001/XMLSchema" xmlns:xs="http://www.w3.org/2001/XMLSchema" xmlns:p="http://schemas.microsoft.com/office/2006/metadata/properties" xmlns:ns1="http://schemas.microsoft.com/sharepoint/v3" xmlns:ns2="72f5c66d-4f9b-4523-9c59-0147434cba56" xmlns:ns3="d5671106-6e7e-4942-8aee-9bcd5dd7e66b" targetNamespace="http://schemas.microsoft.com/office/2006/metadata/properties" ma:root="true" ma:fieldsID="733d59cbe7e7cf634dfb746df9f4de01" ns1:_="" ns2:_="" ns3:_="">
     <xsd:import namespace="http://schemas.microsoft.com/sharepoint/v3"/>
@@ -14424,6 +13315,23 @@
 </ct:contentTypeSchema>
 </file>
 
+<file path=customXml/item3.xml><?xml version="1.0" encoding="utf-8"?>
+<b:Sources xmlns:b="http://schemas.openxmlformats.org/officeDocument/2006/bibliography" xmlns="http://schemas.openxmlformats.org/officeDocument/2006/bibliography" SelectedStyle="\MLA.XSL" StyleName="MLA"/>
+</file>
+
+<file path=customXml/item4.xml><?xml version="1.0" encoding="utf-8"?>
+<p:properties xmlns:p="http://schemas.microsoft.com/office/2006/metadata/properties" xmlns:xsi="http://www.w3.org/2001/XMLSchema-instance" xmlns:pc="http://schemas.microsoft.com/office/infopath/2007/PartnerControls">
+  <documentManagement>
+    <_ip_UnifiedCompliancePolicyUIAction xmlns="http://schemas.microsoft.com/sharepoint/v3" xsi:nil="true"/>
+    <lcf76f155ced4ddcb4097134ff3c332f xmlns="72f5c66d-4f9b-4523-9c59-0147434cba56">
+      <Terms xmlns="http://schemas.microsoft.com/office/infopath/2007/PartnerControls"/>
+    </lcf76f155ced4ddcb4097134ff3c332f>
+    <TaxCatchAll xmlns="d5671106-6e7e-4942-8aee-9bcd5dd7e66b" xsi:nil="true"/>
+    <_ip_UnifiedCompliancePolicyProperties xmlns="http://schemas.microsoft.com/sharepoint/v3" xsi:nil="true"/>
+  </documentManagement>
+</p:properties>
+</file>
+
 <file path=customXml/itemProps1.xml><?xml version="1.0" encoding="utf-8"?>
 <ds:datastoreItem xmlns:ds="http://schemas.openxmlformats.org/officeDocument/2006/customXml" ds:itemID="{C793F174-B33D-4AAE-9E3B-9A362A6F4892}">
   <ds:schemaRefs>
@@ -14433,26 +13341,6 @@
 </file>
 
 <file path=customXml/itemProps2.xml><?xml version="1.0" encoding="utf-8"?>
-<ds:datastoreItem xmlns:ds="http://schemas.openxmlformats.org/officeDocument/2006/customXml" ds:itemID="{2FE68222-D1D7-4405-9D8B-445901EEA94E}">
-  <ds:schemaRefs>
-    <ds:schemaRef ds:uri="http://schemas.microsoft.com/office/2006/metadata/properties"/>
-    <ds:schemaRef ds:uri="http://schemas.microsoft.com/office/infopath/2007/PartnerControls"/>
-    <ds:schemaRef ds:uri="http://schemas.microsoft.com/sharepoint/v3"/>
-    <ds:schemaRef ds:uri="72f5c66d-4f9b-4523-9c59-0147434cba56"/>
-    <ds:schemaRef ds:uri="d5671106-6e7e-4942-8aee-9bcd5dd7e66b"/>
-  </ds:schemaRefs>
-</ds:datastoreItem>
-</file>
-
-<file path=customXml/itemProps3.xml><?xml version="1.0" encoding="utf-8"?>
-<ds:datastoreItem xmlns:ds="http://schemas.openxmlformats.org/officeDocument/2006/customXml" ds:itemID="{6A404842-743E-4BBC-99A7-70A911F17733}">
-  <ds:schemaRefs>
-    <ds:schemaRef ds:uri="http://schemas.openxmlformats.org/officeDocument/2006/bibliography"/>
-  </ds:schemaRefs>
-</ds:datastoreItem>
-</file>
-
-<file path=customXml/itemProps4.xml><?xml version="1.0" encoding="utf-8"?>
 <ds:datastoreItem xmlns:ds="http://schemas.openxmlformats.org/officeDocument/2006/customXml" ds:itemID="{77819383-3D86-46CF-A5E7-D6F9C756A7E0}">
   <ds:schemaRefs>
     <ds:schemaRef ds:uri="http://schemas.microsoft.com/office/2006/metadata/contentType"/>
@@ -14470,4 +13358,24 @@
     <ds:schemaRef ds:uri="http://schemas.microsoft.com/internal/obd"/>
   </ds:schemaRefs>
 </ds:datastoreItem>
+</file>
+
+<file path=customXml/itemProps3.xml><?xml version="1.0" encoding="utf-8"?>
+<ds:datastoreItem xmlns:ds="http://schemas.openxmlformats.org/officeDocument/2006/customXml" ds:itemID="{6A404842-743E-4BBC-99A7-70A911F17733}">
+  <ds:schemaRefs>
+    <ds:schemaRef ds:uri="http://schemas.openxmlformats.org/officeDocument/2006/bibliography"/>
+  </ds:schemaRefs>
+</ds:datastoreItem>
+</file>
+
+<file path=customXml/itemProps4.xml><?xml version="1.0" encoding="utf-8"?>
+<ds:datastoreItem xmlns:ds="http://schemas.openxmlformats.org/officeDocument/2006/customXml" ds:itemID="{2FE68222-D1D7-4405-9D8B-445901EEA94E}">
+  <ds:schemaRefs>
+    <ds:schemaRef ds:uri="http://schemas.microsoft.com/office/2006/metadata/properties"/>
+    <ds:schemaRef ds:uri="http://schemas.microsoft.com/office/infopath/2007/PartnerControls"/>
+    <ds:schemaRef ds:uri="http://schemas.microsoft.com/sharepoint/v3"/>
+    <ds:schemaRef ds:uri="72f5c66d-4f9b-4523-9c59-0147434cba56"/>
+    <ds:schemaRef ds:uri="d5671106-6e7e-4942-8aee-9bcd5dd7e66b"/>
+  </ds:schemaRefs>
+</ds:datastoreItem>
 </file>
</xml_diff>